<commit_message>
Correct author name in paper files
</commit_message>
<xml_diff>
--- a/paper/paper_chinaxiv.docx
+++ b/paper/paper_chinaxiv.docx
@@ -25,7 +25,7 @@
           <w:b w:val="0"/>
           <w:sz w:val="20"/>
         </w:rPr>
-        <w:t>ISSA RASHID ISSA</w:t>
+        <w:t>ISSA ISSA RASHID</w:t>
       </w:r>
     </w:p>
     <w:p>
@@ -51,7 +51,7 @@
           <w:b w:val="0"/>
           <w:sz w:val="20"/>
         </w:rPr>
-        <w:t>Corresponding author: ISSA RASHID ISSA, 25sf51115@stu.hit.edu.cn</w:t>
+        <w:t>Corresponding author: ISSA ISSA RASHID, 25sf51115@stu.hit.edu.cn</w:t>
       </w:r>
     </w:p>
     <w:p>

</xml_diff>

<commit_message>
Align paper with ChinaXiv sample format
</commit_message>
<xml_diff>
--- a/paper/paper_chinaxiv.docx
+++ b/paper/paper_chinaxiv.docx
@@ -10,7 +10,7 @@
         <w:rPr>
           <w:rFonts w:ascii="Times New Roman" w:hAnsi="Times New Roman" w:eastAsia="SimSun"/>
           <w:b/>
-          <w:sz w:val="32"/>
+          <w:sz w:val="28"/>
         </w:rPr>
         <w:t>A Comprehensive Survey of Multimodal Large Language Models: Architectures, Training Paradigms, Benchmark Evaluation, and Future Directions</w:t>
       </w:r>
@@ -76,15 +76,15 @@
         <w:rPr>
           <w:rFonts w:ascii="Times New Roman" w:hAnsi="Times New Roman" w:eastAsia="SimSun"/>
           <w:b/>
-          <w:sz w:val="26"/>
+          <w:sz w:val="24"/>
         </w:rPr>
         <w:t>Abstract</w:t>
       </w:r>
     </w:p>
     <w:p>
       <w:pPr>
-        <w:spacing w:line="276" w:lineRule="auto"/>
-        <w:ind w:firstLine="420"/>
+        <w:spacing w:line="276" w:lineRule="auto" w:after="60"/>
+        <w:jc w:val="both"/>
       </w:pPr>
       <w:r>
         <w:rPr>
@@ -92,7 +92,7 @@
           <w:b w:val="0"/>
           <w:sz w:val="20"/>
         </w:rPr>
-        <w:t>Multimodal large language models (MLLMs) extend the reasoning, instruction-following, and generation abilities of large language models to inputs such as images, diagrams, video frames, optical text, charts, and visually grounded user instructions. Their rapid development has changed the research landscape of vision-language learning: earlier systems often optimized task-specific objectives for retrieval, captioning, or visual question answering, whereas modern MLLMs attempt to serve as general interfaces between visual perception and language-based reasoning. This survey reviews the technical foundations, architecture families, training paradigms, benchmark practices, and open challenges of MLLMs. The discussion is organized around three central questions: how visual information is represented and connected to language models, how multimodal alignment and instruction tuning are performed, and how current benchmarks measure perception, reasoning, hallucination, and expert-domain competence. The paper does not report new model-training experiments or new benchmark scores. Instead, it provides a reproducible literature and taxonomy package that can be updated as new verified references and executed experiments become available.</w:t>
+        <w:t>Multimodal large language models (MLLMs) extend the reasoning, instruction-following, and generation abilities of large language models to inputs such as images, diagrams, video frames, optical text, charts, and visually grounded user instructions. Their rapid development has changed the research landscape of vision-language learning: earlier systems optimized task-specific objectives for retrieval, captioning, or visual question answering, whereas modern MLLMs attempt to serve as general interfaces between visual perception and language-based reasoning. This survey reviews the technical foundations, architecture families, training paradigms, benchmark practices, safety issues, and reproducibility requirements of MLLMs. The discussion is organized around four central questions: how visual information is encoded, how it is connected to language models, how multimodal alignment and instruction tuning are performed, and how current benchmarks measure perception, reasoning, hallucination, and expert-domain competence. Representative systems including CLIP, Flamingo, BLIP-2, LLaVA, Qwen-VL, InternVL, CogVLM, and GPT-4V are analyzed alongside earlier vision-language pretraining models and recent grounding-oriented MLLMs. The paper does not report new model-training experiments or new benchmark scores, because no controlled benchmark execution was performed. Instead, it provides a reproducible literature and taxonomy package containing verified references, structured model and benchmark tables, generated figures, formatting scripts, and clear code-availability information. The main conclusion is that MLLM progress should be evaluated through architecture, grounding reliability, hallucination behavior, safety, benchmark transparency, and reproducibility rather than through isolated leaderboard scores.</w:t>
       </w:r>
     </w:p>
     <w:p>
@@ -103,15 +103,15 @@
         <w:rPr>
           <w:rFonts w:ascii="Times New Roman" w:hAnsi="Times New Roman" w:eastAsia="SimSun"/>
           <w:b/>
-          <w:sz w:val="26"/>
+          <w:sz w:val="24"/>
         </w:rPr>
         <w:t>Keywords</w:t>
       </w:r>
     </w:p>
     <w:p>
       <w:pPr>
-        <w:spacing w:line="276" w:lineRule="auto"/>
-        <w:ind w:firstLine="420"/>
+        <w:spacing w:line="276" w:lineRule="auto" w:after="60"/>
+        <w:jc w:val="both"/>
       </w:pPr>
       <w:r>
         <w:rPr>
@@ -130,15 +130,15 @@
         <w:rPr>
           <w:rFonts w:ascii="Times New Roman" w:hAnsi="Times New Roman" w:eastAsia="SimSun"/>
           <w:b/>
-          <w:sz w:val="26"/>
+          <w:sz w:val="24"/>
         </w:rPr>
         <w:t>1. Introduction</w:t>
       </w:r>
     </w:p>
     <w:p>
       <w:pPr>
-        <w:spacing w:line="276" w:lineRule="auto"/>
-        <w:ind w:firstLine="420"/>
+        <w:spacing w:line="276" w:lineRule="auto" w:after="60"/>
+        <w:jc w:val="both"/>
       </w:pPr>
       <w:r>
         <w:rPr>
@@ -151,8 +151,8 @@
     </w:p>
     <w:p>
       <w:pPr>
-        <w:spacing w:line="276" w:lineRule="auto"/>
-        <w:ind w:firstLine="420"/>
+        <w:spacing w:line="276" w:lineRule="auto" w:after="60"/>
+        <w:jc w:val="both"/>
       </w:pPr>
       <w:r>
         <w:rPr>
@@ -165,8 +165,8 @@
     </w:p>
     <w:p>
       <w:pPr>
-        <w:spacing w:line="276" w:lineRule="auto"/>
-        <w:ind w:firstLine="420"/>
+        <w:spacing w:line="276" w:lineRule="auto" w:after="60"/>
+        <w:jc w:val="both"/>
       </w:pPr>
       <w:r>
         <w:rPr>
@@ -179,8 +179,8 @@
     </w:p>
     <w:p>
       <w:pPr>
-        <w:spacing w:line="276" w:lineRule="auto"/>
-        <w:ind w:firstLine="420"/>
+        <w:spacing w:line="276" w:lineRule="auto" w:after="60"/>
+        <w:jc w:val="both"/>
       </w:pPr>
       <w:r>
         <w:rPr>
@@ -193,8 +193,8 @@
     </w:p>
     <w:p>
       <w:pPr>
-        <w:spacing w:line="276" w:lineRule="auto"/>
-        <w:ind w:firstLine="420"/>
+        <w:spacing w:line="276" w:lineRule="auto" w:after="60"/>
+        <w:jc w:val="both"/>
       </w:pPr>
       <w:r>
         <w:rPr>
@@ -213,15 +213,15 @@
         <w:rPr>
           <w:rFonts w:ascii="Times New Roman" w:hAnsi="Times New Roman" w:eastAsia="SimSun"/>
           <w:b/>
-          <w:sz w:val="26"/>
+          <w:sz w:val="24"/>
         </w:rPr>
         <w:t>2. Related Work</w:t>
       </w:r>
     </w:p>
     <w:p>
       <w:pPr>
-        <w:spacing w:line="276" w:lineRule="auto"/>
-        <w:ind w:firstLine="420"/>
+        <w:spacing w:line="276" w:lineRule="auto" w:after="60"/>
+        <w:jc w:val="both"/>
       </w:pPr>
       <w:r>
         <w:rPr>
@@ -234,8 +234,8 @@
     </w:p>
     <w:p>
       <w:pPr>
-        <w:spacing w:line="276" w:lineRule="auto"/>
-        <w:ind w:firstLine="420"/>
+        <w:spacing w:line="276" w:lineRule="auto" w:after="60"/>
+        <w:jc w:val="both"/>
       </w:pPr>
       <w:r>
         <w:rPr>
@@ -243,13 +243,13 @@
           <w:b w:val="0"/>
           <w:sz w:val="20"/>
         </w:rPr>
-        <w:t>Vision-language representation learning provided the second foundation. CLIP trained image and text encoders with a contrastive objective over image-caption pairs, producing transferable open-vocabulary visual representations [3]. ALIGN scaled a similar idea with noisy image-text supervision and showed that large web-scale data could support robust cross-modal retrieval and classification [4]. These models are not full MLLMs in the current sense because they do not perform open-ended multimodal dialogue through a generative language model. Nevertheless, they established a practical strategy: align visual and textual representations using paired data, then reuse the learned representation for downstream tasks.</w:t>
+        <w:t>Vision-language representation learning provided the second foundation. Earlier transformer-based systems such as ViLBERT, LXMERT, UNITER, Oscar, VinVL, and OFA studied cross-modal pretraining before the current MLLM wave [23] [24] [25] [26] [27] [28]. CLIP trained image and text encoders with a contrastive objective over image-caption pairs, producing transferable open-vocabulary visual representations [3]. ALIGN scaled a similar idea with noisy image-text supervision and showed that large web-scale data could support robust cross-modal retrieval and classification [4]. These models are not full MLLMs in the current sense because they do not perform open-ended multimodal dialogue through a generative language model. Nevertheless, they established a practical strategy: align visual and textual representations using paired data, then reuse the learned representation for downstream tasks.</w:t>
       </w:r>
     </w:p>
     <w:p>
       <w:pPr>
-        <w:spacing w:line="276" w:lineRule="auto"/>
-        <w:ind w:firstLine="420"/>
+        <w:spacing w:line="276" w:lineRule="auto" w:after="60"/>
+        <w:jc w:val="both"/>
       </w:pPr>
       <w:r>
         <w:rPr>
@@ -257,13 +257,13 @@
           <w:b w:val="0"/>
           <w:sz w:val="20"/>
         </w:rPr>
-        <w:t>A second group of works moved from retrieval-style representation learning toward generative vision-language models. BLIP unified understanding and generation with bootstrapped captions and filtering [23]. Flamingo connected strong visual encoders to frozen language models with cross-attention layers and demonstrated few-shot learning over interleaved image, video, and text inputs [5]. BLIP-2 introduced a Querying Transformer, commonly called Q-Former, to bridge frozen image encoders and frozen language models efficiently [6]. These models are important because they show that full end-to-end retraining is not the only route to multimodal competence. Careful adapter or connector design can exploit powerful unimodal components while reducing training cost.</w:t>
+        <w:t>A second group of works moved from retrieval-style representation learning toward generative vision-language models. BLIP unified understanding and generation with bootstrapped captions and filtering [29]. Flamingo connected strong visual encoders to frozen language models with cross-attention layers and demonstrated few-shot learning over interleaved image, video, and text inputs [5]. BLIP-2 introduced a Querying Transformer, commonly called Q-Former, to bridge frozen image encoders and frozen language models efficiently [6]. These models are important because they show that full end-to-end retraining is not the only route to multimodal competence. Careful adapter or connector design can exploit powerful unimodal components while reducing training cost.</w:t>
       </w:r>
     </w:p>
     <w:p>
       <w:pPr>
-        <w:spacing w:line="276" w:lineRule="auto"/>
-        <w:ind w:firstLine="420"/>
+        <w:spacing w:line="276" w:lineRule="auto" w:after="60"/>
+        <w:jc w:val="both"/>
       </w:pPr>
       <w:r>
         <w:rPr>
@@ -276,8 +276,8 @@
     </w:p>
     <w:p>
       <w:pPr>
-        <w:spacing w:line="276" w:lineRule="auto"/>
-        <w:ind w:firstLine="420"/>
+        <w:spacing w:line="276" w:lineRule="auto" w:after="60"/>
+        <w:jc w:val="both"/>
       </w:pPr>
       <w:r>
         <w:rPr>
@@ -285,13 +285,13 @@
           <w:b w:val="0"/>
           <w:sz w:val="20"/>
         </w:rPr>
-        <w:t>Recent systems have expanded the design space. Qwen-VL emphasizes abilities such as text reading and localization in addition to general visual dialogue [11]. InternVL studies scaling of vision foundation models and alignment for generic visual-linguistic tasks [24]. CogVLM uses a visual expert approach to integrate visual capability into pretrained language models while preserving language competence [7]. GPT-4V represents a closed frontier system described through a system card rather than full open model weights or training details [12]. The contrast between open and closed systems is now a major reproducibility issue: closed systems can be evaluated externally, but their training data, architecture, and alignment processes cannot be independently inspected.</w:t>
+        <w:t>Recent systems have expanded the design space. PaLI and PaLM-E illustrate multilingual and embodied multimodal scaling [30] [31]. Kosmos-1 and Kosmos-2 emphasize aligning perception with language and grounding multimodal language models to the world [32] [33]. Qwen-VL emphasizes abilities such as text reading and localization in addition to general visual dialogue [11]. mPLUG-Owl, Shikra, Ferret, VILA, Video-LLaVA, and Visual ChatGPT represent additional directions in modularization, referential dialogue, grounding, pretraining, video alignment, and tool-assisted visual interaction [34] [35] [36] [37] [38] [39]. InternVL studies scaling of vision foundation models and alignment for generic visual-linguistic tasks [40]. CogVLM uses a visual expert approach to integrate visual capability into pretrained language models while preserving language competence [7]. GPT-4V represents a closed frontier system described through a system card rather than full open model weights or training details [12]. The contrast between open and closed systems is now a major reproducibility issue: closed systems can be evaluated externally, but their training data, architecture, and alignment processes cannot be independently inspected.</w:t>
       </w:r>
     </w:p>
     <w:p>
       <w:pPr>
-        <w:spacing w:line="276" w:lineRule="auto"/>
-        <w:ind w:firstLine="420"/>
+        <w:spacing w:line="276" w:lineRule="auto" w:after="60"/>
+        <w:jc w:val="both"/>
       </w:pPr>
       <w:r>
         <w:rPr>
@@ -299,7 +299,7 @@
           <w:b w:val="0"/>
           <w:sz w:val="20"/>
         </w:rPr>
-        <w:t>Evaluation research has also evolved. Early visual question answering benchmarks such as VQA [13], GQA [14], and OK-VQA [15] tested specific combinations of perception, language, compositional reasoning, and external knowledge. ScienceQA introduced science-question reasoning with multimodal explanations [16]. Modern MLLM benchmarks such as MME, MMBench, MM-Vet, and MMMU attempt to measure broader capability dimensions [17] [18] [19] [20]. POPE focuses specifically on object hallucination [21], while MathVista evaluates mathematical reasoning in visual contexts [22]. This benchmark expansion reflects a key point: no single test can characterize an MLLM.</w:t>
+        <w:t>Evaluation research has also evolved. Early visual question answering benchmarks such as VQA [13], GQA [14], and OK-VQA [15] tested specific combinations of perception, language, compositional reasoning, and external knowledge. TextVQA and ChartQA extended evaluation toward visual text reading and chart reasoning [41] [42]. ScienceQA introduced science-question reasoning with multimodal explanations [16]. Modern MLLM benchmarks such as MME, MMBench, MM-Vet, and MMMU attempt to measure broader capability dimensions [17] [18] [19] [20]. POPE focuses specifically on object hallucination [21], while MathVista evaluates mathematical reasoning in visual contexts [22]. This benchmark expansion reflects a key point: no single test can characterize an MLLM.</w:t>
       </w:r>
     </w:p>
     <w:p>
@@ -310,15 +310,15 @@
         <w:rPr>
           <w:rFonts w:ascii="Times New Roman" w:hAnsi="Times New Roman" w:eastAsia="SimSun"/>
           <w:b/>
-          <w:sz w:val="26"/>
+          <w:sz w:val="24"/>
         </w:rPr>
         <w:t>3. Theoretical Foundation</w:t>
       </w:r>
     </w:p>
     <w:p>
       <w:pPr>
-        <w:spacing w:line="276" w:lineRule="auto"/>
-        <w:ind w:firstLine="420"/>
+        <w:spacing w:line="276" w:lineRule="auto" w:after="60"/>
+        <w:jc w:val="both"/>
       </w:pPr>
       <w:r>
         <w:rPr>
@@ -331,8 +331,8 @@
     </w:p>
     <w:p>
       <w:pPr>
-        <w:spacing w:line="276" w:lineRule="auto"/>
-        <w:ind w:firstLine="420"/>
+        <w:spacing w:line="276" w:lineRule="auto" w:after="60"/>
+        <w:jc w:val="both"/>
       </w:pPr>
       <w:r>
         <w:rPr>
@@ -345,8 +345,8 @@
     </w:p>
     <w:p>
       <w:pPr>
-        <w:spacing w:line="276" w:lineRule="auto"/>
-        <w:ind w:firstLine="420"/>
+        <w:spacing w:line="276" w:lineRule="auto" w:after="60"/>
+        <w:jc w:val="both"/>
       </w:pPr>
       <w:r>
         <w:rPr>
@@ -359,8 +359,8 @@
     </w:p>
     <w:p>
       <w:pPr>
-        <w:spacing w:line="276" w:lineRule="auto"/>
-        <w:ind w:firstLine="420"/>
+        <w:spacing w:line="276" w:lineRule="auto" w:after="60"/>
+        <w:jc w:val="both"/>
       </w:pPr>
       <w:r>
         <w:rPr>
@@ -373,8 +373,8 @@
     </w:p>
     <w:p>
       <w:pPr>
-        <w:spacing w:line="276" w:lineRule="auto"/>
-        <w:ind w:firstLine="420"/>
+        <w:spacing w:line="276" w:lineRule="auto" w:after="60"/>
+        <w:jc w:val="both"/>
       </w:pPr>
       <w:r>
         <w:rPr>
@@ -387,8 +387,8 @@
     </w:p>
     <w:p>
       <w:pPr>
-        <w:spacing w:line="276" w:lineRule="auto"/>
-        <w:ind w:firstLine="420"/>
+        <w:spacing w:line="276" w:lineRule="auto" w:after="60"/>
+        <w:jc w:val="both"/>
       </w:pPr>
       <w:r>
         <w:rPr>
@@ -401,8 +401,8 @@
     </w:p>
     <w:p>
       <w:pPr>
-        <w:spacing w:line="276" w:lineRule="auto"/>
-        <w:ind w:firstLine="420"/>
+        <w:spacing w:line="276" w:lineRule="auto" w:after="60"/>
+        <w:jc w:val="both"/>
       </w:pPr>
       <w:r>
         <w:rPr>
@@ -415,8 +415,8 @@
     </w:p>
     <w:p>
       <w:pPr>
-        <w:spacing w:line="276" w:lineRule="auto"/>
-        <w:ind w:firstLine="420"/>
+        <w:spacing w:line="276" w:lineRule="auto" w:after="60"/>
+        <w:jc w:val="both"/>
       </w:pPr>
       <w:r>
         <w:rPr>
@@ -429,8 +429,8 @@
     </w:p>
     <w:p>
       <w:pPr>
-        <w:spacing w:line="276" w:lineRule="auto"/>
-        <w:ind w:firstLine="420"/>
+        <w:spacing w:line="276" w:lineRule="auto" w:after="60"/>
+        <w:jc w:val="both"/>
       </w:pPr>
       <w:r>
         <w:rPr>
@@ -449,7 +449,7 @@
         <w:rPr>
           <w:rFonts w:ascii="Times New Roman" w:hAnsi="Times New Roman" w:eastAsia="SimSun"/>
           <w:b/>
-          <w:sz w:val="26"/>
+          <w:sz w:val="24"/>
         </w:rPr>
         <w:t>4. Methodology</w:t>
       </w:r>
@@ -462,15 +462,15 @@
         <w:rPr>
           <w:rFonts w:ascii="Times New Roman" w:hAnsi="Times New Roman" w:eastAsia="SimSun"/>
           <w:b/>
-          <w:sz w:val="22"/>
+          <w:sz w:val="20"/>
         </w:rPr>
         <w:t>4.1 Problem Definition</w:t>
       </w:r>
     </w:p>
     <w:p>
       <w:pPr>
-        <w:spacing w:line="276" w:lineRule="auto"/>
-        <w:ind w:firstLine="420"/>
+        <w:spacing w:line="276" w:lineRule="auto" w:after="60"/>
+        <w:jc w:val="both"/>
       </w:pPr>
       <w:r>
         <w:rPr>
@@ -535,8 +535,8 @@
     </w:p>
     <w:p>
       <w:pPr>
-        <w:spacing w:line="276" w:lineRule="auto"/>
-        <w:ind w:firstLine="420"/>
+        <w:spacing w:line="276" w:lineRule="auto" w:after="60"/>
+        <w:jc w:val="both"/>
       </w:pPr>
       <w:r>
         <w:rPr>
@@ -555,15 +555,15 @@
         <w:rPr>
           <w:rFonts w:ascii="Times New Roman" w:hAnsi="Times New Roman" w:eastAsia="SimSun"/>
           <w:b/>
-          <w:sz w:val="22"/>
+          <w:sz w:val="20"/>
         </w:rPr>
         <w:t>4.2 Literature Selection</w:t>
       </w:r>
     </w:p>
     <w:p>
       <w:pPr>
-        <w:spacing w:line="276" w:lineRule="auto"/>
-        <w:ind w:firstLine="420"/>
+        <w:spacing w:line="276" w:lineRule="auto" w:after="60"/>
+        <w:jc w:val="both"/>
       </w:pPr>
       <w:r>
         <w:rPr>
@@ -576,8 +576,8 @@
     </w:p>
     <w:p>
       <w:pPr>
-        <w:spacing w:line="276" w:lineRule="auto"/>
-        <w:ind w:firstLine="420"/>
+        <w:spacing w:line="276" w:lineRule="auto" w:after="60"/>
+        <w:jc w:val="both"/>
       </w:pPr>
       <w:r>
         <w:rPr>
@@ -596,15 +596,15 @@
         <w:rPr>
           <w:rFonts w:ascii="Times New Roman" w:hAnsi="Times New Roman" w:eastAsia="SimSun"/>
           <w:b/>
-          <w:sz w:val="22"/>
+          <w:sz w:val="20"/>
         </w:rPr>
         <w:t>4.3 Taxonomy Construction</w:t>
       </w:r>
     </w:p>
     <w:p>
       <w:pPr>
-        <w:spacing w:line="276" w:lineRule="auto"/>
-        <w:ind w:firstLine="420"/>
+        <w:spacing w:line="276" w:lineRule="auto" w:after="60"/>
+        <w:jc w:val="both"/>
       </w:pPr>
       <w:r>
         <w:rPr>
@@ -617,8 +617,8 @@
     </w:p>
     <w:p>
       <w:pPr>
-        <w:spacing w:line="276" w:lineRule="auto"/>
-        <w:ind w:firstLine="420"/>
+        <w:spacing w:line="276" w:lineRule="auto" w:after="60"/>
+        <w:jc w:val="both"/>
       </w:pPr>
       <w:r>
         <w:rPr>
@@ -637,15 +637,15 @@
         <w:rPr>
           <w:rFonts w:ascii="Times New Roman" w:hAnsi="Times New Roman" w:eastAsia="SimSun"/>
           <w:b/>
-          <w:sz w:val="22"/>
+          <w:sz w:val="20"/>
         </w:rPr>
         <w:t>4.4 Implementation Details</w:t>
       </w:r>
     </w:p>
     <w:p>
       <w:pPr>
-        <w:spacing w:line="276" w:lineRule="auto"/>
-        <w:ind w:firstLine="420"/>
+        <w:spacing w:line="276" w:lineRule="auto" w:after="60"/>
+        <w:jc w:val="both"/>
       </w:pPr>
       <w:r>
         <w:rPr>
@@ -742,7 +742,7 @@
         <w:rPr>
           <w:rFonts w:ascii="Times New Roman" w:hAnsi="Times New Roman" w:eastAsia="SimSun"/>
           <w:b/>
-          <w:sz w:val="26"/>
+          <w:sz w:val="24"/>
         </w:rPr>
         <w:t>5. Architecture Taxonomy</w:t>
       </w:r>
@@ -755,15 +755,15 @@
         <w:rPr>
           <w:rFonts w:ascii="Times New Roman" w:hAnsi="Times New Roman" w:eastAsia="SimSun"/>
           <w:b/>
-          <w:sz w:val="22"/>
+          <w:sz w:val="20"/>
         </w:rPr>
         <w:t>5.1 Contrastive Representation Models</w:t>
       </w:r>
     </w:p>
     <w:p>
       <w:pPr>
-        <w:spacing w:line="276" w:lineRule="auto"/>
-        <w:ind w:firstLine="420"/>
+        <w:spacing w:line="276" w:lineRule="auto" w:after="60"/>
+        <w:jc w:val="both"/>
       </w:pPr>
       <w:r>
         <w:rPr>
@@ -776,8 +776,8 @@
     </w:p>
     <w:p>
       <w:pPr>
-        <w:spacing w:line="276" w:lineRule="auto"/>
-        <w:ind w:firstLine="420"/>
+        <w:spacing w:line="276" w:lineRule="auto" w:after="60"/>
+        <w:jc w:val="both"/>
       </w:pPr>
       <w:r>
         <w:rPr>
@@ -796,15 +796,15 @@
         <w:rPr>
           <w:rFonts w:ascii="Times New Roman" w:hAnsi="Times New Roman" w:eastAsia="SimSun"/>
           <w:b/>
-          <w:sz w:val="22"/>
+          <w:sz w:val="20"/>
         </w:rPr>
         <w:t>5.2 Generative Vision-Language Pretraining</w:t>
       </w:r>
     </w:p>
     <w:p>
       <w:pPr>
-        <w:spacing w:line="276" w:lineRule="auto"/>
-        <w:ind w:firstLine="420"/>
+        <w:spacing w:line="276" w:lineRule="auto" w:after="60"/>
+        <w:jc w:val="both"/>
       </w:pPr>
       <w:r>
         <w:rPr>
@@ -812,13 +812,13 @@
           <w:b w:val="0"/>
           <w:sz w:val="20"/>
         </w:rPr>
-        <w:t>BLIP introduced bootstrapping methods for unified vision-language understanding and generation [23]. Its core insight is that noisy web captions can be improved through caption generation and filtering, producing better supervision for downstream learning. This line of work bridges the gap between static representation learning and text generation.</w:t>
+        <w:t>BLIP introduced bootstrapping methods for unified vision-language understanding and generation [29]. Its core insight is that noisy web captions can be improved through caption generation and filtering, producing better supervision for downstream learning. This line of work bridges the gap between static representation learning and text generation.</w:t>
       </w:r>
     </w:p>
     <w:p>
       <w:pPr>
-        <w:spacing w:line="276" w:lineRule="auto"/>
-        <w:ind w:firstLine="420"/>
+        <w:spacing w:line="276" w:lineRule="auto" w:after="60"/>
+        <w:jc w:val="both"/>
       </w:pPr>
       <w:r>
         <w:rPr>
@@ -837,15 +837,15 @@
         <w:rPr>
           <w:rFonts w:ascii="Times New Roman" w:hAnsi="Times New Roman" w:eastAsia="SimSun"/>
           <w:b/>
-          <w:sz w:val="22"/>
+          <w:sz w:val="20"/>
         </w:rPr>
         <w:t>5.3 Frozen-Backbone Connector Models</w:t>
       </w:r>
     </w:p>
     <w:p>
       <w:pPr>
-        <w:spacing w:line="276" w:lineRule="auto"/>
-        <w:ind w:firstLine="420"/>
+        <w:spacing w:line="276" w:lineRule="auto" w:after="60"/>
+        <w:jc w:val="both"/>
       </w:pPr>
       <w:r>
         <w:rPr>
@@ -858,8 +858,8 @@
     </w:p>
     <w:p>
       <w:pPr>
-        <w:spacing w:line="276" w:lineRule="auto"/>
-        <w:ind w:firstLine="420"/>
+        <w:spacing w:line="276" w:lineRule="auto" w:after="60"/>
+        <w:jc w:val="both"/>
       </w:pPr>
       <w:r>
         <w:rPr>
@@ -878,15 +878,15 @@
         <w:rPr>
           <w:rFonts w:ascii="Times New Roman" w:hAnsi="Times New Roman" w:eastAsia="SimSun"/>
           <w:b/>
-          <w:sz w:val="22"/>
+          <w:sz w:val="20"/>
         </w:rPr>
         <w:t>5.4 Instruction-Tuned Open MLLMs</w:t>
       </w:r>
     </w:p>
     <w:p>
       <w:pPr>
-        <w:spacing w:line="276" w:lineRule="auto"/>
-        <w:ind w:firstLine="420"/>
+        <w:spacing w:line="276" w:lineRule="auto" w:after="60"/>
+        <w:jc w:val="both"/>
       </w:pPr>
       <w:r>
         <w:rPr>
@@ -899,8 +899,8 @@
     </w:p>
     <w:p>
       <w:pPr>
-        <w:spacing w:line="276" w:lineRule="auto"/>
-        <w:ind w:firstLine="420"/>
+        <w:spacing w:line="276" w:lineRule="auto" w:after="60"/>
+        <w:jc w:val="both"/>
       </w:pPr>
       <w:r>
         <w:rPr>
@@ -919,15 +919,15 @@
         <w:rPr>
           <w:rFonts w:ascii="Times New Roman" w:hAnsi="Times New Roman" w:eastAsia="SimSun"/>
           <w:b/>
-          <w:sz w:val="22"/>
+          <w:sz w:val="20"/>
         </w:rPr>
         <w:t>5.5 Expanded Capability Models</w:t>
       </w:r>
     </w:p>
     <w:p>
       <w:pPr>
-        <w:spacing w:line="276" w:lineRule="auto"/>
-        <w:ind w:firstLine="420"/>
+        <w:spacing w:line="276" w:lineRule="auto" w:after="60"/>
+        <w:jc w:val="both"/>
       </w:pPr>
       <w:r>
         <w:rPr>
@@ -935,13 +935,13 @@
           <w:b w:val="0"/>
           <w:sz w:val="20"/>
         </w:rPr>
-        <w:t>Qwen-VL extends the open MLLM landscape with attention to localization, text reading, and broader multimodal tasks [11]. InternVL studies scale in vision foundation models and alignment for generic vision-language tasks [24]. CogVLM introduces a visual expert design to add visual capability while preserving language ability [7]. These systems show that MLLM architecture is not converging to one simple pattern. Instead, the field is testing several hypotheses about how to best preserve both visual detail and language competence.</w:t>
+        <w:t>Qwen-VL extends the open MLLM landscape with attention to localization, text reading, and broader multimodal tasks [11]. InternVL studies scale in vision foundation models and alignment for generic vision-language tasks [40]. CogVLM introduces a visual expert design to add visual capability while preserving language ability [7]. These systems show that MLLM architecture is not converging to one simple pattern. Instead, the field is testing several hypotheses about how to best preserve both visual detail and language competence.</w:t>
       </w:r>
     </w:p>
     <w:p>
       <w:pPr>
-        <w:spacing w:line="276" w:lineRule="auto"/>
-        <w:ind w:firstLine="420"/>
+        <w:spacing w:line="276" w:lineRule="auto" w:after="60"/>
+        <w:jc w:val="both"/>
       </w:pPr>
       <w:r>
         <w:rPr>
@@ -960,15 +960,15 @@
         <w:rPr>
           <w:rFonts w:ascii="Times New Roman" w:hAnsi="Times New Roman" w:eastAsia="SimSun"/>
           <w:b/>
-          <w:sz w:val="22"/>
+          <w:sz w:val="20"/>
         </w:rPr>
         <w:t>5.6 Visual Encoders and Feature Granularity</w:t>
       </w:r>
     </w:p>
     <w:p>
       <w:pPr>
-        <w:spacing w:line="276" w:lineRule="auto"/>
-        <w:ind w:firstLine="420"/>
+        <w:spacing w:line="276" w:lineRule="auto" w:after="60"/>
+        <w:jc w:val="both"/>
       </w:pPr>
       <w:r>
         <w:rPr>
@@ -981,8 +981,8 @@
     </w:p>
     <w:p>
       <w:pPr>
-        <w:spacing w:line="276" w:lineRule="auto"/>
-        <w:ind w:firstLine="420"/>
+        <w:spacing w:line="276" w:lineRule="auto" w:after="60"/>
+        <w:jc w:val="both"/>
       </w:pPr>
       <w:r>
         <w:rPr>
@@ -995,8 +995,8 @@
     </w:p>
     <w:p>
       <w:pPr>
-        <w:spacing w:line="276" w:lineRule="auto"/>
-        <w:ind w:firstLine="420"/>
+        <w:spacing w:line="276" w:lineRule="auto" w:after="60"/>
+        <w:jc w:val="both"/>
       </w:pPr>
       <w:r>
         <w:rPr>
@@ -1015,15 +1015,15 @@
         <w:rPr>
           <w:rFonts w:ascii="Times New Roman" w:hAnsi="Times New Roman" w:eastAsia="SimSun"/>
           <w:b/>
-          <w:sz w:val="22"/>
+          <w:sz w:val="20"/>
         </w:rPr>
         <w:t>5.7 Connectors as Information Bottlenecks</w:t>
       </w:r>
     </w:p>
     <w:p>
       <w:pPr>
-        <w:spacing w:line="276" w:lineRule="auto"/>
-        <w:ind w:firstLine="420"/>
+        <w:spacing w:line="276" w:lineRule="auto" w:after="60"/>
+        <w:jc w:val="both"/>
       </w:pPr>
       <w:r>
         <w:rPr>
@@ -1036,8 +1036,8 @@
     </w:p>
     <w:p>
       <w:pPr>
-        <w:spacing w:line="276" w:lineRule="auto"/>
-        <w:ind w:firstLine="420"/>
+        <w:spacing w:line="276" w:lineRule="auto" w:after="60"/>
+        <w:jc w:val="both"/>
       </w:pPr>
       <w:r>
         <w:rPr>
@@ -1050,8 +1050,8 @@
     </w:p>
     <w:p>
       <w:pPr>
-        <w:spacing w:line="276" w:lineRule="auto"/>
-        <w:ind w:firstLine="420"/>
+        <w:spacing w:line="276" w:lineRule="auto" w:after="60"/>
+        <w:jc w:val="both"/>
       </w:pPr>
       <w:r>
         <w:rPr>
@@ -1070,15 +1070,15 @@
         <w:rPr>
           <w:rFonts w:ascii="Times New Roman" w:hAnsi="Times New Roman" w:eastAsia="SimSun"/>
           <w:b/>
-          <w:sz w:val="22"/>
+          <w:sz w:val="20"/>
         </w:rPr>
         <w:t>5.8 Language Backbones and Multimodal Transfer</w:t>
       </w:r>
     </w:p>
     <w:p>
       <w:pPr>
-        <w:spacing w:line="276" w:lineRule="auto"/>
-        <w:ind w:firstLine="420"/>
+        <w:spacing w:line="276" w:lineRule="auto" w:after="60"/>
+        <w:jc w:val="both"/>
       </w:pPr>
       <w:r>
         <w:rPr>
@@ -1091,8 +1091,8 @@
     </w:p>
     <w:p>
       <w:pPr>
-        <w:spacing w:line="276" w:lineRule="auto"/>
-        <w:ind w:firstLine="420"/>
+        <w:spacing w:line="276" w:lineRule="auto" w:after="60"/>
+        <w:jc w:val="both"/>
       </w:pPr>
       <w:r>
         <w:rPr>
@@ -1105,8 +1105,8 @@
     </w:p>
     <w:p>
       <w:pPr>
-        <w:spacing w:line="276" w:lineRule="auto"/>
-        <w:ind w:firstLine="420"/>
+        <w:spacing w:line="276" w:lineRule="auto" w:after="60"/>
+        <w:jc w:val="both"/>
       </w:pPr>
       <w:r>
         <w:rPr>
@@ -1125,15 +1125,15 @@
         <w:rPr>
           <w:rFonts w:ascii="Times New Roman" w:hAnsi="Times New Roman" w:eastAsia="SimSun"/>
           <w:b/>
-          <w:sz w:val="22"/>
+          <w:sz w:val="20"/>
         </w:rPr>
         <w:t>5.9 Open and Closed Model Trade-offs</w:t>
       </w:r>
     </w:p>
     <w:p>
       <w:pPr>
-        <w:spacing w:line="276" w:lineRule="auto"/>
-        <w:ind w:firstLine="420"/>
+        <w:spacing w:line="276" w:lineRule="auto" w:after="60"/>
+        <w:jc w:val="both"/>
       </w:pPr>
       <w:r>
         <w:rPr>
@@ -1146,8 +1146,8 @@
     </w:p>
     <w:p>
       <w:pPr>
-        <w:spacing w:line="276" w:lineRule="auto"/>
-        <w:ind w:firstLine="420"/>
+        <w:spacing w:line="276" w:lineRule="auto" w:after="60"/>
+        <w:jc w:val="both"/>
       </w:pPr>
       <w:r>
         <w:rPr>
@@ -1160,8 +1160,8 @@
     </w:p>
     <w:p>
       <w:pPr>
-        <w:spacing w:line="276" w:lineRule="auto"/>
-        <w:ind w:firstLine="420"/>
+        <w:spacing w:line="276" w:lineRule="auto" w:after="60"/>
+        <w:jc w:val="both"/>
       </w:pPr>
       <w:r>
         <w:rPr>
@@ -1180,7 +1180,7 @@
         <w:rPr>
           <w:rFonts w:ascii="Times New Roman" w:hAnsi="Times New Roman"/>
           <w:b/>
-          <w:sz w:val="18"/>
+          <w:sz w:val="16"/>
         </w:rPr>
         <w:t>Table 1. Representative MLLM architecture taxonomy.</w:t>
       </w:r>
@@ -1192,16 +1192,15 @@
         <w:tblLook w:firstColumn="1" w:firstRow="1" w:lastColumn="0" w:lastRow="0" w:noHBand="0" w:noVBand="1" w:val="04A0"/>
       </w:tblPr>
       <w:tblGrid>
-        <w:gridCol w:w="1660"/>
-        <w:gridCol w:w="1660"/>
-        <w:gridCol w:w="1660"/>
-        <w:gridCol w:w="1660"/>
-        <w:gridCol w:w="1660"/>
+        <w:gridCol w:w="1722"/>
+        <w:gridCol w:w="1722"/>
+        <w:gridCol w:w="1722"/>
+        <w:gridCol w:w="1722"/>
       </w:tblGrid>
       <w:tr>
         <w:tc>
           <w:tcPr>
-            <w:tcW w:type="dxa" w:w="1660"/>
+            <w:tcW w:type="dxa" w:w="1722"/>
             <w:shd w:fill="D9EAF7"/>
           </w:tcPr>
           <w:p>
@@ -1210,15 +1209,15 @@
               <w:rPr>
                 <w:rFonts w:ascii="Times New Roman" w:hAnsi="Times New Roman" w:eastAsia="SimSun"/>
                 <w:b/>
-                <w:sz w:val="16"/>
+                <w:sz w:val="12"/>
               </w:rPr>
-              <w:t>model</w:t>
+              <w:t>stage</w:t>
             </w:r>
           </w:p>
         </w:tc>
         <w:tc>
           <w:tcPr>
-            <w:tcW w:type="dxa" w:w="1660"/>
+            <w:tcW w:type="dxa" w:w="1722"/>
             <w:shd w:fill="D9EAF7"/>
           </w:tcPr>
           <w:p>
@@ -1227,15 +1226,15 @@
               <w:rPr>
                 <w:rFonts w:ascii="Times New Roman" w:hAnsi="Times New Roman" w:eastAsia="SimSun"/>
                 <w:b/>
-                <w:sz w:val="16"/>
+                <w:sz w:val="12"/>
               </w:rPr>
-              <w:t>year</w:t>
+              <w:t>examples</w:t>
             </w:r>
           </w:p>
         </w:tc>
         <w:tc>
           <w:tcPr>
-            <w:tcW w:type="dxa" w:w="1660"/>
+            <w:tcW w:type="dxa" w:w="1722"/>
             <w:shd w:fill="D9EAF7"/>
           </w:tcPr>
           <w:p>
@@ -1244,15 +1243,15 @@
               <w:rPr>
                 <w:rFonts w:ascii="Times New Roman" w:hAnsi="Times New Roman" w:eastAsia="SimSun"/>
                 <w:b/>
-                <w:sz w:val="16"/>
+                <w:sz w:val="12"/>
               </w:rPr>
-              <w:t>main architecture</w:t>
+              <w:t>main pattern</w:t>
             </w:r>
           </w:p>
         </w:tc>
         <w:tc>
           <w:tcPr>
-            <w:tcW w:type="dxa" w:w="1660"/>
+            <w:tcW w:type="dxa" w:w="1722"/>
             <w:shd w:fill="D9EAF7"/>
           </w:tcPr>
           <w:p>
@@ -1261,26 +1260,9 @@
               <w:rPr>
                 <w:rFonts w:ascii="Times New Roman" w:hAnsi="Times New Roman" w:eastAsia="SimSun"/>
                 <w:b/>
-                <w:sz w:val="16"/>
+                <w:sz w:val="12"/>
               </w:rPr>
-              <w:t>training or alignment paradigm</w:t>
-            </w:r>
-          </w:p>
-        </w:tc>
-        <w:tc>
-          <w:tcPr>
-            <w:tcW w:type="dxa" w:w="1660"/>
-            <w:shd w:fill="D9EAF7"/>
-          </w:tcPr>
-          <w:p>
-            <w:r/>
-            <w:r>
-              <w:rPr>
-                <w:rFonts w:ascii="Times New Roman" w:hAnsi="Times New Roman" w:eastAsia="SimSun"/>
-                <w:b/>
-                <w:sz w:val="16"/>
-              </w:rPr>
-              <w:t>notable role</w:t>
+              <w:t>role in survey</w:t>
             </w:r>
           </w:p>
         </w:tc>
@@ -1288,7 +1270,7 @@
       <w:tr>
         <w:tc>
           <w:tcPr>
-            <w:tcW w:type="dxa" w:w="1660"/>
+            <w:tcW w:type="dxa" w:w="1722"/>
           </w:tcPr>
           <w:p>
             <w:r/>
@@ -1296,15 +1278,15 @@
               <w:rPr>
                 <w:rFonts w:ascii="Times New Roman" w:hAnsi="Times New Roman" w:eastAsia="SimSun"/>
                 <w:b w:val="0"/>
-                <w:sz w:val="16"/>
+                <w:sz w:val="12"/>
               </w:rPr>
-              <w:t>CLIP</w:t>
+              <w:t>Pre-LLM VLP</w:t>
             </w:r>
           </w:p>
         </w:tc>
         <w:tc>
           <w:tcPr>
-            <w:tcW w:type="dxa" w:w="1660"/>
+            <w:tcW w:type="dxa" w:w="1722"/>
           </w:tcPr>
           <w:p>
             <w:r/>
@@ -1312,15 +1294,15 @@
               <w:rPr>
                 <w:rFonts w:ascii="Times New Roman" w:hAnsi="Times New Roman" w:eastAsia="SimSun"/>
                 <w:b w:val="0"/>
-                <w:sz w:val="16"/>
+                <w:sz w:val="12"/>
               </w:rPr>
-              <w:t>2021</w:t>
+              <w:t>ViLBERT, LXMERT, UNITER, Oscar, VinVL</w:t>
             </w:r>
           </w:p>
         </w:tc>
         <w:tc>
           <w:tcPr>
-            <w:tcW w:type="dxa" w:w="1660"/>
+            <w:tcW w:type="dxa" w:w="1722"/>
           </w:tcPr>
           <w:p>
             <w:r/>
@@ -1328,15 +1310,15 @@
               <w:rPr>
                 <w:rFonts w:ascii="Times New Roman" w:hAnsi="Times New Roman" w:eastAsia="SimSun"/>
                 <w:b w:val="0"/>
-                <w:sz w:val="16"/>
+                <w:sz w:val="12"/>
               </w:rPr>
-              <w:t>dual encoder</w:t>
+              <w:t>cross-modal encoder pretraining</w:t>
             </w:r>
           </w:p>
         </w:tc>
         <w:tc>
           <w:tcPr>
-            <w:tcW w:type="dxa" w:w="1660"/>
+            <w:tcW w:type="dxa" w:w="1722"/>
           </w:tcPr>
           <w:p>
             <w:r/>
@@ -1344,15 +1326,17 @@
               <w:rPr>
                 <w:rFonts w:ascii="Times New Roman" w:hAnsi="Times New Roman" w:eastAsia="SimSun"/>
                 <w:b w:val="0"/>
-                <w:sz w:val="16"/>
+                <w:sz w:val="12"/>
               </w:rPr>
-              <w:t>contrastive image-text pretraining</w:t>
+              <w:t>foundation for image-text representation learning</w:t>
             </w:r>
           </w:p>
         </w:tc>
+      </w:tr>
+      <w:tr>
         <w:tc>
           <w:tcPr>
-            <w:tcW w:type="dxa" w:w="1660"/>
+            <w:tcW w:type="dxa" w:w="1722"/>
           </w:tcPr>
           <w:p>
             <w:r/>
@@ -1360,9 +1344,57 @@
               <w:rPr>
                 <w:rFonts w:ascii="Times New Roman" w:hAnsi="Times New Roman" w:eastAsia="SimSun"/>
                 <w:b w:val="0"/>
-                <w:sz w:val="16"/>
+                <w:sz w:val="12"/>
               </w:rPr>
-              <w:t>foundation for open-vocabulary vision-language representation</w:t>
+              <w:t>Open-vocabulary alignment</w:t>
+            </w:r>
+          </w:p>
+        </w:tc>
+        <w:tc>
+          <w:tcPr>
+            <w:tcW w:type="dxa" w:w="1722"/>
+          </w:tcPr>
+          <w:p>
+            <w:r/>
+            <w:r>
+              <w:rPr>
+                <w:rFonts w:ascii="Times New Roman" w:hAnsi="Times New Roman" w:eastAsia="SimSun"/>
+                <w:b w:val="0"/>
+                <w:sz w:val="12"/>
+              </w:rPr>
+              <w:t>CLIP, ALIGN, OFA, PaLI</w:t>
+            </w:r>
+          </w:p>
+        </w:tc>
+        <w:tc>
+          <w:tcPr>
+            <w:tcW w:type="dxa" w:w="1722"/>
+          </w:tcPr>
+          <w:p>
+            <w:r/>
+            <w:r>
+              <w:rPr>
+                <w:rFonts w:ascii="Times New Roman" w:hAnsi="Times New Roman" w:eastAsia="SimSun"/>
+                <w:b w:val="0"/>
+                <w:sz w:val="12"/>
+              </w:rPr>
+              <w:t>contrastive or sequence-to-sequence scaling</w:t>
+            </w:r>
+          </w:p>
+        </w:tc>
+        <w:tc>
+          <w:tcPr>
+            <w:tcW w:type="dxa" w:w="1722"/>
+          </w:tcPr>
+          <w:p>
+            <w:r/>
+            <w:r>
+              <w:rPr>
+                <w:rFonts w:ascii="Times New Roman" w:hAnsi="Times New Roman" w:eastAsia="SimSun"/>
+                <w:b w:val="0"/>
+                <w:sz w:val="12"/>
+              </w:rPr>
+              <w:t>transferable visual-language representations</w:t>
             </w:r>
           </w:p>
         </w:tc>
@@ -1370,7 +1402,7 @@
       <w:tr>
         <w:tc>
           <w:tcPr>
-            <w:tcW w:type="dxa" w:w="1660"/>
+            <w:tcW w:type="dxa" w:w="1722"/>
           </w:tcPr>
           <w:p>
             <w:r/>
@@ -1378,15 +1410,15 @@
               <w:rPr>
                 <w:rFonts w:ascii="Times New Roman" w:hAnsi="Times New Roman" w:eastAsia="SimSun"/>
                 <w:b w:val="0"/>
-                <w:sz w:val="16"/>
+                <w:sz w:val="12"/>
               </w:rPr>
-              <w:t>Flamingo</w:t>
+              <w:t>Frozen-connector MLLMs</w:t>
             </w:r>
           </w:p>
         </w:tc>
         <w:tc>
           <w:tcPr>
-            <w:tcW w:type="dxa" w:w="1660"/>
+            <w:tcW w:type="dxa" w:w="1722"/>
           </w:tcPr>
           <w:p>
             <w:r/>
@@ -1394,15 +1426,15 @@
               <w:rPr>
                 <w:rFonts w:ascii="Times New Roman" w:hAnsi="Times New Roman" w:eastAsia="SimSun"/>
                 <w:b w:val="0"/>
-                <w:sz w:val="16"/>
+                <w:sz w:val="12"/>
               </w:rPr>
-              <w:t>2022</w:t>
+              <w:t>Flamingo, BLIP-2, MiniGPT-4</w:t>
             </w:r>
           </w:p>
         </w:tc>
         <w:tc>
           <w:tcPr>
-            <w:tcW w:type="dxa" w:w="1660"/>
+            <w:tcW w:type="dxa" w:w="1722"/>
           </w:tcPr>
           <w:p>
             <w:r/>
@@ -1410,15 +1442,15 @@
               <w:rPr>
                 <w:rFonts w:ascii="Times New Roman" w:hAnsi="Times New Roman" w:eastAsia="SimSun"/>
                 <w:b w:val="0"/>
-                <w:sz w:val="16"/>
+                <w:sz w:val="12"/>
               </w:rPr>
-              <w:t>frozen vision encoder plus frozen language model with cross-attention</w:t>
+              <w:t>vision encoder connected to frozen or partly frozen LLM</w:t>
             </w:r>
           </w:p>
         </w:tc>
         <w:tc>
           <w:tcPr>
-            <w:tcW w:type="dxa" w:w="1660"/>
+            <w:tcW w:type="dxa" w:w="1722"/>
           </w:tcPr>
           <w:p>
             <w:r/>
@@ -1426,15 +1458,17 @@
               <w:rPr>
                 <w:rFonts w:ascii="Times New Roman" w:hAnsi="Times New Roman" w:eastAsia="SimSun"/>
                 <w:b w:val="0"/>
-                <w:sz w:val="16"/>
+                <w:sz w:val="12"/>
               </w:rPr>
-              <w:t>few-shot multimodal adaptation</w:t>
+              <w:t>efficient multimodal generation and few-shot adaptation</w:t>
             </w:r>
           </w:p>
         </w:tc>
+      </w:tr>
+      <w:tr>
         <w:tc>
           <w:tcPr>
-            <w:tcW w:type="dxa" w:w="1660"/>
+            <w:tcW w:type="dxa" w:w="1722"/>
           </w:tcPr>
           <w:p>
             <w:r/>
@@ -1442,9 +1476,57 @@
               <w:rPr>
                 <w:rFonts w:ascii="Times New Roman" w:hAnsi="Times New Roman" w:eastAsia="SimSun"/>
                 <w:b w:val="0"/>
-                <w:sz w:val="16"/>
+                <w:sz w:val="12"/>
               </w:rPr>
-              <w:t>early strong image/video-to-text few-shot model</w:t>
+              <w:t>Instruction-tuned MLLMs</w:t>
+            </w:r>
+          </w:p>
+        </w:tc>
+        <w:tc>
+          <w:tcPr>
+            <w:tcW w:type="dxa" w:w="1722"/>
+          </w:tcPr>
+          <w:p>
+            <w:r/>
+            <w:r>
+              <w:rPr>
+                <w:rFonts w:ascii="Times New Roman" w:hAnsi="Times New Roman" w:eastAsia="SimSun"/>
+                <w:b w:val="0"/>
+                <w:sz w:val="12"/>
+              </w:rPr>
+              <w:t>InstructBLIP, LLaVA, Qwen-VL, mPLUG-Owl</w:t>
+            </w:r>
+          </w:p>
+        </w:tc>
+        <w:tc>
+          <w:tcPr>
+            <w:tcW w:type="dxa" w:w="1722"/>
+          </w:tcPr>
+          <w:p>
+            <w:r/>
+            <w:r>
+              <w:rPr>
+                <w:rFonts w:ascii="Times New Roman" w:hAnsi="Times New Roman" w:eastAsia="SimSun"/>
+                <w:b w:val="0"/>
+                <w:sz w:val="12"/>
+              </w:rPr>
+              <w:t>visual instruction tuning and alignment</w:t>
+            </w:r>
+          </w:p>
+        </w:tc>
+        <w:tc>
+          <w:tcPr>
+            <w:tcW w:type="dxa" w:w="1722"/>
+          </w:tcPr>
+          <w:p>
+            <w:r/>
+            <w:r>
+              <w:rPr>
+                <w:rFonts w:ascii="Times New Roman" w:hAnsi="Times New Roman" w:eastAsia="SimSun"/>
+                <w:b w:val="0"/>
+                <w:sz w:val="12"/>
+              </w:rPr>
+              <w:t>assistant-style multimodal interaction</w:t>
             </w:r>
           </w:p>
         </w:tc>
@@ -1452,7 +1534,7 @@
       <w:tr>
         <w:tc>
           <w:tcPr>
-            <w:tcW w:type="dxa" w:w="1660"/>
+            <w:tcW w:type="dxa" w:w="1722"/>
           </w:tcPr>
           <w:p>
             <w:r/>
@@ -1460,15 +1542,15 @@
               <w:rPr>
                 <w:rFonts w:ascii="Times New Roman" w:hAnsi="Times New Roman" w:eastAsia="SimSun"/>
                 <w:b w:val="0"/>
-                <w:sz w:val="16"/>
+                <w:sz w:val="12"/>
               </w:rPr>
-              <w:t>BLIP-2</w:t>
+              <w:t>Grounded and visual-expert MLLMs</w:t>
             </w:r>
           </w:p>
         </w:tc>
         <w:tc>
           <w:tcPr>
-            <w:tcW w:type="dxa" w:w="1660"/>
+            <w:tcW w:type="dxa" w:w="1722"/>
           </w:tcPr>
           <w:p>
             <w:r/>
@@ -1476,15 +1558,15 @@
               <w:rPr>
                 <w:rFonts w:ascii="Times New Roman" w:hAnsi="Times New Roman" w:eastAsia="SimSun"/>
                 <w:b w:val="0"/>
-                <w:sz w:val="16"/>
+                <w:sz w:val="12"/>
               </w:rPr>
-              <w:t>2023</w:t>
+              <w:t>Kosmos-2, Shikra, Ferret, CogVLM, InternVL</w:t>
             </w:r>
           </w:p>
         </w:tc>
         <w:tc>
           <w:tcPr>
-            <w:tcW w:type="dxa" w:w="1660"/>
+            <w:tcW w:type="dxa" w:w="1722"/>
           </w:tcPr>
           <w:p>
             <w:r/>
@@ -1492,15 +1574,15 @@
               <w:rPr>
                 <w:rFonts w:ascii="Times New Roman" w:hAnsi="Times New Roman" w:eastAsia="SimSun"/>
                 <w:b w:val="0"/>
-                <w:sz w:val="16"/>
+                <w:sz w:val="12"/>
               </w:rPr>
-              <w:t>frozen vision encoder plus frozen language model with Q-Former</w:t>
+              <w:t>grounding, localization, expert modules, and scale</w:t>
             </w:r>
           </w:p>
         </w:tc>
         <w:tc>
           <w:tcPr>
-            <w:tcW w:type="dxa" w:w="1660"/>
+            <w:tcW w:type="dxa" w:w="1722"/>
           </w:tcPr>
           <w:p>
             <w:r/>
@@ -1508,15 +1590,17 @@
               <w:rPr>
                 <w:rFonts w:ascii="Times New Roman" w:hAnsi="Times New Roman" w:eastAsia="SimSun"/>
                 <w:b w:val="0"/>
-                <w:sz w:val="16"/>
+                <w:sz w:val="12"/>
               </w:rPr>
-              <w:t>bootstrapped vision-language pretraining</w:t>
+              <w:t>fine-grained visual evidence and grounding reliability</w:t>
             </w:r>
           </w:p>
         </w:tc>
+      </w:tr>
+      <w:tr>
         <w:tc>
           <w:tcPr>
-            <w:tcW w:type="dxa" w:w="1660"/>
+            <w:tcW w:type="dxa" w:w="1722"/>
           </w:tcPr>
           <w:p>
             <w:r/>
@@ -1524,17 +1608,15 @@
               <w:rPr>
                 <w:rFonts w:ascii="Times New Roman" w:hAnsi="Times New Roman" w:eastAsia="SimSun"/>
                 <w:b w:val="0"/>
-                <w:sz w:val="16"/>
+                <w:sz w:val="12"/>
               </w:rPr>
-              <w:t>parameter-efficient bridge between vision encoders and LLMs</w:t>
+              <w:t>Expanded modality systems</w:t>
             </w:r>
           </w:p>
         </w:tc>
-      </w:tr>
-      <w:tr>
         <w:tc>
           <w:tcPr>
-            <w:tcW w:type="dxa" w:w="1660"/>
+            <w:tcW w:type="dxa" w:w="1722"/>
           </w:tcPr>
           <w:p>
             <w:r/>
@@ -1542,15 +1624,15 @@
               <w:rPr>
                 <w:rFonts w:ascii="Times New Roman" w:hAnsi="Times New Roman" w:eastAsia="SimSun"/>
                 <w:b w:val="0"/>
-                <w:sz w:val="16"/>
+                <w:sz w:val="12"/>
               </w:rPr>
-              <w:t>InstructBLIP</w:t>
+              <w:t>PaLM-E, Video-LLaVA, Visual ChatGPT, GPT-4V</w:t>
             </w:r>
           </w:p>
         </w:tc>
         <w:tc>
           <w:tcPr>
-            <w:tcW w:type="dxa" w:w="1660"/>
+            <w:tcW w:type="dxa" w:w="1722"/>
           </w:tcPr>
           <w:p>
             <w:r/>
@@ -1558,15 +1640,15 @@
               <w:rPr>
                 <w:rFonts w:ascii="Times New Roman" w:hAnsi="Times New Roman" w:eastAsia="SimSun"/>
                 <w:b w:val="0"/>
-                <w:sz w:val="16"/>
+                <w:sz w:val="12"/>
               </w:rPr>
-              <w:t>2023</w:t>
+              <w:t>embodiment, video, tool use, or closed frontier alignment</w:t>
             </w:r>
           </w:p>
         </w:tc>
         <w:tc>
           <w:tcPr>
-            <w:tcW w:type="dxa" w:w="1660"/>
+            <w:tcW w:type="dxa" w:w="1722"/>
           </w:tcPr>
           <w:p>
             <w:r/>
@@ -1574,533 +1656,9 @@
               <w:rPr>
                 <w:rFonts w:ascii="Times New Roman" w:hAnsi="Times New Roman" w:eastAsia="SimSun"/>
                 <w:b w:val="0"/>
-                <w:sz w:val="16"/>
+                <w:sz w:val="12"/>
               </w:rPr>
-              <w:t>BLIP-2 style architecture</w:t>
-            </w:r>
-          </w:p>
-        </w:tc>
-        <w:tc>
-          <w:tcPr>
-            <w:tcW w:type="dxa" w:w="1660"/>
-          </w:tcPr>
-          <w:p>
-            <w:r/>
-            <w:r>
-              <w:rPr>
-                <w:rFonts w:ascii="Times New Roman" w:hAnsi="Times New Roman" w:eastAsia="SimSun"/>
-                <w:b w:val="0"/>
-                <w:sz w:val="16"/>
-              </w:rPr>
-              <w:t>instruction tuning</w:t>
-            </w:r>
-          </w:p>
-        </w:tc>
-        <w:tc>
-          <w:tcPr>
-            <w:tcW w:type="dxa" w:w="1660"/>
-          </w:tcPr>
-          <w:p>
-            <w:r/>
-            <w:r>
-              <w:rPr>
-                <w:rFonts w:ascii="Times New Roman" w:hAnsi="Times New Roman" w:eastAsia="SimSun"/>
-                <w:b w:val="0"/>
-                <w:sz w:val="16"/>
-              </w:rPr>
-              <w:t>general-purpose instruction-following vision-language model</w:t>
-            </w:r>
-          </w:p>
-        </w:tc>
-      </w:tr>
-      <w:tr>
-        <w:tc>
-          <w:tcPr>
-            <w:tcW w:type="dxa" w:w="1660"/>
-          </w:tcPr>
-          <w:p>
-            <w:r/>
-            <w:r>
-              <w:rPr>
-                <w:rFonts w:ascii="Times New Roman" w:hAnsi="Times New Roman" w:eastAsia="SimSun"/>
-                <w:b w:val="0"/>
-                <w:sz w:val="16"/>
-              </w:rPr>
-              <w:t>LLaVA</w:t>
-            </w:r>
-          </w:p>
-        </w:tc>
-        <w:tc>
-          <w:tcPr>
-            <w:tcW w:type="dxa" w:w="1660"/>
-          </w:tcPr>
-          <w:p>
-            <w:r/>
-            <w:r>
-              <w:rPr>
-                <w:rFonts w:ascii="Times New Roman" w:hAnsi="Times New Roman" w:eastAsia="SimSun"/>
-                <w:b w:val="0"/>
-                <w:sz w:val="16"/>
-              </w:rPr>
-              <w:t>2023</w:t>
-            </w:r>
-          </w:p>
-        </w:tc>
-        <w:tc>
-          <w:tcPr>
-            <w:tcW w:type="dxa" w:w="1660"/>
-          </w:tcPr>
-          <w:p>
-            <w:r/>
-            <w:r>
-              <w:rPr>
-                <w:rFonts w:ascii="Times New Roman" w:hAnsi="Times New Roman" w:eastAsia="SimSun"/>
-                <w:b w:val="0"/>
-                <w:sz w:val="16"/>
-              </w:rPr>
-              <w:t>vision encoder plus projection into LLM</w:t>
-            </w:r>
-          </w:p>
-        </w:tc>
-        <w:tc>
-          <w:tcPr>
-            <w:tcW w:type="dxa" w:w="1660"/>
-          </w:tcPr>
-          <w:p>
-            <w:r/>
-            <w:r>
-              <w:rPr>
-                <w:rFonts w:ascii="Times New Roman" w:hAnsi="Times New Roman" w:eastAsia="SimSun"/>
-                <w:b w:val="0"/>
-                <w:sz w:val="16"/>
-              </w:rPr>
-              <w:t>visual instruction tuning</w:t>
-            </w:r>
-          </w:p>
-        </w:tc>
-        <w:tc>
-          <w:tcPr>
-            <w:tcW w:type="dxa" w:w="1660"/>
-          </w:tcPr>
-          <w:p>
-            <w:r/>
-            <w:r>
-              <w:rPr>
-                <w:rFonts w:ascii="Times New Roman" w:hAnsi="Times New Roman" w:eastAsia="SimSun"/>
-                <w:b w:val="0"/>
-                <w:sz w:val="16"/>
-              </w:rPr>
-              <w:t>open instruction-tuned MLLM baseline</w:t>
-            </w:r>
-          </w:p>
-        </w:tc>
-      </w:tr>
-      <w:tr>
-        <w:tc>
-          <w:tcPr>
-            <w:tcW w:type="dxa" w:w="1660"/>
-          </w:tcPr>
-          <w:p>
-            <w:r/>
-            <w:r>
-              <w:rPr>
-                <w:rFonts w:ascii="Times New Roman" w:hAnsi="Times New Roman" w:eastAsia="SimSun"/>
-                <w:b w:val="0"/>
-                <w:sz w:val="16"/>
-              </w:rPr>
-              <w:t>MiniGPT-4</w:t>
-            </w:r>
-          </w:p>
-        </w:tc>
-        <w:tc>
-          <w:tcPr>
-            <w:tcW w:type="dxa" w:w="1660"/>
-          </w:tcPr>
-          <w:p>
-            <w:r/>
-            <w:r>
-              <w:rPr>
-                <w:rFonts w:ascii="Times New Roman" w:hAnsi="Times New Roman" w:eastAsia="SimSun"/>
-                <w:b w:val="0"/>
-                <w:sz w:val="16"/>
-              </w:rPr>
-              <w:t>2023</w:t>
-            </w:r>
-          </w:p>
-        </w:tc>
-        <w:tc>
-          <w:tcPr>
-            <w:tcW w:type="dxa" w:w="1660"/>
-          </w:tcPr>
-          <w:p>
-            <w:r/>
-            <w:r>
-              <w:rPr>
-                <w:rFonts w:ascii="Times New Roman" w:hAnsi="Times New Roman" w:eastAsia="SimSun"/>
-                <w:b w:val="0"/>
-                <w:sz w:val="16"/>
-              </w:rPr>
-              <w:t>vision encoder plus projection into Vicuna</w:t>
-            </w:r>
-          </w:p>
-        </w:tc>
-        <w:tc>
-          <w:tcPr>
-            <w:tcW w:type="dxa" w:w="1660"/>
-          </w:tcPr>
-          <w:p>
-            <w:r/>
-            <w:r>
-              <w:rPr>
-                <w:rFonts w:ascii="Times New Roman" w:hAnsi="Times New Roman" w:eastAsia="SimSun"/>
-                <w:b w:val="0"/>
-                <w:sz w:val="16"/>
-              </w:rPr>
-              <w:t>alignment with high-quality image-text pairs</w:t>
-            </w:r>
-          </w:p>
-        </w:tc>
-        <w:tc>
-          <w:tcPr>
-            <w:tcW w:type="dxa" w:w="1660"/>
-          </w:tcPr>
-          <w:p>
-            <w:r/>
-            <w:r>
-              <w:rPr>
-                <w:rFonts w:ascii="Times New Roman" w:hAnsi="Times New Roman" w:eastAsia="SimSun"/>
-                <w:b w:val="0"/>
-                <w:sz w:val="16"/>
-              </w:rPr>
-              <w:t>compact open MLLM demonstration</w:t>
-            </w:r>
-          </w:p>
-        </w:tc>
-      </w:tr>
-      <w:tr>
-        <w:tc>
-          <w:tcPr>
-            <w:tcW w:type="dxa" w:w="1660"/>
-          </w:tcPr>
-          <w:p>
-            <w:r/>
-            <w:r>
-              <w:rPr>
-                <w:rFonts w:ascii="Times New Roman" w:hAnsi="Times New Roman" w:eastAsia="SimSun"/>
-                <w:b w:val="0"/>
-                <w:sz w:val="16"/>
-              </w:rPr>
-              <w:t>Qwen-VL</w:t>
-            </w:r>
-          </w:p>
-        </w:tc>
-        <w:tc>
-          <w:tcPr>
-            <w:tcW w:type="dxa" w:w="1660"/>
-          </w:tcPr>
-          <w:p>
-            <w:r/>
-            <w:r>
-              <w:rPr>
-                <w:rFonts w:ascii="Times New Roman" w:hAnsi="Times New Roman" w:eastAsia="SimSun"/>
-                <w:b w:val="0"/>
-                <w:sz w:val="16"/>
-              </w:rPr>
-              <w:t>2023</w:t>
-            </w:r>
-          </w:p>
-        </w:tc>
-        <w:tc>
-          <w:tcPr>
-            <w:tcW w:type="dxa" w:w="1660"/>
-          </w:tcPr>
-          <w:p>
-            <w:r/>
-            <w:r>
-              <w:rPr>
-                <w:rFonts w:ascii="Times New Roman" w:hAnsi="Times New Roman" w:eastAsia="SimSun"/>
-                <w:b w:val="0"/>
-                <w:sz w:val="16"/>
-              </w:rPr>
-              <w:t>vision-language transformer with localization and text reading capabilities</w:t>
-            </w:r>
-          </w:p>
-        </w:tc>
-        <w:tc>
-          <w:tcPr>
-            <w:tcW w:type="dxa" w:w="1660"/>
-          </w:tcPr>
-          <w:p>
-            <w:r/>
-            <w:r>
-              <w:rPr>
-                <w:rFonts w:ascii="Times New Roman" w:hAnsi="Times New Roman" w:eastAsia="SimSun"/>
-                <w:b w:val="0"/>
-                <w:sz w:val="16"/>
-              </w:rPr>
-              <w:t>multistage pretraining and instruction tuning</w:t>
-            </w:r>
-          </w:p>
-        </w:tc>
-        <w:tc>
-          <w:tcPr>
-            <w:tcW w:type="dxa" w:w="1660"/>
-          </w:tcPr>
-          <w:p>
-            <w:r/>
-            <w:r>
-              <w:rPr>
-                <w:rFonts w:ascii="Times New Roman" w:hAnsi="Times New Roman" w:eastAsia="SimSun"/>
-                <w:b w:val="0"/>
-                <w:sz w:val="16"/>
-              </w:rPr>
-              <w:t>open MLLM family with grounding and OCR emphasis</w:t>
-            </w:r>
-          </w:p>
-        </w:tc>
-      </w:tr>
-      <w:tr>
-        <w:tc>
-          <w:tcPr>
-            <w:tcW w:type="dxa" w:w="1660"/>
-          </w:tcPr>
-          <w:p>
-            <w:r/>
-            <w:r>
-              <w:rPr>
-                <w:rFonts w:ascii="Times New Roman" w:hAnsi="Times New Roman" w:eastAsia="SimSun"/>
-                <w:b w:val="0"/>
-                <w:sz w:val="16"/>
-              </w:rPr>
-              <w:t>GPT-4V</w:t>
-            </w:r>
-          </w:p>
-        </w:tc>
-        <w:tc>
-          <w:tcPr>
-            <w:tcW w:type="dxa" w:w="1660"/>
-          </w:tcPr>
-          <w:p>
-            <w:r/>
-            <w:r>
-              <w:rPr>
-                <w:rFonts w:ascii="Times New Roman" w:hAnsi="Times New Roman" w:eastAsia="SimSun"/>
-                <w:b w:val="0"/>
-                <w:sz w:val="16"/>
-              </w:rPr>
-              <w:t>2023</w:t>
-            </w:r>
-          </w:p>
-        </w:tc>
-        <w:tc>
-          <w:tcPr>
-            <w:tcW w:type="dxa" w:w="1660"/>
-          </w:tcPr>
-          <w:p>
-            <w:r/>
-            <w:r>
-              <w:rPr>
-                <w:rFonts w:ascii="Times New Roman" w:hAnsi="Times New Roman" w:eastAsia="SimSun"/>
-                <w:b w:val="0"/>
-                <w:sz w:val="16"/>
-              </w:rPr>
-              <w:t>closed multimodal frontier model</w:t>
-            </w:r>
-          </w:p>
-        </w:tc>
-        <w:tc>
-          <w:tcPr>
-            <w:tcW w:type="dxa" w:w="1660"/>
-          </w:tcPr>
-          <w:p>
-            <w:r/>
-            <w:r>
-              <w:rPr>
-                <w:rFonts w:ascii="Times New Roman" w:hAnsi="Times New Roman" w:eastAsia="SimSun"/>
-                <w:b w:val="0"/>
-                <w:sz w:val="16"/>
-              </w:rPr>
-              <w:t>proprietary multimodal training and safety alignment</w:t>
-            </w:r>
-          </w:p>
-        </w:tc>
-        <w:tc>
-          <w:tcPr>
-            <w:tcW w:type="dxa" w:w="1660"/>
-          </w:tcPr>
-          <w:p>
-            <w:r/>
-            <w:r>
-              <w:rPr>
-                <w:rFonts w:ascii="Times New Roman" w:hAnsi="Times New Roman" w:eastAsia="SimSun"/>
-                <w:b w:val="0"/>
-                <w:sz w:val="16"/>
-              </w:rPr>
-              <w:t>high-capability reference system described by a system card</w:t>
-            </w:r>
-          </w:p>
-        </w:tc>
-      </w:tr>
-      <w:tr>
-        <w:tc>
-          <w:tcPr>
-            <w:tcW w:type="dxa" w:w="1660"/>
-          </w:tcPr>
-          <w:p>
-            <w:r/>
-            <w:r>
-              <w:rPr>
-                <w:rFonts w:ascii="Times New Roman" w:hAnsi="Times New Roman" w:eastAsia="SimSun"/>
-                <w:b w:val="0"/>
-                <w:sz w:val="16"/>
-              </w:rPr>
-              <w:t>InternVL</w:t>
-            </w:r>
-          </w:p>
-        </w:tc>
-        <w:tc>
-          <w:tcPr>
-            <w:tcW w:type="dxa" w:w="1660"/>
-          </w:tcPr>
-          <w:p>
-            <w:r/>
-            <w:r>
-              <w:rPr>
-                <w:rFonts w:ascii="Times New Roman" w:hAnsi="Times New Roman" w:eastAsia="SimSun"/>
-                <w:b w:val="0"/>
-                <w:sz w:val="16"/>
-              </w:rPr>
-              <w:t>2024</w:t>
-            </w:r>
-          </w:p>
-        </w:tc>
-        <w:tc>
-          <w:tcPr>
-            <w:tcW w:type="dxa" w:w="1660"/>
-          </w:tcPr>
-          <w:p>
-            <w:r/>
-            <w:r>
-              <w:rPr>
-                <w:rFonts w:ascii="Times New Roman" w:hAnsi="Times New Roman" w:eastAsia="SimSun"/>
-                <w:b w:val="0"/>
-                <w:sz w:val="16"/>
-              </w:rPr>
-              <w:t>scaled vision foundation model aligned with LLMs</w:t>
-            </w:r>
-          </w:p>
-        </w:tc>
-        <w:tc>
-          <w:tcPr>
-            <w:tcW w:type="dxa" w:w="1660"/>
-          </w:tcPr>
-          <w:p>
-            <w:r/>
-            <w:r>
-              <w:rPr>
-                <w:rFonts w:ascii="Times New Roman" w:hAnsi="Times New Roman" w:eastAsia="SimSun"/>
-                <w:b w:val="0"/>
-                <w:sz w:val="16"/>
-              </w:rPr>
-              <w:t>large-scale vision-language alignment</w:t>
-            </w:r>
-          </w:p>
-        </w:tc>
-        <w:tc>
-          <w:tcPr>
-            <w:tcW w:type="dxa" w:w="1660"/>
-          </w:tcPr>
-          <w:p>
-            <w:r/>
-            <w:r>
-              <w:rPr>
-                <w:rFonts w:ascii="Times New Roman" w:hAnsi="Times New Roman" w:eastAsia="SimSun"/>
-                <w:b w:val="0"/>
-                <w:sz w:val="16"/>
-              </w:rPr>
-              <w:t>open model family for generic visual-linguistic tasks</w:t>
-            </w:r>
-          </w:p>
-        </w:tc>
-      </w:tr>
-      <w:tr>
-        <w:tc>
-          <w:tcPr>
-            <w:tcW w:type="dxa" w:w="1660"/>
-          </w:tcPr>
-          <w:p>
-            <w:r/>
-            <w:r>
-              <w:rPr>
-                <w:rFonts w:ascii="Times New Roman" w:hAnsi="Times New Roman" w:eastAsia="SimSun"/>
-                <w:b w:val="0"/>
-                <w:sz w:val="16"/>
-              </w:rPr>
-              <w:t>CogVLM</w:t>
-            </w:r>
-          </w:p>
-        </w:tc>
-        <w:tc>
-          <w:tcPr>
-            <w:tcW w:type="dxa" w:w="1660"/>
-          </w:tcPr>
-          <w:p>
-            <w:r/>
-            <w:r>
-              <w:rPr>
-                <w:rFonts w:ascii="Times New Roman" w:hAnsi="Times New Roman" w:eastAsia="SimSun"/>
-                <w:b w:val="0"/>
-                <w:sz w:val="16"/>
-              </w:rPr>
-              <w:t>2024</w:t>
-            </w:r>
-          </w:p>
-        </w:tc>
-        <w:tc>
-          <w:tcPr>
-            <w:tcW w:type="dxa" w:w="1660"/>
-          </w:tcPr>
-          <w:p>
-            <w:r/>
-            <w:r>
-              <w:rPr>
-                <w:rFonts w:ascii="Times New Roman" w:hAnsi="Times New Roman" w:eastAsia="SimSun"/>
-                <w:b w:val="0"/>
-                <w:sz w:val="16"/>
-              </w:rPr>
-              <w:t>visual expert module integrated with pretrained language models</w:t>
-            </w:r>
-          </w:p>
-        </w:tc>
-        <w:tc>
-          <w:tcPr>
-            <w:tcW w:type="dxa" w:w="1660"/>
-          </w:tcPr>
-          <w:p>
-            <w:r/>
-            <w:r>
-              <w:rPr>
-                <w:rFonts w:ascii="Times New Roman" w:hAnsi="Times New Roman" w:eastAsia="SimSun"/>
-                <w:b w:val="0"/>
-                <w:sz w:val="16"/>
-              </w:rPr>
-              <w:t>visual expert alignment</w:t>
-            </w:r>
-          </w:p>
-        </w:tc>
-        <w:tc>
-          <w:tcPr>
-            <w:tcW w:type="dxa" w:w="1660"/>
-          </w:tcPr>
-          <w:p>
-            <w:r/>
-            <w:r>
-              <w:rPr>
-                <w:rFonts w:ascii="Times New Roman" w:hAnsi="Times New Roman" w:eastAsia="SimSun"/>
-                <w:b w:val="0"/>
-                <w:sz w:val="16"/>
-              </w:rPr>
-              <w:t>preserves language ability while adding visual expertise</w:t>
+              <w:t>broader deployment and reproducibility trade-offs</w:t>
             </w:r>
           </w:p>
         </w:tc>
@@ -2108,13 +1666,65 @@
     </w:tbl>
     <w:p>
       <w:pPr>
-        <w:spacing w:before="240" w:after="120"/>
+        <w:jc w:val="center"/>
+      </w:pPr>
+      <w:r>
+        <w:drawing>
+          <wp:inline xmlns:a="http://schemas.openxmlformats.org/drawingml/2006/main" xmlns:pic="http://schemas.openxmlformats.org/drawingml/2006/picture">
+            <wp:extent cx="4248000" cy="2055484"/>
+            <wp:docPr id="1" name="Picture 1"/>
+            <wp:cNvGraphicFramePr>
+              <a:graphicFrameLocks noChangeAspect="1"/>
+            </wp:cNvGraphicFramePr>
+            <a:graphic>
+              <a:graphicData uri="http://schemas.openxmlformats.org/drawingml/2006/picture">
+                <pic:pic>
+                  <pic:nvPicPr>
+                    <pic:cNvPr id="0" name="model_timeline.png"/>
+                    <pic:cNvPicPr/>
+                  </pic:nvPicPr>
+                  <pic:blipFill>
+                    <a:blip r:embed="rId10"/>
+                    <a:stretch>
+                      <a:fillRect/>
+                    </a:stretch>
+                  </pic:blipFill>
+                  <pic:spPr>
+                    <a:xfrm>
+                      <a:off x="0" y="0"/>
+                      <a:ext cx="4248000" cy="2055484"/>
+                    </a:xfrm>
+                    <a:prstGeom prst="rect"/>
+                  </pic:spPr>
+                </pic:pic>
+              </a:graphicData>
+            </a:graphic>
+          </wp:inline>
+        </w:drawing>
+      </w:r>
+    </w:p>
+    <w:p>
+      <w:pPr>
+        <w:jc w:val="center"/>
       </w:pPr>
       <w:r>
         <w:rPr>
           <w:rFonts w:ascii="Times New Roman" w:hAnsi="Times New Roman" w:eastAsia="SimSun"/>
           <w:b/>
-          <w:sz w:val="26"/>
+          <w:sz w:val="16"/>
+        </w:rPr>
+        <w:t>Figure 1. Timeline distribution of representative MLLM-related models.</w:t>
+      </w:r>
+    </w:p>
+    <w:p>
+      <w:pPr>
+        <w:spacing w:before="240" w:after="120"/>
+      </w:pPr>
+      <w:r>
+        <w:rPr>
+          <w:rFonts w:ascii="Times New Roman" w:hAnsi="Times New Roman" w:eastAsia="SimSun"/>
+          <w:b/>
+          <w:sz w:val="24"/>
         </w:rPr>
         <w:t>6. Training Paradigms</w:t>
       </w:r>
@@ -2127,15 +1737,15 @@
         <w:rPr>
           <w:rFonts w:ascii="Times New Roman" w:hAnsi="Times New Roman" w:eastAsia="SimSun"/>
           <w:b/>
-          <w:sz w:val="22"/>
+          <w:sz w:val="20"/>
         </w:rPr>
         <w:t>6.1 Image-Text Contrastive Pretraining</w:t>
       </w:r>
     </w:p>
     <w:p>
       <w:pPr>
-        <w:spacing w:line="276" w:lineRule="auto"/>
-        <w:ind w:firstLine="420"/>
+        <w:spacing w:line="276" w:lineRule="auto" w:after="60"/>
+        <w:jc w:val="both"/>
       </w:pPr>
       <w:r>
         <w:rPr>
@@ -2154,15 +1764,15 @@
         <w:rPr>
           <w:rFonts w:ascii="Times New Roman" w:hAnsi="Times New Roman" w:eastAsia="SimSun"/>
           <w:b/>
-          <w:sz w:val="22"/>
+          <w:sz w:val="20"/>
         </w:rPr>
         <w:t>6.2 Captioning and Generative Pretraining</w:t>
       </w:r>
     </w:p>
     <w:p>
       <w:pPr>
-        <w:spacing w:line="276" w:lineRule="auto"/>
-        <w:ind w:firstLine="420"/>
+        <w:spacing w:line="276" w:lineRule="auto" w:after="60"/>
+        <w:jc w:val="both"/>
       </w:pPr>
       <w:r>
         <w:rPr>
@@ -2170,7 +1780,7 @@
           <w:b w:val="0"/>
           <w:sz w:val="20"/>
         </w:rPr>
-        <w:t>Generative pretraining teaches models to produce text from visual input. Captioning encourages the model to describe salient objects, attributes, and relations. However, captions are often incomplete. A caption may ignore details that are crucial for a later question. If a model is trained primarily on captions, it may underperform on tasks that require reading text, locating small objects, or answering unusual questions. BLIP-style bootstrapping addresses part of this issue by improving caption quality [23].</w:t>
+        <w:t>Generative pretraining teaches models to produce text from visual input. Captioning encourages the model to describe salient objects, attributes, and relations. However, captions are often incomplete. A caption may ignore details that are crucial for a later question. If a model is trained primarily on captions, it may underperform on tasks that require reading text, locating small objects, or answering unusual questions. BLIP-style bootstrapping addresses part of this issue by improving caption quality [29].</w:t>
       </w:r>
     </w:p>
     <w:p>
@@ -2181,15 +1791,15 @@
         <w:rPr>
           <w:rFonts w:ascii="Times New Roman" w:hAnsi="Times New Roman" w:eastAsia="SimSun"/>
           <w:b/>
-          <w:sz w:val="22"/>
+          <w:sz w:val="20"/>
         </w:rPr>
         <w:t>6.3 Connector Alignment</w:t>
       </w:r>
     </w:p>
     <w:p>
       <w:pPr>
-        <w:spacing w:line="276" w:lineRule="auto"/>
-        <w:ind w:firstLine="420"/>
+        <w:spacing w:line="276" w:lineRule="auto" w:after="60"/>
+        <w:jc w:val="both"/>
       </w:pPr>
       <w:r>
         <w:rPr>
@@ -2208,15 +1818,15 @@
         <w:rPr>
           <w:rFonts w:ascii="Times New Roman" w:hAnsi="Times New Roman" w:eastAsia="SimSun"/>
           <w:b/>
-          <w:sz w:val="22"/>
+          <w:sz w:val="20"/>
         </w:rPr>
         <w:t>6.4 Visual Instruction Tuning</w:t>
       </w:r>
     </w:p>
     <w:p>
       <w:pPr>
-        <w:spacing w:line="276" w:lineRule="auto"/>
-        <w:ind w:firstLine="420"/>
+        <w:spacing w:line="276" w:lineRule="auto" w:after="60"/>
+        <w:jc w:val="both"/>
       </w:pPr>
       <w:r>
         <w:rPr>
@@ -2229,8 +1839,8 @@
     </w:p>
     <w:p>
       <w:pPr>
-        <w:spacing w:line="276" w:lineRule="auto"/>
-        <w:ind w:firstLine="420"/>
+        <w:spacing w:line="276" w:lineRule="auto" w:after="60"/>
+        <w:jc w:val="both"/>
       </w:pPr>
       <w:r>
         <w:rPr>
@@ -2249,15 +1859,15 @@
         <w:rPr>
           <w:rFonts w:ascii="Times New Roman" w:hAnsi="Times New Roman" w:eastAsia="SimSun"/>
           <w:b/>
-          <w:sz w:val="22"/>
+          <w:sz w:val="20"/>
         </w:rPr>
         <w:t>6.5 Safety and Refusal Alignment</w:t>
       </w:r>
     </w:p>
     <w:p>
       <w:pPr>
-        <w:spacing w:line="276" w:lineRule="auto"/>
-        <w:ind w:firstLine="420"/>
+        <w:spacing w:line="276" w:lineRule="auto" w:after="60"/>
+        <w:jc w:val="both"/>
       </w:pPr>
       <w:r>
         <w:rPr>
@@ -2276,7 +1886,7 @@
         <w:rPr>
           <w:rFonts w:ascii="Times New Roman" w:hAnsi="Times New Roman" w:eastAsia="SimSun"/>
           <w:b/>
-          <w:sz w:val="26"/>
+          <w:sz w:val="24"/>
         </w:rPr>
         <w:t>7. Benchmark Evaluation and Comparative Analysis</w:t>
       </w:r>
@@ -2289,15 +1899,15 @@
         <w:rPr>
           <w:rFonts w:ascii="Times New Roman" w:hAnsi="Times New Roman" w:eastAsia="SimSun"/>
           <w:b/>
-          <w:sz w:val="22"/>
+          <w:sz w:val="20"/>
         </w:rPr>
         <w:t>7.1 Classical VQA Benchmarks</w:t>
       </w:r>
     </w:p>
     <w:p>
       <w:pPr>
-        <w:spacing w:line="276" w:lineRule="auto"/>
-        <w:ind w:firstLine="420"/>
+        <w:spacing w:line="276" w:lineRule="auto" w:after="60"/>
+        <w:jc w:val="both"/>
       </w:pPr>
       <w:r>
         <w:rPr>
@@ -2316,15 +1926,15 @@
         <w:rPr>
           <w:rFonts w:ascii="Times New Roman" w:hAnsi="Times New Roman" w:eastAsia="SimSun"/>
           <w:b/>
-          <w:sz w:val="22"/>
+          <w:sz w:val="20"/>
         </w:rPr>
         <w:t>7.2 Educational and Scientific Reasoning</w:t>
       </w:r>
     </w:p>
     <w:p>
       <w:pPr>
-        <w:spacing w:line="276" w:lineRule="auto"/>
-        <w:ind w:firstLine="420"/>
+        <w:spacing w:line="276" w:lineRule="auto" w:after="60"/>
+        <w:jc w:val="both"/>
       </w:pPr>
       <w:r>
         <w:rPr>
@@ -2343,15 +1953,15 @@
         <w:rPr>
           <w:rFonts w:ascii="Times New Roman" w:hAnsi="Times New Roman" w:eastAsia="SimSun"/>
           <w:b/>
-          <w:sz w:val="22"/>
+          <w:sz w:val="20"/>
         </w:rPr>
         <w:t>7.3 Broad MLLM Diagnostic Benchmarks</w:t>
       </w:r>
     </w:p>
     <w:p>
       <w:pPr>
-        <w:spacing w:line="276" w:lineRule="auto"/>
-        <w:ind w:firstLine="420"/>
+        <w:spacing w:line="276" w:lineRule="auto" w:after="60"/>
+        <w:jc w:val="both"/>
       </w:pPr>
       <w:r>
         <w:rPr>
@@ -2370,15 +1980,15 @@
         <w:rPr>
           <w:rFonts w:ascii="Times New Roman" w:hAnsi="Times New Roman" w:eastAsia="SimSun"/>
           <w:b/>
-          <w:sz w:val="22"/>
+          <w:sz w:val="20"/>
         </w:rPr>
         <w:t>7.4 Expert-Domain and Mathematical Reasoning</w:t>
       </w:r>
     </w:p>
     <w:p>
       <w:pPr>
-        <w:spacing w:line="276" w:lineRule="auto"/>
-        <w:ind w:firstLine="420"/>
+        <w:spacing w:line="276" w:lineRule="auto" w:after="60"/>
+        <w:jc w:val="both"/>
       </w:pPr>
       <w:r>
         <w:rPr>
@@ -2397,15 +2007,15 @@
         <w:rPr>
           <w:rFonts w:ascii="Times New Roman" w:hAnsi="Times New Roman" w:eastAsia="SimSun"/>
           <w:b/>
-          <w:sz w:val="22"/>
+          <w:sz w:val="20"/>
         </w:rPr>
         <w:t>7.5 Hallucination Evaluation</w:t>
       </w:r>
     </w:p>
     <w:p>
       <w:pPr>
-        <w:spacing w:line="276" w:lineRule="auto"/>
-        <w:ind w:firstLine="420"/>
+        <w:spacing w:line="276" w:lineRule="auto" w:after="60"/>
+        <w:jc w:val="both"/>
       </w:pPr>
       <w:r>
         <w:rPr>
@@ -2418,8 +2028,8 @@
     </w:p>
     <w:p>
       <w:pPr>
-        <w:spacing w:line="276" w:lineRule="auto"/>
-        <w:ind w:firstLine="420"/>
+        <w:spacing w:line="276" w:lineRule="auto" w:after="60"/>
+        <w:jc w:val="both"/>
       </w:pPr>
       <w:r>
         <w:rPr>
@@ -2438,7 +2048,7 @@
         <w:rPr>
           <w:rFonts w:ascii="Times New Roman" w:hAnsi="Times New Roman"/>
           <w:b/>
-          <w:sz w:val="18"/>
+          <w:sz w:val="16"/>
         </w:rPr>
         <w:t>Table 2. Representative MLLM benchmark taxonomy.</w:t>
       </w:r>
@@ -2450,15 +2060,15 @@
         <w:tblLook w:firstColumn="1" w:firstRow="1" w:lastColumn="0" w:lastRow="0" w:noHBand="0" w:noVBand="1" w:val="04A0"/>
       </w:tblPr>
       <w:tblGrid>
-        <w:gridCol w:w="2075"/>
-        <w:gridCol w:w="2075"/>
-        <w:gridCol w:w="2075"/>
-        <w:gridCol w:w="2075"/>
+        <w:gridCol w:w="1722"/>
+        <w:gridCol w:w="1722"/>
+        <w:gridCol w:w="1722"/>
+        <w:gridCol w:w="1722"/>
       </w:tblGrid>
       <w:tr>
         <w:tc>
           <w:tcPr>
-            <w:tcW w:type="dxa" w:w="2075"/>
+            <w:tcW w:type="dxa" w:w="1722"/>
             <w:shd w:fill="D9EAF7"/>
           </w:tcPr>
           <w:p>
@@ -2467,15 +2077,15 @@
               <w:rPr>
                 <w:rFonts w:ascii="Times New Roman" w:hAnsi="Times New Roman" w:eastAsia="SimSun"/>
                 <w:b/>
-                <w:sz w:val="16"/>
+                <w:sz w:val="12"/>
               </w:rPr>
-              <w:t>benchmark</w:t>
+              <w:t>benchmark group</w:t>
             </w:r>
           </w:p>
         </w:tc>
         <w:tc>
           <w:tcPr>
-            <w:tcW w:type="dxa" w:w="2075"/>
+            <w:tcW w:type="dxa" w:w="1722"/>
             <w:shd w:fill="D9EAF7"/>
           </w:tcPr>
           <w:p>
@@ -2484,15 +2094,15 @@
               <w:rPr>
                 <w:rFonts w:ascii="Times New Roman" w:hAnsi="Times New Roman" w:eastAsia="SimSun"/>
                 <w:b/>
-                <w:sz w:val="16"/>
+                <w:sz w:val="12"/>
               </w:rPr>
-              <w:t>year</w:t>
+              <w:t>examples</w:t>
             </w:r>
           </w:p>
         </w:tc>
         <w:tc>
           <w:tcPr>
-            <w:tcW w:type="dxa" w:w="2075"/>
+            <w:tcW w:type="dxa" w:w="1722"/>
             <w:shd w:fill="D9EAF7"/>
           </w:tcPr>
           <w:p>
@@ -2501,15 +2111,15 @@
               <w:rPr>
                 <w:rFonts w:ascii="Times New Roman" w:hAnsi="Times New Roman" w:eastAsia="SimSun"/>
                 <w:b/>
-                <w:sz w:val="16"/>
+                <w:sz w:val="12"/>
               </w:rPr>
-              <w:t>primary focus</w:t>
+              <w:t>primary capability</w:t>
             </w:r>
           </w:p>
         </w:tc>
         <w:tc>
           <w:tcPr>
-            <w:tcW w:type="dxa" w:w="2075"/>
+            <w:tcW w:type="dxa" w:w="1722"/>
             <w:shd w:fill="D9EAF7"/>
           </w:tcPr>
           <w:p>
@@ -2518,9 +2128,9 @@
               <w:rPr>
                 <w:rFonts w:ascii="Times New Roman" w:hAnsi="Times New Roman" w:eastAsia="SimSun"/>
                 <w:b/>
-                <w:sz w:val="16"/>
+                <w:sz w:val="12"/>
               </w:rPr>
-              <w:t>typical use in mllm evaluation</w:t>
+              <w:t>evaluation risk</w:t>
             </w:r>
           </w:p>
         </w:tc>
@@ -2528,7 +2138,7 @@
       <w:tr>
         <w:tc>
           <w:tcPr>
-            <w:tcW w:type="dxa" w:w="2075"/>
+            <w:tcW w:type="dxa" w:w="1722"/>
           </w:tcPr>
           <w:p>
             <w:r/>
@@ -2536,15 +2146,15 @@
               <w:rPr>
                 <w:rFonts w:ascii="Times New Roman" w:hAnsi="Times New Roman" w:eastAsia="SimSun"/>
                 <w:b w:val="0"/>
-                <w:sz w:val="16"/>
+                <w:sz w:val="12"/>
               </w:rPr>
-              <w:t>VQA</w:t>
+              <w:t>General VQA</w:t>
             </w:r>
           </w:p>
         </w:tc>
         <w:tc>
           <w:tcPr>
-            <w:tcW w:type="dxa" w:w="2075"/>
+            <w:tcW w:type="dxa" w:w="1722"/>
           </w:tcPr>
           <w:p>
             <w:r/>
@@ -2552,15 +2162,15 @@
               <w:rPr>
                 <w:rFonts w:ascii="Times New Roman" w:hAnsi="Times New Roman" w:eastAsia="SimSun"/>
                 <w:b w:val="0"/>
-                <w:sz w:val="16"/>
+                <w:sz w:val="12"/>
               </w:rPr>
-              <w:t>2015</w:t>
+              <w:t>VQA, GQA, OK-VQA</w:t>
             </w:r>
           </w:p>
         </w:tc>
         <w:tc>
           <w:tcPr>
-            <w:tcW w:type="dxa" w:w="2075"/>
+            <w:tcW w:type="dxa" w:w="1722"/>
           </w:tcPr>
           <w:p>
             <w:r/>
@@ -2568,15 +2178,15 @@
               <w:rPr>
                 <w:rFonts w:ascii="Times New Roman" w:hAnsi="Times New Roman" w:eastAsia="SimSun"/>
                 <w:b w:val="0"/>
-                <w:sz w:val="16"/>
+                <w:sz w:val="12"/>
               </w:rPr>
-              <w:t>open-ended visual question answering</w:t>
+              <w:t>image-conditioned question answering</w:t>
             </w:r>
           </w:p>
         </w:tc>
         <w:tc>
           <w:tcPr>
-            <w:tcW w:type="dxa" w:w="2075"/>
+            <w:tcW w:type="dxa" w:w="1722"/>
           </w:tcPr>
           <w:p>
             <w:r/>
@@ -2584,9 +2194,9 @@
               <w:rPr>
                 <w:rFonts w:ascii="Times New Roman" w:hAnsi="Times New Roman" w:eastAsia="SimSun"/>
                 <w:b w:val="0"/>
-                <w:sz w:val="16"/>
+                <w:sz w:val="12"/>
               </w:rPr>
-              <w:t>basic image understanding and language response</w:t>
+              <w:t>language priors and dataset bias</w:t>
             </w:r>
           </w:p>
         </w:tc>
@@ -2594,7 +2204,7 @@
       <w:tr>
         <w:tc>
           <w:tcPr>
-            <w:tcW w:type="dxa" w:w="2075"/>
+            <w:tcW w:type="dxa" w:w="1722"/>
           </w:tcPr>
           <w:p>
             <w:r/>
@@ -2602,15 +2212,15 @@
               <w:rPr>
                 <w:rFonts w:ascii="Times New Roman" w:hAnsi="Times New Roman" w:eastAsia="SimSun"/>
                 <w:b w:val="0"/>
-                <w:sz w:val="16"/>
+                <w:sz w:val="12"/>
               </w:rPr>
-              <w:t>GQA</w:t>
+              <w:t>OCR and chart reasoning</w:t>
             </w:r>
           </w:p>
         </w:tc>
         <w:tc>
           <w:tcPr>
-            <w:tcW w:type="dxa" w:w="2075"/>
+            <w:tcW w:type="dxa" w:w="1722"/>
           </w:tcPr>
           <w:p>
             <w:r/>
@@ -2618,15 +2228,15 @@
               <w:rPr>
                 <w:rFonts w:ascii="Times New Roman" w:hAnsi="Times New Roman" w:eastAsia="SimSun"/>
                 <w:b w:val="0"/>
-                <w:sz w:val="16"/>
+                <w:sz w:val="12"/>
               </w:rPr>
-              <w:t>2019</w:t>
+              <w:t>TextVQA, ChartQA</w:t>
             </w:r>
           </w:p>
         </w:tc>
         <w:tc>
           <w:tcPr>
-            <w:tcW w:type="dxa" w:w="2075"/>
+            <w:tcW w:type="dxa" w:w="1722"/>
           </w:tcPr>
           <w:p>
             <w:r/>
@@ -2634,15 +2244,15 @@
               <w:rPr>
                 <w:rFonts w:ascii="Times New Roman" w:hAnsi="Times New Roman" w:eastAsia="SimSun"/>
                 <w:b w:val="0"/>
-                <w:sz w:val="16"/>
+                <w:sz w:val="12"/>
               </w:rPr>
-              <w:t>compositional visual reasoning</w:t>
+              <w:t>reading scene text and structured graphics</w:t>
             </w:r>
           </w:p>
         </w:tc>
         <w:tc>
           <w:tcPr>
-            <w:tcW w:type="dxa" w:w="2075"/>
+            <w:tcW w:type="dxa" w:w="1722"/>
           </w:tcPr>
           <w:p>
             <w:r/>
@@ -2650,9 +2260,9 @@
               <w:rPr>
                 <w:rFonts w:ascii="Times New Roman" w:hAnsi="Times New Roman" w:eastAsia="SimSun"/>
                 <w:b w:val="0"/>
-                <w:sz w:val="16"/>
+                <w:sz w:val="12"/>
               </w:rPr>
-              <w:t>scene-graph grounded reasoning analysis</w:t>
+              <w:t>small text, chart parsing, and answer normalization</w:t>
             </w:r>
           </w:p>
         </w:tc>
@@ -2660,7 +2270,7 @@
       <w:tr>
         <w:tc>
           <w:tcPr>
-            <w:tcW w:type="dxa" w:w="2075"/>
+            <w:tcW w:type="dxa" w:w="1722"/>
           </w:tcPr>
           <w:p>
             <w:r/>
@@ -2668,15 +2278,15 @@
               <w:rPr>
                 <w:rFonts w:ascii="Times New Roman" w:hAnsi="Times New Roman" w:eastAsia="SimSun"/>
                 <w:b w:val="0"/>
-                <w:sz w:val="16"/>
+                <w:sz w:val="12"/>
               </w:rPr>
-              <w:t>OK-VQA</w:t>
+              <w:t>Science and mathematics</w:t>
             </w:r>
           </w:p>
         </w:tc>
         <w:tc>
           <w:tcPr>
-            <w:tcW w:type="dxa" w:w="2075"/>
+            <w:tcW w:type="dxa" w:w="1722"/>
           </w:tcPr>
           <w:p>
             <w:r/>
@@ -2684,15 +2294,15 @@
               <w:rPr>
                 <w:rFonts w:ascii="Times New Roman" w:hAnsi="Times New Roman" w:eastAsia="SimSun"/>
                 <w:b w:val="0"/>
-                <w:sz w:val="16"/>
+                <w:sz w:val="12"/>
               </w:rPr>
-              <w:t>2019</w:t>
+              <w:t>ScienceQA, MathVista</w:t>
             </w:r>
           </w:p>
         </w:tc>
         <w:tc>
           <w:tcPr>
-            <w:tcW w:type="dxa" w:w="2075"/>
+            <w:tcW w:type="dxa" w:w="1722"/>
           </w:tcPr>
           <w:p>
             <w:r/>
@@ -2700,15 +2310,15 @@
               <w:rPr>
                 <w:rFonts w:ascii="Times New Roman" w:hAnsi="Times New Roman" w:eastAsia="SimSun"/>
                 <w:b w:val="0"/>
-                <w:sz w:val="16"/>
+                <w:sz w:val="12"/>
               </w:rPr>
-              <w:t>knowledge-based visual question answering</w:t>
+              <w:t>diagram-grounded and visual mathematical reasoning</w:t>
             </w:r>
           </w:p>
         </w:tc>
         <w:tc>
           <w:tcPr>
-            <w:tcW w:type="dxa" w:w="2075"/>
+            <w:tcW w:type="dxa" w:w="1722"/>
           </w:tcPr>
           <w:p>
             <w:r/>
@@ -2716,9 +2326,9 @@
               <w:rPr>
                 <w:rFonts w:ascii="Times New Roman" w:hAnsi="Times New Roman" w:eastAsia="SimSun"/>
                 <w:b w:val="0"/>
-                <w:sz w:val="16"/>
+                <w:sz w:val="12"/>
               </w:rPr>
-              <w:t>external commonsense and world-knowledge evaluation</w:t>
+              <w:t>fluent but unsupported reasoning</w:t>
             </w:r>
           </w:p>
         </w:tc>
@@ -2726,7 +2336,7 @@
       <w:tr>
         <w:tc>
           <w:tcPr>
-            <w:tcW w:type="dxa" w:w="2075"/>
+            <w:tcW w:type="dxa" w:w="1722"/>
           </w:tcPr>
           <w:p>
             <w:r/>
@@ -2734,15 +2344,15 @@
               <w:rPr>
                 <w:rFonts w:ascii="Times New Roman" w:hAnsi="Times New Roman" w:eastAsia="SimSun"/>
                 <w:b w:val="0"/>
-                <w:sz w:val="16"/>
+                <w:sz w:val="12"/>
               </w:rPr>
-              <w:t>ScienceQA</w:t>
+              <w:t>Broad diagnostics</w:t>
             </w:r>
           </w:p>
         </w:tc>
         <w:tc>
           <w:tcPr>
-            <w:tcW w:type="dxa" w:w="2075"/>
+            <w:tcW w:type="dxa" w:w="1722"/>
           </w:tcPr>
           <w:p>
             <w:r/>
@@ -2750,15 +2360,15 @@
               <w:rPr>
                 <w:rFonts w:ascii="Times New Roman" w:hAnsi="Times New Roman" w:eastAsia="SimSun"/>
                 <w:b w:val="0"/>
-                <w:sz w:val="16"/>
+                <w:sz w:val="12"/>
               </w:rPr>
-              <w:t>2022</w:t>
+              <w:t>MME, MMBench, MM-Vet</w:t>
             </w:r>
           </w:p>
         </w:tc>
         <w:tc>
           <w:tcPr>
-            <w:tcW w:type="dxa" w:w="2075"/>
+            <w:tcW w:type="dxa" w:w="1722"/>
           </w:tcPr>
           <w:p>
             <w:r/>
@@ -2766,15 +2376,15 @@
               <w:rPr>
                 <w:rFonts w:ascii="Times New Roman" w:hAnsi="Times New Roman" w:eastAsia="SimSun"/>
                 <w:b w:val="0"/>
-                <w:sz w:val="16"/>
+                <w:sz w:val="12"/>
               </w:rPr>
-              <w:t>multimodal science question answering</w:t>
+              <w:t>perception, cognition, and integrated skills</w:t>
             </w:r>
           </w:p>
         </w:tc>
         <w:tc>
           <w:tcPr>
-            <w:tcW w:type="dxa" w:w="2075"/>
+            <w:tcW w:type="dxa" w:w="1722"/>
           </w:tcPr>
           <w:p>
             <w:r/>
@@ -2782,9 +2392,9 @@
               <w:rPr>
                 <w:rFonts w:ascii="Times New Roman" w:hAnsi="Times New Roman" w:eastAsia="SimSun"/>
                 <w:b w:val="0"/>
-                <w:sz w:val="16"/>
+                <w:sz w:val="12"/>
               </w:rPr>
-              <w:t>educational reasoning with diagrams and explanations</w:t>
+              <w:t>prompt sensitivity and scoring differences</w:t>
             </w:r>
           </w:p>
         </w:tc>
@@ -2792,7 +2402,7 @@
       <w:tr>
         <w:tc>
           <w:tcPr>
-            <w:tcW w:type="dxa" w:w="2075"/>
+            <w:tcW w:type="dxa" w:w="1722"/>
           </w:tcPr>
           <w:p>
             <w:r/>
@@ -2800,15 +2410,15 @@
               <w:rPr>
                 <w:rFonts w:ascii="Times New Roman" w:hAnsi="Times New Roman" w:eastAsia="SimSun"/>
                 <w:b w:val="0"/>
-                <w:sz w:val="16"/>
+                <w:sz w:val="12"/>
               </w:rPr>
-              <w:t>MME</w:t>
+              <w:t>Hallucination checks</w:t>
             </w:r>
           </w:p>
         </w:tc>
         <w:tc>
           <w:tcPr>
-            <w:tcW w:type="dxa" w:w="2075"/>
+            <w:tcW w:type="dxa" w:w="1722"/>
           </w:tcPr>
           <w:p>
             <w:r/>
@@ -2816,15 +2426,15 @@
               <w:rPr>
                 <w:rFonts w:ascii="Times New Roman" w:hAnsi="Times New Roman" w:eastAsia="SimSun"/>
                 <w:b w:val="0"/>
-                <w:sz w:val="16"/>
+                <w:sz w:val="12"/>
               </w:rPr>
-              <w:t>2023</w:t>
+              <w:t>POPE</w:t>
             </w:r>
           </w:p>
         </w:tc>
         <w:tc>
           <w:tcPr>
-            <w:tcW w:type="dxa" w:w="2075"/>
+            <w:tcW w:type="dxa" w:w="1722"/>
           </w:tcPr>
           <w:p>
             <w:r/>
@@ -2832,15 +2442,15 @@
               <w:rPr>
                 <w:rFonts w:ascii="Times New Roman" w:hAnsi="Times New Roman" w:eastAsia="SimSun"/>
                 <w:b w:val="0"/>
-                <w:sz w:val="16"/>
+                <w:sz w:val="12"/>
               </w:rPr>
-              <w:t>perception and cognition probes</w:t>
+              <w:t>detecting unsupported object claims</w:t>
             </w:r>
           </w:p>
         </w:tc>
         <w:tc>
           <w:tcPr>
-            <w:tcW w:type="dxa" w:w="2075"/>
+            <w:tcW w:type="dxa" w:w="1722"/>
           </w:tcPr>
           <w:p>
             <w:r/>
@@ -2848,9 +2458,9 @@
               <w:rPr>
                 <w:rFonts w:ascii="Times New Roman" w:hAnsi="Times New Roman" w:eastAsia="SimSun"/>
                 <w:b w:val="0"/>
-                <w:sz w:val="16"/>
+                <w:sz w:val="12"/>
               </w:rPr>
-              <w:t>broad diagnostic evaluation for MLLMs</w:t>
+              <w:t>coverage beyond object presence remains limited</w:t>
             </w:r>
           </w:p>
         </w:tc>
@@ -2858,7 +2468,7 @@
       <w:tr>
         <w:tc>
           <w:tcPr>
-            <w:tcW w:type="dxa" w:w="2075"/>
+            <w:tcW w:type="dxa" w:w="1722"/>
           </w:tcPr>
           <w:p>
             <w:r/>
@@ -2866,15 +2476,15 @@
               <w:rPr>
                 <w:rFonts w:ascii="Times New Roman" w:hAnsi="Times New Roman" w:eastAsia="SimSun"/>
                 <w:b w:val="0"/>
-                <w:sz w:val="16"/>
+                <w:sz w:val="12"/>
               </w:rPr>
-              <w:t>MMBench</w:t>
+              <w:t>Expert-domain reasoning</w:t>
             </w:r>
           </w:p>
         </w:tc>
         <w:tc>
           <w:tcPr>
-            <w:tcW w:type="dxa" w:w="2075"/>
+            <w:tcW w:type="dxa" w:w="1722"/>
           </w:tcPr>
           <w:p>
             <w:r/>
@@ -2882,15 +2492,15 @@
               <w:rPr>
                 <w:rFonts w:ascii="Times New Roman" w:hAnsi="Times New Roman" w:eastAsia="SimSun"/>
                 <w:b w:val="0"/>
-                <w:sz w:val="16"/>
+                <w:sz w:val="12"/>
               </w:rPr>
-              <w:t>2023</w:t>
+              <w:t>MMMU</w:t>
             </w:r>
           </w:p>
         </w:tc>
         <w:tc>
           <w:tcPr>
-            <w:tcW w:type="dxa" w:w="2075"/>
+            <w:tcW w:type="dxa" w:w="1722"/>
           </w:tcPr>
           <w:p>
             <w:r/>
@@ -2898,15 +2508,15 @@
               <w:rPr>
                 <w:rFonts w:ascii="Times New Roman" w:hAnsi="Times New Roman" w:eastAsia="SimSun"/>
                 <w:b w:val="0"/>
-                <w:sz w:val="16"/>
+                <w:sz w:val="12"/>
               </w:rPr>
-              <w:t>systematic multimodal ability evaluation</w:t>
+              <w:t>college-level multidisciplinary multimodal reasoning</w:t>
             </w:r>
           </w:p>
         </w:tc>
         <w:tc>
           <w:tcPr>
-            <w:tcW w:type="dxa" w:w="2075"/>
+            <w:tcW w:type="dxa" w:w="1722"/>
           </w:tcPr>
           <w:p>
             <w:r/>
@@ -2914,273 +2524,9 @@
               <w:rPr>
                 <w:rFonts w:ascii="Times New Roman" w:hAnsi="Times New Roman" w:eastAsia="SimSun"/>
                 <w:b w:val="0"/>
-                <w:sz w:val="16"/>
+                <w:sz w:val="12"/>
               </w:rPr>
-              <w:t>robust multiple-choice evaluation across ability dimensions</w:t>
-            </w:r>
-          </w:p>
-        </w:tc>
-      </w:tr>
-      <w:tr>
-        <w:tc>
-          <w:tcPr>
-            <w:tcW w:type="dxa" w:w="2075"/>
-          </w:tcPr>
-          <w:p>
-            <w:r/>
-            <w:r>
-              <w:rPr>
-                <w:rFonts w:ascii="Times New Roman" w:hAnsi="Times New Roman" w:eastAsia="SimSun"/>
-                <w:b w:val="0"/>
-                <w:sz w:val="16"/>
-              </w:rPr>
-              <w:t>MM-Vet</w:t>
-            </w:r>
-          </w:p>
-        </w:tc>
-        <w:tc>
-          <w:tcPr>
-            <w:tcW w:type="dxa" w:w="2075"/>
-          </w:tcPr>
-          <w:p>
-            <w:r/>
-            <w:r>
-              <w:rPr>
-                <w:rFonts w:ascii="Times New Roman" w:hAnsi="Times New Roman" w:eastAsia="SimSun"/>
-                <w:b w:val="0"/>
-                <w:sz w:val="16"/>
-              </w:rPr>
-              <w:t>2023</w:t>
-            </w:r>
-          </w:p>
-        </w:tc>
-        <w:tc>
-          <w:tcPr>
-            <w:tcW w:type="dxa" w:w="2075"/>
-          </w:tcPr>
-          <w:p>
-            <w:r/>
-            <w:r>
-              <w:rPr>
-                <w:rFonts w:ascii="Times New Roman" w:hAnsi="Times New Roman" w:eastAsia="SimSun"/>
-                <w:b w:val="0"/>
-                <w:sz w:val="16"/>
-              </w:rPr>
-              <w:t>integrated multimodal capability evaluation</w:t>
-            </w:r>
-          </w:p>
-        </w:tc>
-        <w:tc>
-          <w:tcPr>
-            <w:tcW w:type="dxa" w:w="2075"/>
-          </w:tcPr>
-          <w:p>
-            <w:r/>
-            <w:r>
-              <w:rPr>
-                <w:rFonts w:ascii="Times New Roman" w:hAnsi="Times New Roman" w:eastAsia="SimSun"/>
-                <w:b w:val="0"/>
-                <w:sz w:val="16"/>
-              </w:rPr>
-              <w:t>measures combined recognition knowledge reasoning and generation</w:t>
-            </w:r>
-          </w:p>
-        </w:tc>
-      </w:tr>
-      <w:tr>
-        <w:tc>
-          <w:tcPr>
-            <w:tcW w:type="dxa" w:w="2075"/>
-          </w:tcPr>
-          <w:p>
-            <w:r/>
-            <w:r>
-              <w:rPr>
-                <w:rFonts w:ascii="Times New Roman" w:hAnsi="Times New Roman" w:eastAsia="SimSun"/>
-                <w:b w:val="0"/>
-                <w:sz w:val="16"/>
-              </w:rPr>
-              <w:t>POPE</w:t>
-            </w:r>
-          </w:p>
-        </w:tc>
-        <w:tc>
-          <w:tcPr>
-            <w:tcW w:type="dxa" w:w="2075"/>
-          </w:tcPr>
-          <w:p>
-            <w:r/>
-            <w:r>
-              <w:rPr>
-                <w:rFonts w:ascii="Times New Roman" w:hAnsi="Times New Roman" w:eastAsia="SimSun"/>
-                <w:b w:val="0"/>
-                <w:sz w:val="16"/>
-              </w:rPr>
-              <w:t>2023</w:t>
-            </w:r>
-          </w:p>
-        </w:tc>
-        <w:tc>
-          <w:tcPr>
-            <w:tcW w:type="dxa" w:w="2075"/>
-          </w:tcPr>
-          <w:p>
-            <w:r/>
-            <w:r>
-              <w:rPr>
-                <w:rFonts w:ascii="Times New Roman" w:hAnsi="Times New Roman" w:eastAsia="SimSun"/>
-                <w:b w:val="0"/>
-                <w:sz w:val="16"/>
-              </w:rPr>
-              <w:t>object hallucination evaluation</w:t>
-            </w:r>
-          </w:p>
-        </w:tc>
-        <w:tc>
-          <w:tcPr>
-            <w:tcW w:type="dxa" w:w="2075"/>
-          </w:tcPr>
-          <w:p>
-            <w:r/>
-            <w:r>
-              <w:rPr>
-                <w:rFonts w:ascii="Times New Roman" w:hAnsi="Times New Roman" w:eastAsia="SimSun"/>
-                <w:b w:val="0"/>
-                <w:sz w:val="16"/>
-              </w:rPr>
-              <w:t>checks whether models hallucinate absent objects</w:t>
-            </w:r>
-          </w:p>
-        </w:tc>
-      </w:tr>
-      <w:tr>
-        <w:tc>
-          <w:tcPr>
-            <w:tcW w:type="dxa" w:w="2075"/>
-          </w:tcPr>
-          <w:p>
-            <w:r/>
-            <w:r>
-              <w:rPr>
-                <w:rFonts w:ascii="Times New Roman" w:hAnsi="Times New Roman" w:eastAsia="SimSun"/>
-                <w:b w:val="0"/>
-                <w:sz w:val="16"/>
-              </w:rPr>
-              <w:t>MMMU</w:t>
-            </w:r>
-          </w:p>
-        </w:tc>
-        <w:tc>
-          <w:tcPr>
-            <w:tcW w:type="dxa" w:w="2075"/>
-          </w:tcPr>
-          <w:p>
-            <w:r/>
-            <w:r>
-              <w:rPr>
-                <w:rFonts w:ascii="Times New Roman" w:hAnsi="Times New Roman" w:eastAsia="SimSun"/>
-                <w:b w:val="0"/>
-                <w:sz w:val="16"/>
-              </w:rPr>
-              <w:t>2023</w:t>
-            </w:r>
-          </w:p>
-        </w:tc>
-        <w:tc>
-          <w:tcPr>
-            <w:tcW w:type="dxa" w:w="2075"/>
-          </w:tcPr>
-          <w:p>
-            <w:r/>
-            <w:r>
-              <w:rPr>
-                <w:rFonts w:ascii="Times New Roman" w:hAnsi="Times New Roman" w:eastAsia="SimSun"/>
-                <w:b w:val="0"/>
-                <w:sz w:val="16"/>
-              </w:rPr>
-              <w:t>expert-level multimodal multidisciplinary understanding</w:t>
-            </w:r>
-          </w:p>
-        </w:tc>
-        <w:tc>
-          <w:tcPr>
-            <w:tcW w:type="dxa" w:w="2075"/>
-          </w:tcPr>
-          <w:p>
-            <w:r/>
-            <w:r>
-              <w:rPr>
-                <w:rFonts w:ascii="Times New Roman" w:hAnsi="Times New Roman" w:eastAsia="SimSun"/>
-                <w:b w:val="0"/>
-                <w:sz w:val="16"/>
-              </w:rPr>
-              <w:t>tests college-level subject reasoning with images</w:t>
-            </w:r>
-          </w:p>
-        </w:tc>
-      </w:tr>
-      <w:tr>
-        <w:tc>
-          <w:tcPr>
-            <w:tcW w:type="dxa" w:w="2075"/>
-          </w:tcPr>
-          <w:p>
-            <w:r/>
-            <w:r>
-              <w:rPr>
-                <w:rFonts w:ascii="Times New Roman" w:hAnsi="Times New Roman" w:eastAsia="SimSun"/>
-                <w:b w:val="0"/>
-                <w:sz w:val="16"/>
-              </w:rPr>
-              <w:t>MathVista</w:t>
-            </w:r>
-          </w:p>
-        </w:tc>
-        <w:tc>
-          <w:tcPr>
-            <w:tcW w:type="dxa" w:w="2075"/>
-          </w:tcPr>
-          <w:p>
-            <w:r/>
-            <w:r>
-              <w:rPr>
-                <w:rFonts w:ascii="Times New Roman" w:hAnsi="Times New Roman" w:eastAsia="SimSun"/>
-                <w:b w:val="0"/>
-                <w:sz w:val="16"/>
-              </w:rPr>
-              <w:t>2023</w:t>
-            </w:r>
-          </w:p>
-        </w:tc>
-        <w:tc>
-          <w:tcPr>
-            <w:tcW w:type="dxa" w:w="2075"/>
-          </w:tcPr>
-          <w:p>
-            <w:r/>
-            <w:r>
-              <w:rPr>
-                <w:rFonts w:ascii="Times New Roman" w:hAnsi="Times New Roman" w:eastAsia="SimSun"/>
-                <w:b w:val="0"/>
-                <w:sz w:val="16"/>
-              </w:rPr>
-              <w:t>visual mathematical reasoning</w:t>
-            </w:r>
-          </w:p>
-        </w:tc>
-        <w:tc>
-          <w:tcPr>
-            <w:tcW w:type="dxa" w:w="2075"/>
-          </w:tcPr>
-          <w:p>
-            <w:r/>
-            <w:r>
-              <w:rPr>
-                <w:rFonts w:ascii="Times New Roman" w:hAnsi="Times New Roman" w:eastAsia="SimSun"/>
-                <w:b w:val="0"/>
-                <w:sz w:val="16"/>
-              </w:rPr>
-              <w:t>evaluates math reasoning grounded in visual context</w:t>
+              <w:t>contamination and domain coverage</w:t>
             </w:r>
           </w:p>
         </w:tc>
@@ -3188,21 +2534,73 @@
     </w:tbl>
     <w:p>
       <w:pPr>
-        <w:spacing w:before="160" w:after="80"/>
+        <w:jc w:val="center"/>
+      </w:pPr>
+      <w:r>
+        <w:drawing>
+          <wp:inline xmlns:a="http://schemas.openxmlformats.org/drawingml/2006/main" xmlns:pic="http://schemas.openxmlformats.org/drawingml/2006/picture">
+            <wp:extent cx="4248000" cy="2055484"/>
+            <wp:docPr id="2" name="Picture 2"/>
+            <wp:cNvGraphicFramePr>
+              <a:graphicFrameLocks noChangeAspect="1"/>
+            </wp:cNvGraphicFramePr>
+            <a:graphic>
+              <a:graphicData uri="http://schemas.openxmlformats.org/drawingml/2006/picture">
+                <pic:pic>
+                  <pic:nvPicPr>
+                    <pic:cNvPr id="0" name="benchmark_timeline.png"/>
+                    <pic:cNvPicPr/>
+                  </pic:nvPicPr>
+                  <pic:blipFill>
+                    <a:blip r:embed="rId11"/>
+                    <a:stretch>
+                      <a:fillRect/>
+                    </a:stretch>
+                  </pic:blipFill>
+                  <pic:spPr>
+                    <a:xfrm>
+                      <a:off x="0" y="0"/>
+                      <a:ext cx="4248000" cy="2055484"/>
+                    </a:xfrm>
+                    <a:prstGeom prst="rect"/>
+                  </pic:spPr>
+                </pic:pic>
+              </a:graphicData>
+            </a:graphic>
+          </wp:inline>
+        </w:drawing>
+      </w:r>
+    </w:p>
+    <w:p>
+      <w:pPr>
+        <w:jc w:val="center"/>
       </w:pPr>
       <w:r>
         <w:rPr>
           <w:rFonts w:ascii="Times New Roman" w:hAnsi="Times New Roman" w:eastAsia="SimSun"/>
           <w:b/>
-          <w:sz w:val="22"/>
+          <w:sz w:val="16"/>
+        </w:rPr>
+        <w:t>Figure 2. Timeline distribution of representative MLLM benchmarks.</w:t>
+      </w:r>
+    </w:p>
+    <w:p>
+      <w:pPr>
+        <w:spacing w:before="160" w:after="80"/>
+      </w:pPr>
+      <w:r>
+        <w:rPr>
+          <w:rFonts w:ascii="Times New Roman" w:hAnsi="Times New Roman" w:eastAsia="SimSun"/>
+          <w:b/>
+          <w:sz w:val="20"/>
         </w:rPr>
         <w:t>7.6 Comparative Analysis Without Fabricated Scores</w:t>
       </w:r>
     </w:p>
     <w:p>
       <w:pPr>
-        <w:spacing w:line="276" w:lineRule="auto"/>
-        <w:ind w:firstLine="420"/>
+        <w:spacing w:line="276" w:lineRule="auto" w:after="60"/>
+        <w:jc w:val="both"/>
       </w:pPr>
       <w:r>
         <w:rPr>
@@ -3215,8 +2613,8 @@
     </w:p>
     <w:p>
       <w:pPr>
-        <w:spacing w:line="276" w:lineRule="auto"/>
-        <w:ind w:firstLine="420"/>
+        <w:spacing w:line="276" w:lineRule="auto" w:after="60"/>
+        <w:jc w:val="both"/>
       </w:pPr>
       <w:r>
         <w:rPr>
@@ -3224,7 +2622,7 @@
           <w:b w:val="0"/>
           <w:sz w:val="20"/>
         </w:rPr>
-        <w:t>Qualitatively, the literature supports several defensible comparisons. Contrastive models such as CLIP are strong representation learners but are not full conversational MLLMs [3]. Flamingo and BLIP-2 demonstrate that frozen components and learned connectors can produce strong multimodal generation and few-shot adaptation [5] [6]. LLaVA and InstructBLIP show that instruction tuning is essential for assistant-like behavior [8] [9]. Qwen-VL, InternVL, and CogVLM represent later efforts to expand grounding, scale, and visual expertise [11] [24] [7]. Closed systems such as GPT-4V remain important external references but cannot be fully reproduced from public information [12].</w:t>
+        <w:t>Qualitatively, the literature supports several defensible comparisons. Contrastive models such as CLIP are strong representation learners but are not full conversational MLLMs [3]. Flamingo and BLIP-2 demonstrate that frozen components and learned connectors can produce strong multimodal generation and few-shot adaptation [5] [6]. LLaVA and InstructBLIP show that instruction tuning is essential for assistant-like behavior [8] [9]. Qwen-VL, InternVL, and CogVLM represent later efforts to expand grounding, scale, and visual expertise [11] [40] [7]. Closed systems such as GPT-4V remain important external references but cannot be fully reproduced from public information [12].</w:t>
       </w:r>
     </w:p>
     <w:p>
@@ -3235,15 +2633,15 @@
         <w:rPr>
           <w:rFonts w:ascii="Times New Roman" w:hAnsi="Times New Roman" w:eastAsia="SimSun"/>
           <w:b/>
-          <w:sz w:val="22"/>
+          <w:sz w:val="20"/>
         </w:rPr>
         <w:t>7.7 Benchmark Design Risks</w:t>
       </w:r>
     </w:p>
     <w:p>
       <w:pPr>
-        <w:spacing w:line="276" w:lineRule="auto"/>
-        <w:ind w:firstLine="420"/>
+        <w:spacing w:line="276" w:lineRule="auto" w:after="60"/>
+        <w:jc w:val="both"/>
       </w:pPr>
       <w:r>
         <w:rPr>
@@ -3256,8 +2654,8 @@
     </w:p>
     <w:p>
       <w:pPr>
-        <w:spacing w:line="276" w:lineRule="auto"/>
-        <w:ind w:firstLine="420"/>
+        <w:spacing w:line="276" w:lineRule="auto" w:after="60"/>
+        <w:jc w:val="both"/>
       </w:pPr>
       <w:r>
         <w:rPr>
@@ -3270,8 +2668,8 @@
     </w:p>
     <w:p>
       <w:pPr>
-        <w:spacing w:line="276" w:lineRule="auto"/>
-        <w:ind w:firstLine="420"/>
+        <w:spacing w:line="276" w:lineRule="auto" w:after="60"/>
+        <w:jc w:val="both"/>
       </w:pPr>
       <w:r>
         <w:rPr>
@@ -3284,8 +2682,8 @@
     </w:p>
     <w:p>
       <w:pPr>
-        <w:spacing w:line="276" w:lineRule="auto"/>
-        <w:ind w:firstLine="420"/>
+        <w:spacing w:line="276" w:lineRule="auto" w:after="60"/>
+        <w:jc w:val="both"/>
       </w:pPr>
       <w:r>
         <w:rPr>
@@ -3304,15 +2702,15 @@
         <w:rPr>
           <w:rFonts w:ascii="Times New Roman" w:hAnsi="Times New Roman" w:eastAsia="SimSun"/>
           <w:b/>
-          <w:sz w:val="22"/>
+          <w:sz w:val="20"/>
         </w:rPr>
         <w:t>7.8 Error Taxonomy for MLLMs</w:t>
       </w:r>
     </w:p>
     <w:p>
       <w:pPr>
-        <w:spacing w:line="276" w:lineRule="auto"/>
-        <w:ind w:firstLine="420"/>
+        <w:spacing w:line="276" w:lineRule="auto" w:after="60"/>
+        <w:jc w:val="both"/>
       </w:pPr>
       <w:r>
         <w:rPr>
@@ -3325,8 +2723,8 @@
     </w:p>
     <w:p>
       <w:pPr>
-        <w:spacing w:line="276" w:lineRule="auto"/>
-        <w:ind w:firstLine="420"/>
+        <w:spacing w:line="276" w:lineRule="auto" w:after="60"/>
+        <w:jc w:val="both"/>
       </w:pPr>
       <w:r>
         <w:rPr>
@@ -3339,8 +2737,8 @@
     </w:p>
     <w:p>
       <w:pPr>
-        <w:spacing w:line="276" w:lineRule="auto"/>
-        <w:ind w:firstLine="420"/>
+        <w:spacing w:line="276" w:lineRule="auto" w:after="60"/>
+        <w:jc w:val="both"/>
       </w:pPr>
       <w:r>
         <w:rPr>
@@ -3359,15 +2757,15 @@
         <w:rPr>
           <w:rFonts w:ascii="Times New Roman" w:hAnsi="Times New Roman" w:eastAsia="SimSun"/>
           <w:b/>
-          <w:sz w:val="22"/>
+          <w:sz w:val="20"/>
         </w:rPr>
         <w:t>7.9 Reproducible Evaluation Protocol</w:t>
       </w:r>
     </w:p>
     <w:p>
       <w:pPr>
-        <w:spacing w:line="276" w:lineRule="auto"/>
-        <w:ind w:firstLine="420"/>
+        <w:spacing w:line="276" w:lineRule="auto" w:after="60"/>
+        <w:jc w:val="both"/>
       </w:pPr>
       <w:r>
         <w:rPr>
@@ -3380,8 +2778,8 @@
     </w:p>
     <w:p>
       <w:pPr>
-        <w:spacing w:line="276" w:lineRule="auto"/>
-        <w:ind w:firstLine="420"/>
+        <w:spacing w:line="276" w:lineRule="auto" w:after="60"/>
+        <w:jc w:val="both"/>
       </w:pPr>
       <w:r>
         <w:rPr>
@@ -3400,7 +2798,7 @@
         <w:rPr>
           <w:rFonts w:ascii="Times New Roman" w:hAnsi="Times New Roman" w:eastAsia="SimSun"/>
           <w:b/>
-          <w:sz w:val="26"/>
+          <w:sz w:val="24"/>
         </w:rPr>
         <w:t>8. Reproducibility Framework</w:t>
       </w:r>
@@ -3413,15 +2811,15 @@
         <w:rPr>
           <w:rFonts w:ascii="Times New Roman" w:hAnsi="Times New Roman" w:eastAsia="SimSun"/>
           <w:b/>
-          <w:sz w:val="22"/>
+          <w:sz w:val="20"/>
         </w:rPr>
         <w:t>8.1 What Reproducibility Means for a Survey</w:t>
       </w:r>
     </w:p>
     <w:p>
       <w:pPr>
-        <w:spacing w:line="276" w:lineRule="auto"/>
-        <w:ind w:firstLine="420"/>
+        <w:spacing w:line="276" w:lineRule="auto" w:after="60"/>
+        <w:jc w:val="both"/>
       </w:pPr>
       <w:r>
         <w:rPr>
@@ -3434,8 +2832,8 @@
     </w:p>
     <w:p>
       <w:pPr>
-        <w:spacing w:line="276" w:lineRule="auto"/>
-        <w:ind w:firstLine="420"/>
+        <w:spacing w:line="276" w:lineRule="auto" w:after="60"/>
+        <w:jc w:val="both"/>
       </w:pPr>
       <w:r>
         <w:rPr>
@@ -3454,15 +2852,15 @@
         <w:rPr>
           <w:rFonts w:ascii="Times New Roman" w:hAnsi="Times New Roman" w:eastAsia="SimSun"/>
           <w:b/>
-          <w:sz w:val="22"/>
+          <w:sz w:val="20"/>
         </w:rPr>
         <w:t>8.2 What Would Be Required for Original Experiments</w:t>
       </w:r>
     </w:p>
     <w:p>
       <w:pPr>
-        <w:spacing w:line="276" w:lineRule="auto"/>
-        <w:ind w:firstLine="420"/>
+        <w:spacing w:line="276" w:lineRule="auto" w:after="60"/>
+        <w:jc w:val="both"/>
       </w:pPr>
       <w:r>
         <w:rPr>
@@ -3475,8 +2873,8 @@
     </w:p>
     <w:p>
       <w:pPr>
-        <w:spacing w:line="276" w:lineRule="auto"/>
-        <w:ind w:firstLine="420"/>
+        <w:spacing w:line="276" w:lineRule="auto" w:after="60"/>
+        <w:jc w:val="both"/>
       </w:pPr>
       <w:r>
         <w:rPr>
@@ -3495,15 +2893,15 @@
         <w:rPr>
           <w:rFonts w:ascii="Times New Roman" w:hAnsi="Times New Roman" w:eastAsia="SimSun"/>
           <w:b/>
-          <w:sz w:val="22"/>
+          <w:sz w:val="20"/>
         </w:rPr>
         <w:t>8.3 Data and License Responsibility</w:t>
       </w:r>
     </w:p>
     <w:p>
       <w:pPr>
-        <w:spacing w:line="276" w:lineRule="auto"/>
-        <w:ind w:firstLine="420"/>
+        <w:spacing w:line="276" w:lineRule="auto" w:after="60"/>
+        <w:jc w:val="both"/>
       </w:pPr>
       <w:r>
         <w:rPr>
@@ -3516,8 +2914,8 @@
     </w:p>
     <w:p>
       <w:pPr>
-        <w:spacing w:line="276" w:lineRule="auto"/>
-        <w:ind w:firstLine="420"/>
+        <w:spacing w:line="276" w:lineRule="auto" w:after="60"/>
+        <w:jc w:val="both"/>
       </w:pPr>
       <w:r>
         <w:rPr>
@@ -3536,15 +2934,15 @@
         <w:rPr>
           <w:rFonts w:ascii="Times New Roman" w:hAnsi="Times New Roman" w:eastAsia="SimSun"/>
           <w:b/>
-          <w:sz w:val="22"/>
+          <w:sz w:val="20"/>
         </w:rPr>
         <w:t>8.4 Public Repository Status</w:t>
       </w:r>
     </w:p>
     <w:p>
       <w:pPr>
-        <w:spacing w:line="276" w:lineRule="auto"/>
-        <w:ind w:firstLine="420"/>
+        <w:spacing w:line="276" w:lineRule="auto" w:after="60"/>
+        <w:jc w:val="both"/>
       </w:pPr>
       <w:r>
         <w:rPr>
@@ -3563,7 +2961,7 @@
         <w:rPr>
           <w:rFonts w:ascii="Times New Roman" w:hAnsi="Times New Roman" w:eastAsia="SimSun"/>
           <w:b/>
-          <w:sz w:val="26"/>
+          <w:sz w:val="24"/>
         </w:rPr>
         <w:t>9. Ethical, Safety, and Deployment Considerations</w:t>
       </w:r>
@@ -3576,15 +2974,15 @@
         <w:rPr>
           <w:rFonts w:ascii="Times New Roman" w:hAnsi="Times New Roman" w:eastAsia="SimSun"/>
           <w:b/>
-          <w:sz w:val="22"/>
+          <w:sz w:val="20"/>
         </w:rPr>
         <w:t>9.1 Visual Privacy and Sensitive Inference</w:t>
       </w:r>
     </w:p>
     <w:p>
       <w:pPr>
-        <w:spacing w:line="276" w:lineRule="auto"/>
-        <w:ind w:firstLine="420"/>
+        <w:spacing w:line="276" w:lineRule="auto" w:after="60"/>
+        <w:jc w:val="both"/>
       </w:pPr>
       <w:r>
         <w:rPr>
@@ -3597,8 +2995,8 @@
     </w:p>
     <w:p>
       <w:pPr>
-        <w:spacing w:line="276" w:lineRule="auto"/>
-        <w:ind w:firstLine="420"/>
+        <w:spacing w:line="276" w:lineRule="auto" w:after="60"/>
+        <w:jc w:val="both"/>
       </w:pPr>
       <w:r>
         <w:rPr>
@@ -3617,15 +3015,15 @@
         <w:rPr>
           <w:rFonts w:ascii="Times New Roman" w:hAnsi="Times New Roman" w:eastAsia="SimSun"/>
           <w:b/>
-          <w:sz w:val="22"/>
+          <w:sz w:val="20"/>
         </w:rPr>
         <w:t>9.2 Reliability in High-Stakes Domains</w:t>
       </w:r>
     </w:p>
     <w:p>
       <w:pPr>
-        <w:spacing w:line="276" w:lineRule="auto"/>
-        <w:ind w:firstLine="420"/>
+        <w:spacing w:line="276" w:lineRule="auto" w:after="60"/>
+        <w:jc w:val="both"/>
       </w:pPr>
       <w:r>
         <w:rPr>
@@ -3638,8 +3036,8 @@
     </w:p>
     <w:p>
       <w:pPr>
-        <w:spacing w:line="276" w:lineRule="auto"/>
-        <w:ind w:firstLine="420"/>
+        <w:spacing w:line="276" w:lineRule="auto" w:after="60"/>
+        <w:jc w:val="both"/>
       </w:pPr>
       <w:r>
         <w:rPr>
@@ -3658,15 +3056,15 @@
         <w:rPr>
           <w:rFonts w:ascii="Times New Roman" w:hAnsi="Times New Roman" w:eastAsia="SimSun"/>
           <w:b/>
-          <w:sz w:val="22"/>
+          <w:sz w:val="20"/>
         </w:rPr>
         <w:t>9.3 Hallucination and User Trust</w:t>
       </w:r>
     </w:p>
     <w:p>
       <w:pPr>
-        <w:spacing w:line="276" w:lineRule="auto"/>
-        <w:ind w:firstLine="420"/>
+        <w:spacing w:line="276" w:lineRule="auto" w:after="60"/>
+        <w:jc w:val="both"/>
       </w:pPr>
       <w:r>
         <w:rPr>
@@ -3679,8 +3077,8 @@
     </w:p>
     <w:p>
       <w:pPr>
-        <w:spacing w:line="276" w:lineRule="auto"/>
-        <w:ind w:firstLine="420"/>
+        <w:spacing w:line="276" w:lineRule="auto" w:after="60"/>
+        <w:jc w:val="both"/>
       </w:pPr>
       <w:r>
         <w:rPr>
@@ -3699,15 +3097,15 @@
         <w:rPr>
           <w:rFonts w:ascii="Times New Roman" w:hAnsi="Times New Roman" w:eastAsia="SimSun"/>
           <w:b/>
-          <w:sz w:val="22"/>
+          <w:sz w:val="20"/>
         </w:rPr>
         <w:t>9.4 Bias and Representation</w:t>
       </w:r>
     </w:p>
     <w:p>
       <w:pPr>
-        <w:spacing w:line="276" w:lineRule="auto"/>
-        <w:ind w:firstLine="420"/>
+        <w:spacing w:line="276" w:lineRule="auto" w:after="60"/>
+        <w:jc w:val="both"/>
       </w:pPr>
       <w:r>
         <w:rPr>
@@ -3720,8 +3118,8 @@
     </w:p>
     <w:p>
       <w:pPr>
-        <w:spacing w:line="276" w:lineRule="auto"/>
-        <w:ind w:firstLine="420"/>
+        <w:spacing w:line="276" w:lineRule="auto" w:after="60"/>
+        <w:jc w:val="both"/>
       </w:pPr>
       <w:r>
         <w:rPr>
@@ -3740,15 +3138,15 @@
         <w:rPr>
           <w:rFonts w:ascii="Times New Roman" w:hAnsi="Times New Roman" w:eastAsia="SimSun"/>
           <w:b/>
-          <w:sz w:val="22"/>
+          <w:sz w:val="20"/>
         </w:rPr>
         <w:t>9.5 Environmental and Compute Costs</w:t>
       </w:r>
     </w:p>
     <w:p>
       <w:pPr>
-        <w:spacing w:line="276" w:lineRule="auto"/>
-        <w:ind w:firstLine="420"/>
+        <w:spacing w:line="276" w:lineRule="auto" w:after="60"/>
+        <w:jc w:val="both"/>
       </w:pPr>
       <w:r>
         <w:rPr>
@@ -3761,8 +3159,8 @@
     </w:p>
     <w:p>
       <w:pPr>
-        <w:spacing w:line="276" w:lineRule="auto"/>
-        <w:ind w:firstLine="420"/>
+        <w:spacing w:line="276" w:lineRule="auto" w:after="60"/>
+        <w:jc w:val="both"/>
       </w:pPr>
       <w:r>
         <w:rPr>
@@ -3781,15 +3179,15 @@
         <w:rPr>
           <w:rFonts w:ascii="Times New Roman" w:hAnsi="Times New Roman" w:eastAsia="SimSun"/>
           <w:b/>
-          <w:sz w:val="22"/>
+          <w:sz w:val="20"/>
         </w:rPr>
         <w:t>9.6 Practical Deployment Guidance</w:t>
       </w:r>
     </w:p>
     <w:p>
       <w:pPr>
-        <w:spacing w:line="276" w:lineRule="auto"/>
-        <w:ind w:firstLine="420"/>
+        <w:spacing w:line="276" w:lineRule="auto" w:after="60"/>
+        <w:jc w:val="both"/>
       </w:pPr>
       <w:r>
         <w:rPr>
@@ -3802,8 +3200,8 @@
     </w:p>
     <w:p>
       <w:pPr>
-        <w:spacing w:line="276" w:lineRule="auto"/>
-        <w:ind w:firstLine="420"/>
+        <w:spacing w:line="276" w:lineRule="auto" w:after="60"/>
+        <w:jc w:val="both"/>
       </w:pPr>
       <w:r>
         <w:rPr>
@@ -3822,15 +3220,15 @@
         <w:rPr>
           <w:rFonts w:ascii="Times New Roman" w:hAnsi="Times New Roman" w:eastAsia="SimSun"/>
           <w:b/>
-          <w:sz w:val="26"/>
+          <w:sz w:val="24"/>
         </w:rPr>
         <w:t>10. Discussion</w:t>
       </w:r>
     </w:p>
     <w:p>
       <w:pPr>
-        <w:spacing w:line="276" w:lineRule="auto"/>
-        <w:ind w:firstLine="420"/>
+        <w:spacing w:line="276" w:lineRule="auto" w:after="60"/>
+        <w:jc w:val="both"/>
       </w:pPr>
       <w:r>
         <w:rPr>
@@ -3843,8 +3241,8 @@
     </w:p>
     <w:p>
       <w:pPr>
-        <w:spacing w:line="276" w:lineRule="auto"/>
-        <w:ind w:firstLine="420"/>
+        <w:spacing w:line="276" w:lineRule="auto" w:after="60"/>
+        <w:jc w:val="both"/>
       </w:pPr>
       <w:r>
         <w:rPr>
@@ -3857,8 +3255,8 @@
     </w:p>
     <w:p>
       <w:pPr>
-        <w:spacing w:line="276" w:lineRule="auto"/>
-        <w:ind w:firstLine="420"/>
+        <w:spacing w:line="276" w:lineRule="auto" w:after="60"/>
+        <w:jc w:val="both"/>
       </w:pPr>
       <w:r>
         <w:rPr>
@@ -3871,8 +3269,8 @@
     </w:p>
     <w:p>
       <w:pPr>
-        <w:spacing w:line="276" w:lineRule="auto"/>
-        <w:ind w:firstLine="420"/>
+        <w:spacing w:line="276" w:lineRule="auto" w:after="60"/>
+        <w:jc w:val="both"/>
       </w:pPr>
       <w:r>
         <w:rPr>
@@ -3885,8 +3283,8 @@
     </w:p>
     <w:p>
       <w:pPr>
-        <w:spacing w:line="276" w:lineRule="auto"/>
-        <w:ind w:firstLine="420"/>
+        <w:spacing w:line="276" w:lineRule="auto" w:after="60"/>
+        <w:jc w:val="both"/>
       </w:pPr>
       <w:r>
         <w:rPr>
@@ -3905,15 +3303,15 @@
         <w:rPr>
           <w:rFonts w:ascii="Times New Roman" w:hAnsi="Times New Roman" w:eastAsia="SimSun"/>
           <w:b/>
-          <w:sz w:val="26"/>
+          <w:sz w:val="24"/>
         </w:rPr>
         <w:t>11. Limitations</w:t>
       </w:r>
     </w:p>
     <w:p>
       <w:pPr>
-        <w:spacing w:line="276" w:lineRule="auto"/>
-        <w:ind w:firstLine="420"/>
+        <w:spacing w:line="276" w:lineRule="auto" w:after="60"/>
+        <w:jc w:val="both"/>
       </w:pPr>
       <w:r>
         <w:rPr>
@@ -3926,8 +3324,8 @@
     </w:p>
     <w:p>
       <w:pPr>
-        <w:spacing w:line="276" w:lineRule="auto"/>
-        <w:ind w:firstLine="420"/>
+        <w:spacing w:line="276" w:lineRule="auto" w:after="60"/>
+        <w:jc w:val="both"/>
       </w:pPr>
       <w:r>
         <w:rPr>
@@ -3946,15 +3344,15 @@
         <w:rPr>
           <w:rFonts w:ascii="Times New Roman" w:hAnsi="Times New Roman" w:eastAsia="SimSun"/>
           <w:b/>
-          <w:sz w:val="26"/>
+          <w:sz w:val="24"/>
         </w:rPr>
         <w:t>12. Conclusion</w:t>
       </w:r>
     </w:p>
     <w:p>
       <w:pPr>
-        <w:spacing w:line="276" w:lineRule="auto"/>
-        <w:ind w:firstLine="420"/>
+        <w:spacing w:line="276" w:lineRule="auto" w:after="60"/>
+        <w:jc w:val="both"/>
       </w:pPr>
       <w:r>
         <w:rPr>
@@ -3967,8 +3365,8 @@
     </w:p>
     <w:p>
       <w:pPr>
-        <w:spacing w:line="276" w:lineRule="auto"/>
-        <w:ind w:firstLine="420"/>
+        <w:spacing w:line="276" w:lineRule="auto" w:after="60"/>
+        <w:jc w:val="both"/>
       </w:pPr>
       <w:r>
         <w:rPr>
@@ -3981,8 +3379,8 @@
     </w:p>
     <w:p>
       <w:pPr>
-        <w:spacing w:line="276" w:lineRule="auto"/>
-        <w:ind w:firstLine="420"/>
+        <w:spacing w:line="276" w:lineRule="auto" w:after="60"/>
+        <w:jc w:val="both"/>
       </w:pPr>
       <w:r>
         <w:rPr>
@@ -4001,15 +3399,15 @@
         <w:rPr>
           <w:rFonts w:ascii="Times New Roman" w:hAnsi="Times New Roman" w:eastAsia="SimSun"/>
           <w:b/>
-          <w:sz w:val="26"/>
+          <w:sz w:val="24"/>
         </w:rPr>
         <w:t>13. Future Work</w:t>
       </w:r>
     </w:p>
     <w:p>
       <w:pPr>
-        <w:spacing w:line="276" w:lineRule="auto"/>
-        <w:ind w:firstLine="420"/>
+        <w:spacing w:line="276" w:lineRule="auto" w:after="60"/>
+        <w:jc w:val="both"/>
       </w:pPr>
       <w:r>
         <w:rPr>
@@ -4028,15 +3426,15 @@
         <w:rPr>
           <w:rFonts w:ascii="Times New Roman" w:hAnsi="Times New Roman" w:eastAsia="SimSun"/>
           <w:b/>
-          <w:sz w:val="26"/>
+          <w:sz w:val="24"/>
         </w:rPr>
         <w:t>Code Availability</w:t>
       </w:r>
     </w:p>
     <w:p>
       <w:pPr>
-        <w:spacing w:line="276" w:lineRule="auto"/>
-        <w:ind w:firstLine="420"/>
+        <w:spacing w:line="276" w:lineRule="auto" w:after="60"/>
+        <w:jc w:val="both"/>
       </w:pPr>
       <w:r>
         <w:rPr>
@@ -4049,8 +3447,8 @@
     </w:p>
     <w:p>
       <w:pPr>
-        <w:spacing w:line="276" w:lineRule="auto"/>
-        <w:ind w:firstLine="420"/>
+        <w:spacing w:line="276" w:lineRule="auto" w:after="60"/>
+        <w:jc w:val="both"/>
       </w:pPr>
       <w:r>
         <w:rPr>
@@ -4063,8 +3461,8 @@
     </w:p>
     <w:p>
       <w:pPr>
-        <w:spacing w:line="276" w:lineRule="auto"/>
-        <w:ind w:firstLine="420"/>
+        <w:spacing w:line="276" w:lineRule="auto" w:after="60"/>
+        <w:jc w:val="both"/>
       </w:pPr>
       <w:r>
         <w:rPr>
@@ -4174,7 +3572,7 @@
         <w:rPr>
           <w:rFonts w:ascii="Times New Roman" w:hAnsi="Times New Roman" w:eastAsia="SimSun"/>
           <w:b/>
-          <w:sz w:val="26"/>
+          <w:sz w:val="24"/>
         </w:rPr>
         <w:t>Final Verification Checklist</w:t>
       </w:r>
@@ -4265,15 +3663,15 @@
         <w:rPr>
           <w:rFonts w:ascii="Times New Roman" w:hAnsi="Times New Roman" w:eastAsia="SimSun"/>
           <w:b/>
-          <w:sz w:val="26"/>
+          <w:sz w:val="24"/>
         </w:rPr>
         <w:t>References</w:t>
       </w:r>
     </w:p>
     <w:p>
       <w:pPr>
-        <w:spacing w:line="276" w:lineRule="auto"/>
-        <w:ind w:firstLine="420"/>
+        <w:spacing w:line="276" w:lineRule="auto" w:after="60"/>
+        <w:jc w:val="both"/>
       </w:pPr>
       <w:r>
         <w:rPr>
@@ -4286,8 +3684,8 @@
     </w:p>
     <w:p>
       <w:pPr>
-        <w:spacing w:line="276" w:lineRule="auto"/>
-        <w:ind w:firstLine="420"/>
+        <w:spacing w:line="276" w:lineRule="auto" w:after="60"/>
+        <w:jc w:val="both"/>
       </w:pPr>
       <w:r>
         <w:rPr>
@@ -4300,8 +3698,8 @@
     </w:p>
     <w:p>
       <w:pPr>
-        <w:spacing w:line="276" w:lineRule="auto"/>
-        <w:ind w:firstLine="420"/>
+        <w:spacing w:line="276" w:lineRule="auto" w:after="60"/>
+        <w:jc w:val="both"/>
       </w:pPr>
       <w:r>
         <w:rPr>
@@ -4314,8 +3712,8 @@
     </w:p>
     <w:p>
       <w:pPr>
-        <w:spacing w:line="276" w:lineRule="auto"/>
-        <w:ind w:firstLine="420"/>
+        <w:spacing w:line="276" w:lineRule="auto" w:after="60"/>
+        <w:jc w:val="both"/>
       </w:pPr>
       <w:r>
         <w:rPr>
@@ -4328,8 +3726,8 @@
     </w:p>
     <w:p>
       <w:pPr>
-        <w:spacing w:line="276" w:lineRule="auto"/>
-        <w:ind w:firstLine="420"/>
+        <w:spacing w:line="276" w:lineRule="auto" w:after="60"/>
+        <w:jc w:val="both"/>
       </w:pPr>
       <w:r>
         <w:rPr>
@@ -4342,8 +3740,8 @@
     </w:p>
     <w:p>
       <w:pPr>
-        <w:spacing w:line="276" w:lineRule="auto"/>
-        <w:ind w:firstLine="420"/>
+        <w:spacing w:line="276" w:lineRule="auto" w:after="60"/>
+        <w:jc w:val="both"/>
       </w:pPr>
       <w:r>
         <w:rPr>
@@ -4356,8 +3754,8 @@
     </w:p>
     <w:p>
       <w:pPr>
-        <w:spacing w:line="276" w:lineRule="auto"/>
-        <w:ind w:firstLine="420"/>
+        <w:spacing w:line="276" w:lineRule="auto" w:after="60"/>
+        <w:jc w:val="both"/>
       </w:pPr>
       <w:r>
         <w:rPr>
@@ -4370,8 +3768,8 @@
     </w:p>
     <w:p>
       <w:pPr>
-        <w:spacing w:line="276" w:lineRule="auto"/>
-        <w:ind w:firstLine="420"/>
+        <w:spacing w:line="276" w:lineRule="auto" w:after="60"/>
+        <w:jc w:val="both"/>
       </w:pPr>
       <w:r>
         <w:rPr>
@@ -4384,8 +3782,8 @@
     </w:p>
     <w:p>
       <w:pPr>
-        <w:spacing w:line="276" w:lineRule="auto"/>
-        <w:ind w:firstLine="420"/>
+        <w:spacing w:line="276" w:lineRule="auto" w:after="60"/>
+        <w:jc w:val="both"/>
       </w:pPr>
       <w:r>
         <w:rPr>
@@ -4398,8 +3796,8 @@
     </w:p>
     <w:p>
       <w:pPr>
-        <w:spacing w:line="276" w:lineRule="auto"/>
-        <w:ind w:firstLine="420"/>
+        <w:spacing w:line="276" w:lineRule="auto" w:after="60"/>
+        <w:jc w:val="both"/>
       </w:pPr>
       <w:r>
         <w:rPr>
@@ -4412,8 +3810,8 @@
     </w:p>
     <w:p>
       <w:pPr>
-        <w:spacing w:line="276" w:lineRule="auto"/>
-        <w:ind w:firstLine="420"/>
+        <w:spacing w:line="276" w:lineRule="auto" w:after="60"/>
+        <w:jc w:val="both"/>
       </w:pPr>
       <w:r>
         <w:rPr>
@@ -4426,8 +3824,8 @@
     </w:p>
     <w:p>
       <w:pPr>
-        <w:spacing w:line="276" w:lineRule="auto"/>
-        <w:ind w:firstLine="420"/>
+        <w:spacing w:line="276" w:lineRule="auto" w:after="60"/>
+        <w:jc w:val="both"/>
       </w:pPr>
       <w:r>
         <w:rPr>
@@ -4440,8 +3838,8 @@
     </w:p>
     <w:p>
       <w:pPr>
-        <w:spacing w:line="276" w:lineRule="auto"/>
-        <w:ind w:firstLine="420"/>
+        <w:spacing w:line="276" w:lineRule="auto" w:after="60"/>
+        <w:jc w:val="both"/>
       </w:pPr>
       <w:r>
         <w:rPr>
@@ -4454,8 +3852,8 @@
     </w:p>
     <w:p>
       <w:pPr>
-        <w:spacing w:line="276" w:lineRule="auto"/>
-        <w:ind w:firstLine="420"/>
+        <w:spacing w:line="276" w:lineRule="auto" w:after="60"/>
+        <w:jc w:val="both"/>
       </w:pPr>
       <w:r>
         <w:rPr>
@@ -4468,8 +3866,8 @@
     </w:p>
     <w:p>
       <w:pPr>
-        <w:spacing w:line="276" w:lineRule="auto"/>
-        <w:ind w:firstLine="420"/>
+        <w:spacing w:line="276" w:lineRule="auto" w:after="60"/>
+        <w:jc w:val="both"/>
       </w:pPr>
       <w:r>
         <w:rPr>
@@ -4482,8 +3880,8 @@
     </w:p>
     <w:p>
       <w:pPr>
-        <w:spacing w:line="276" w:lineRule="auto"/>
-        <w:ind w:firstLine="420"/>
+        <w:spacing w:line="276" w:lineRule="auto" w:after="60"/>
+        <w:jc w:val="both"/>
       </w:pPr>
       <w:r>
         <w:rPr>
@@ -4496,8 +3894,8 @@
     </w:p>
     <w:p>
       <w:pPr>
-        <w:spacing w:line="276" w:lineRule="auto"/>
-        <w:ind w:firstLine="420"/>
+        <w:spacing w:line="276" w:lineRule="auto" w:after="60"/>
+        <w:jc w:val="both"/>
       </w:pPr>
       <w:r>
         <w:rPr>
@@ -4510,8 +3908,8 @@
     </w:p>
     <w:p>
       <w:pPr>
-        <w:spacing w:line="276" w:lineRule="auto"/>
-        <w:ind w:firstLine="420"/>
+        <w:spacing w:line="276" w:lineRule="auto" w:after="60"/>
+        <w:jc w:val="both"/>
       </w:pPr>
       <w:r>
         <w:rPr>
@@ -4524,8 +3922,8 @@
     </w:p>
     <w:p>
       <w:pPr>
-        <w:spacing w:line="276" w:lineRule="auto"/>
-        <w:ind w:firstLine="420"/>
+        <w:spacing w:line="276" w:lineRule="auto" w:after="60"/>
+        <w:jc w:val="both"/>
       </w:pPr>
       <w:r>
         <w:rPr>
@@ -4538,8 +3936,8 @@
     </w:p>
     <w:p>
       <w:pPr>
-        <w:spacing w:line="276" w:lineRule="auto"/>
-        <w:ind w:firstLine="420"/>
+        <w:spacing w:line="276" w:lineRule="auto" w:after="60"/>
+        <w:jc w:val="both"/>
       </w:pPr>
       <w:r>
         <w:rPr>
@@ -4552,8 +3950,8 @@
     </w:p>
     <w:p>
       <w:pPr>
-        <w:spacing w:line="276" w:lineRule="auto"/>
-        <w:ind w:firstLine="420"/>
+        <w:spacing w:line="276" w:lineRule="auto" w:after="60"/>
+        <w:jc w:val="both"/>
       </w:pPr>
       <w:r>
         <w:rPr>
@@ -4566,8 +3964,8 @@
     </w:p>
     <w:p>
       <w:pPr>
-        <w:spacing w:line="276" w:lineRule="auto"/>
-        <w:ind w:firstLine="420"/>
+        <w:spacing w:line="276" w:lineRule="auto" w:after="60"/>
+        <w:jc w:val="both"/>
       </w:pPr>
       <w:r>
         <w:rPr>
@@ -4580,8 +3978,8 @@
     </w:p>
     <w:p>
       <w:pPr>
-        <w:spacing w:line="276" w:lineRule="auto"/>
-        <w:ind w:firstLine="420"/>
+        <w:spacing w:line="276" w:lineRule="auto" w:after="60"/>
+        <w:jc w:val="both"/>
       </w:pPr>
       <w:r>
         <w:rPr>
@@ -4589,13 +3987,13 @@
           <w:b w:val="0"/>
           <w:sz w:val="20"/>
         </w:rPr>
-        <w:t>[23] Li Junnan, Li Dongxu, Xiong Caiming, et al. BLIP: Bootstrapping Language-Image Pre-training for Unified Vision-Language Understanding and Generation[C]. International Conference on Machine Learning, 2022.</w:t>
+        <w:t>[23] Lu Jiasen, Batra Dhruv, Parikh Devi, et al. ViLBERT: Pretraining Task-Agnostic Visiolinguistic Representations for Vision-and-Language Tasks[C]. Advances in Neural Information Processing Systems, 2019.</w:t>
       </w:r>
     </w:p>
     <w:p>
       <w:pPr>
-        <w:spacing w:line="276" w:lineRule="auto"/>
-        <w:ind w:firstLine="420"/>
+        <w:spacing w:line="276" w:lineRule="auto" w:after="60"/>
+        <w:jc w:val="both"/>
       </w:pPr>
       <w:r>
         <w:rPr>
@@ -4603,17 +4001,289 @@
           <w:b w:val="0"/>
           <w:sz w:val="20"/>
         </w:rPr>
-        <w:t>[24] Chen Zhe, Wu Jiannan, Wang Wenhai, et al. InternVL: Scaling up Vision Foundation Models and Aligning for Generic Visual-Linguistic Tasks[C]. IEEE/CVF Conference on Computer Vision and Pattern Recognition, 2024.</w:t>
+        <w:t>[24] Tan Hao, Bansal Mohit. LXMERT: Learning Cross-Modality Encoder Representations from Transformers[C]. Proceedings of the 2019 Conference on Empirical Methods in Natural Language Processing and the 9th International Joint Conference on Natural Language Processing, 2019.</w:t>
+      </w:r>
+    </w:p>
+    <w:p>
+      <w:pPr>
+        <w:spacing w:line="276" w:lineRule="auto" w:after="60"/>
+        <w:jc w:val="both"/>
+      </w:pPr>
+      <w:r>
+        <w:rPr>
+          <w:rFonts w:ascii="Times New Roman" w:hAnsi="Times New Roman" w:eastAsia="SimSun"/>
+          <w:b w:val="0"/>
+          <w:sz w:val="20"/>
+        </w:rPr>
+        <w:t>[25] Chen Yen-Chun, Li Linjie, Yu Licheng, et al. UNITER: UNiversal Image-TExt Representation Learning[C]. European Conference on Computer Vision, 2020.</w:t>
+      </w:r>
+    </w:p>
+    <w:p>
+      <w:pPr>
+        <w:spacing w:line="276" w:lineRule="auto" w:after="60"/>
+        <w:jc w:val="both"/>
+      </w:pPr>
+      <w:r>
+        <w:rPr>
+          <w:rFonts w:ascii="Times New Roman" w:hAnsi="Times New Roman" w:eastAsia="SimSun"/>
+          <w:b w:val="0"/>
+          <w:sz w:val="20"/>
+        </w:rPr>
+        <w:t>[26] Li Xiujun, Yin Xi, Li Chunyuan, et al. Oscar: Object-Semantics Aligned Pre-training for Vision-Language Tasks[C]. European Conference on Computer Vision, 2020.</w:t>
+      </w:r>
+    </w:p>
+    <w:p>
+      <w:pPr>
+        <w:spacing w:line="276" w:lineRule="auto" w:after="60"/>
+        <w:jc w:val="both"/>
+      </w:pPr>
+      <w:r>
+        <w:rPr>
+          <w:rFonts w:ascii="Times New Roman" w:hAnsi="Times New Roman" w:eastAsia="SimSun"/>
+          <w:b w:val="0"/>
+          <w:sz w:val="20"/>
+        </w:rPr>
+        <w:t>[27] Zhang Pengchuan, Li Xiujun, Hu Xiaowei, et al. VinVL: Revisiting Visual Representations in Vision-Language Models[C]. IEEE/CVF Conference on Computer Vision and Pattern Recognition, 2021.</w:t>
+      </w:r>
+    </w:p>
+    <w:p>
+      <w:pPr>
+        <w:spacing w:line="276" w:lineRule="auto" w:after="60"/>
+        <w:jc w:val="both"/>
+      </w:pPr>
+      <w:r>
+        <w:rPr>
+          <w:rFonts w:ascii="Times New Roman" w:hAnsi="Times New Roman" w:eastAsia="SimSun"/>
+          <w:b w:val="0"/>
+          <w:sz w:val="20"/>
+        </w:rPr>
+        <w:t>[28] Wang Peng, Yang An, Men Rui, et al. OFA: Unifying Architectures, Tasks, and Modalities Through a Simple Sequence-to-Sequence Learning Framework[C]. International Conference on Machine Learning, 2022.</w:t>
+      </w:r>
+    </w:p>
+    <w:p>
+      <w:pPr>
+        <w:spacing w:line="276" w:lineRule="auto" w:after="60"/>
+        <w:jc w:val="both"/>
+      </w:pPr>
+      <w:r>
+        <w:rPr>
+          <w:rFonts w:ascii="Times New Roman" w:hAnsi="Times New Roman" w:eastAsia="SimSun"/>
+          <w:b w:val="0"/>
+          <w:sz w:val="20"/>
+        </w:rPr>
+        <w:t>[29] Li Junnan, Li Dongxu, Xiong Caiming, et al. BLIP: Bootstrapping Language-Image Pre-training for Unified Vision-Language Understanding and Generation[C]. International Conference on Machine Learning, 2022.</w:t>
+      </w:r>
+    </w:p>
+    <w:p>
+      <w:pPr>
+        <w:spacing w:line="276" w:lineRule="auto" w:after="60"/>
+        <w:jc w:val="both"/>
+      </w:pPr>
+      <w:r>
+        <w:rPr>
+          <w:rFonts w:ascii="Times New Roman" w:hAnsi="Times New Roman" w:eastAsia="SimSun"/>
+          <w:b w:val="0"/>
+          <w:sz w:val="20"/>
+        </w:rPr>
+        <w:t>[30] Chen Xi, Wang Xiao, Changpinyo Soravit, et al. PaLI: A Jointly-Scaled Multilingual Language-Image Model[J]. arXiv preprint arXiv:2209.06794, 2022.</w:t>
+      </w:r>
+    </w:p>
+    <w:p>
+      <w:pPr>
+        <w:spacing w:line="276" w:lineRule="auto" w:after="60"/>
+        <w:jc w:val="both"/>
+      </w:pPr>
+      <w:r>
+        <w:rPr>
+          <w:rFonts w:ascii="Times New Roman" w:hAnsi="Times New Roman" w:eastAsia="SimSun"/>
+          <w:b w:val="0"/>
+          <w:sz w:val="20"/>
+        </w:rPr>
+        <w:t>[31] Driess Danny, Xia Fei, Sajjadi Mehdi S. M., et al. PaLM-E: An Embodied Multimodal Language Model[C]. International Conference on Machine Learning, 2023.</w:t>
+      </w:r>
+    </w:p>
+    <w:p>
+      <w:pPr>
+        <w:spacing w:line="276" w:lineRule="auto" w:after="60"/>
+        <w:jc w:val="both"/>
+      </w:pPr>
+      <w:r>
+        <w:rPr>
+          <w:rFonts w:ascii="Times New Roman" w:hAnsi="Times New Roman" w:eastAsia="SimSun"/>
+          <w:b w:val="0"/>
+          <w:sz w:val="20"/>
+        </w:rPr>
+        <w:t>[32] Huang Shaohan, Dong Li, Wang Wenhui, et al. Language Is Not All You Need: Aligning Perception with Language Models[J]. arXiv preprint arXiv:2302.14045, 2023.</w:t>
+      </w:r>
+    </w:p>
+    <w:p>
+      <w:pPr>
+        <w:spacing w:line="276" w:lineRule="auto" w:after="60"/>
+        <w:jc w:val="both"/>
+      </w:pPr>
+      <w:r>
+        <w:rPr>
+          <w:rFonts w:ascii="Times New Roman" w:hAnsi="Times New Roman" w:eastAsia="SimSun"/>
+          <w:b w:val="0"/>
+          <w:sz w:val="20"/>
+        </w:rPr>
+        <w:t>[33] Peng Zhiliang, Wang Wenhui, Dong Li, et al. Kosmos-2: Grounding Multimodal Large Language Models to the World[J]. arXiv preprint arXiv:2306.14824, 2023.</w:t>
+      </w:r>
+    </w:p>
+    <w:p>
+      <w:pPr>
+        <w:spacing w:line="276" w:lineRule="auto" w:after="60"/>
+        <w:jc w:val="both"/>
+      </w:pPr>
+      <w:r>
+        <w:rPr>
+          <w:rFonts w:ascii="Times New Roman" w:hAnsi="Times New Roman" w:eastAsia="SimSun"/>
+          <w:b w:val="0"/>
+          <w:sz w:val="20"/>
+        </w:rPr>
+        <w:t>[34] Ye Qinghao, Xu Haiyang, Xu Guohai, et al. mPLUG-Owl: Modularization Empowers Large Language Models with Multimodality[J]. arXiv preprint arXiv:2304.14178, 2023.</w:t>
+      </w:r>
+    </w:p>
+    <w:p>
+      <w:pPr>
+        <w:spacing w:line="276" w:lineRule="auto" w:after="60"/>
+        <w:jc w:val="both"/>
+      </w:pPr>
+      <w:r>
+        <w:rPr>
+          <w:rFonts w:ascii="Times New Roman" w:hAnsi="Times New Roman" w:eastAsia="SimSun"/>
+          <w:b w:val="0"/>
+          <w:sz w:val="20"/>
+        </w:rPr>
+        <w:t>[35] Chen Keqin, Zhang Zhao, Zeng Weili, et al. Shikra: Unleashing Multimodal LLM's Referential Dialogue Magic[J]. arXiv preprint arXiv:2306.15195, 2023.</w:t>
+      </w:r>
+    </w:p>
+    <w:p>
+      <w:pPr>
+        <w:spacing w:line="276" w:lineRule="auto" w:after="60"/>
+        <w:jc w:val="both"/>
+      </w:pPr>
+      <w:r>
+        <w:rPr>
+          <w:rFonts w:ascii="Times New Roman" w:hAnsi="Times New Roman" w:eastAsia="SimSun"/>
+          <w:b w:val="0"/>
+          <w:sz w:val="20"/>
+        </w:rPr>
+        <w:t>[36] You Haoxuan, Zhang Haotian, Gan Zhe, et al. Ferret: Refer and Ground Anything Anywhere at Any Granularity[C]. International Conference on Learning Representations, 2024.</w:t>
+      </w:r>
+    </w:p>
+    <w:p>
+      <w:pPr>
+        <w:spacing w:line="276" w:lineRule="auto" w:after="60"/>
+        <w:jc w:val="both"/>
+      </w:pPr>
+      <w:r>
+        <w:rPr>
+          <w:rFonts w:ascii="Times New Roman" w:hAnsi="Times New Roman" w:eastAsia="SimSun"/>
+          <w:b w:val="0"/>
+          <w:sz w:val="20"/>
+        </w:rPr>
+        <w:t>[37] Lin Ji, Yin Hongxu, Ping Wei, et al. VILA: On Pre-training for Visual Language Models[J]. arXiv preprint arXiv:2312.07533, 2023.</w:t>
+      </w:r>
+    </w:p>
+    <w:p>
+      <w:pPr>
+        <w:spacing w:line="276" w:lineRule="auto" w:after="60"/>
+        <w:jc w:val="both"/>
+      </w:pPr>
+      <w:r>
+        <w:rPr>
+          <w:rFonts w:ascii="Times New Roman" w:hAnsi="Times New Roman" w:eastAsia="SimSun"/>
+          <w:b w:val="0"/>
+          <w:sz w:val="20"/>
+        </w:rPr>
+        <w:t>[38] Lin Bin, Ye Yang, Zhu Bin, et al. Video-LLaVA: Learning United Visual Representation by Alignment Before Projection[C]. Conference on Empirical Methods in Natural Language Processing, 2024.</w:t>
+      </w:r>
+    </w:p>
+    <w:p>
+      <w:pPr>
+        <w:spacing w:line="276" w:lineRule="auto" w:after="60"/>
+        <w:jc w:val="both"/>
+      </w:pPr>
+      <w:r>
+        <w:rPr>
+          <w:rFonts w:ascii="Times New Roman" w:hAnsi="Times New Roman" w:eastAsia="SimSun"/>
+          <w:b w:val="0"/>
+          <w:sz w:val="20"/>
+        </w:rPr>
+        <w:t>[39] Wu Chenfei, Yin Shengming, Qi Weizhen, et al. Visual ChatGPT: Talking, Drawing and Editing with Visual Foundation Models[J]. arXiv preprint arXiv:2303.04671, 2023.</w:t>
+      </w:r>
+    </w:p>
+    <w:p>
+      <w:pPr>
+        <w:spacing w:line="276" w:lineRule="auto" w:after="60"/>
+        <w:jc w:val="both"/>
+      </w:pPr>
+      <w:r>
+        <w:rPr>
+          <w:rFonts w:ascii="Times New Roman" w:hAnsi="Times New Roman" w:eastAsia="SimSun"/>
+          <w:b w:val="0"/>
+          <w:sz w:val="20"/>
+        </w:rPr>
+        <w:t>[40] Chen Zhe, Wu Jiannan, Wang Wenhai, et al. InternVL: Scaling up Vision Foundation Models and Aligning for Generic Visual-Linguistic Tasks[C]. IEEE/CVF Conference on Computer Vision and Pattern Recognition, 2024.</w:t>
+      </w:r>
+    </w:p>
+    <w:p>
+      <w:pPr>
+        <w:spacing w:line="276" w:lineRule="auto" w:after="60"/>
+        <w:jc w:val="both"/>
+      </w:pPr>
+      <w:r>
+        <w:rPr>
+          <w:rFonts w:ascii="Times New Roman" w:hAnsi="Times New Roman" w:eastAsia="SimSun"/>
+          <w:b w:val="0"/>
+          <w:sz w:val="20"/>
+        </w:rPr>
+        <w:t>[41] Singh Amanpreet, Natarajan Vivek, Shah Meet, et al. Towards VQA Models That Can Read[C]. IEEE/CVF Conference on Computer Vision and Pattern Recognition, 2019.</w:t>
+      </w:r>
+    </w:p>
+    <w:p>
+      <w:pPr>
+        <w:spacing w:line="276" w:lineRule="auto" w:after="60"/>
+        <w:jc w:val="both"/>
+      </w:pPr>
+      <w:r>
+        <w:rPr>
+          <w:rFonts w:ascii="Times New Roman" w:hAnsi="Times New Roman" w:eastAsia="SimSun"/>
+          <w:b w:val="0"/>
+          <w:sz w:val="20"/>
+        </w:rPr>
+        <w:t>[42] Masry Ahmed, Long Do Xuan, Tan Jia Qing, et al. ChartQA: A Benchmark for Question Answering about Charts with Visual and Logical Reasoning[C]. Findings of the Association for Computational Linguistics: ACL 2022, 2022.</w:t>
       </w:r>
     </w:p>
     <w:sectPr>
-      <w:pgSz w:w="11906" w:h="16838"/>
-      <w:pgMar w:top="1440" w:right="1803" w:bottom="1440" w:left="1803" w:header="720" w:footer="720" w:gutter="0"/>
+      <w:footerReference w:type="default" r:id="rId9"/>
+      <w:pgSz w:w="12240" w:h="15840"/>
+      <w:pgMar w:top="2523" w:right="2676" w:bottom="1757" w:left="2676" w:header="720" w:footer="1587" w:gutter="0"/>
       <w:cols w:space="720"/>
       <w:docGrid w:linePitch="360"/>
     </w:sectPr>
   </w:body>
 </w:document>
+</file>
+
+<file path=word/footer1.xml><?xml version="1.0" encoding="utf-8"?>
+<w:ftr xmlns:m="http://schemas.openxmlformats.org/officeDocument/2006/math" xmlns:mc="http://schemas.openxmlformats.org/markup-compatibility/2006" xmlns:mo="http://schemas.microsoft.com/office/mac/office/2008/main" xmlns:mv="urn:schemas-microsoft-com:mac:vml" xmlns:o="urn:schemas-microsoft-com:office:office" xmlns:r="http://schemas.openxmlformats.org/officeDocument/2006/relationships" xmlns:v="urn:schemas-microsoft-com:vml" xmlns:w10="urn:schemas-microsoft-com:office:word" xmlns:w14="http://schemas.microsoft.com/office/word/2010/wordml" xmlns:w="http://schemas.openxmlformats.org/wordprocessingml/2006/main" xmlns:wne="http://schemas.microsoft.com/office/word/2006/wordml" xmlns:wp14="http://schemas.microsoft.com/office/word/2010/wordprocessingDrawing" xmlns:wp="http://schemas.openxmlformats.org/drawingml/2006/wordprocessingDrawing" xmlns:wpc="http://schemas.microsoft.com/office/word/2010/wordprocessingCanvas" xmlns:wpg="http://schemas.microsoft.com/office/word/2010/wordprocessingGroup" xmlns:wpi="http://schemas.microsoft.com/office/word/2010/wordprocessingInk" xmlns:wps="http://schemas.microsoft.com/office/word/2010/wordprocessingShape" mc:Ignorable="w14 wp14">
+  <w:p>
+    <w:pPr>
+      <w:pStyle w:val="Footer"/>
+      <w:jc w:val="center"/>
+    </w:pPr>
+    <w:r>
+      <w:rPr>
+        <w:rFonts w:ascii="Times New Roman" w:hAnsi="Times New Roman" w:eastAsia="SimSun"/>
+        <w:b w:val="0"/>
+        <w:sz w:val="16"/>
+      </w:rPr>
+      <w:t>https://github.com/NGARAMA-TECH/AI-final-report    ChinaXiv-style preprint</w:t>
+    </w:r>
+  </w:p>
+</w:ftr>
 </file>
 
 <file path=word/numbering.xml><?xml version="1.0" encoding="utf-8"?>

</xml_diff>

<commit_message>
Expand references beyond sixty
</commit_message>
<xml_diff>
--- a/paper/paper_chinaxiv.docx
+++ b/paper/paper_chinaxiv.docx
@@ -188,7 +188,7 @@
           <w:b w:val="0"/>
           <w:sz w:val="20"/>
         </w:rPr>
-        <w:t>This paper surveys MLLMs from the perspective of architecture, training, evaluation, and reproducibility. It focuses on models and benchmarks that have shaped the research conversation: CLIP, Flamingo, BLIP-2, InstructBLIP, LLaVA, MiniGPT-4, Qwen-VL, InternVL, CogVLM, and GPT-4V [12]. It also examines benchmark families including VQA [13], GQA [14], OK-VQA [15], ScienceQA [16], MME [17], MMBench [18], MM-Vet [19], MMMU [20], POPE [21], and MathVista [22]. No new benchmark scores are reported. Where benchmark names are discussed, the purpose is to explain what they evaluate and why they matter.</w:t>
+        <w:t>This paper surveys MLLMs from the perspective of architecture, training, evaluation, and reproducibility. It focuses on models and benchmarks that have shaped the research conversation: CLIP, Flamingo, BLIP-2, InstructBLIP, LLaVA, MiniGPT-4, Qwen-VL, InternVL, CogVLM, and GPT-4V [12]. It also examines benchmark families including VQA [13], GQA [14], OK-VQA [15], ScienceQA [16], MME [17], MMBench [18], MM-Vet [19], MMMU [20], POPE [21], and MathVista [22]. Recent survey papers and community resources have also attempted to systematize this expanding field [23] [24] [25] [26]. No new benchmark scores are reported. Where benchmark names are discussed, the purpose is to explain what they evaluate and why they matter.</w:t>
       </w:r>
     </w:p>
     <w:p>
@@ -243,7 +243,7 @@
           <w:b w:val="0"/>
           <w:sz w:val="20"/>
         </w:rPr>
-        <w:t>Vision-language representation learning provided the second foundation. Earlier transformer-based systems such as ViLBERT, LXMERT, UNITER, Oscar, VinVL, and OFA studied cross-modal pretraining before the current MLLM wave [23] [24] [25] [26] [27] [28]. CLIP trained image and text encoders with a contrastive objective over image-caption pairs, producing transferable open-vocabulary visual representations [3]. ALIGN scaled a similar idea with noisy image-text supervision and showed that large web-scale data could support robust cross-modal retrieval and classification [4]. These models are not full MLLMs in the current sense because they do not perform open-ended multimodal dialogue through a generative language model. Nevertheless, they established a practical strategy: align visual and textual representations using paired data, then reuse the learned representation for downstream tasks.</w:t>
+        <w:t>Vision-language representation learning provided the second foundation. Earlier attention-based visual question answering and captioning systems highlighted the value of bottom-up visual features before the current MLLM wave [27]. Transformer-based systems such as ViLBERT, LXMERT, UNITER, Oscar, VinVL, and OFA then studied cross-modal pretraining in more unified settings [28] [29] [30] [31] [32] [33]. CLIP trained image and text encoders with a contrastive objective over image-caption pairs, producing transferable open-vocabulary visual representations [3]. ALIGN scaled a similar idea with noisy image-text supervision and showed that large web-scale data could support robust cross-modal retrieval and classification [4]. These models are not full MLLMs in the current sense because they do not perform open-ended multimodal dialogue through a generative language model. Nevertheless, they established a practical strategy: align visual and textual representations using paired data, then reuse the learned representation for downstream tasks.</w:t>
       </w:r>
     </w:p>
     <w:p>
@@ -257,7 +257,7 @@
           <w:b w:val="0"/>
           <w:sz w:val="20"/>
         </w:rPr>
-        <w:t>A second group of works moved from retrieval-style representation learning toward generative vision-language models. BLIP unified understanding and generation with bootstrapped captions and filtering [29]. Flamingo connected strong visual encoders to frozen language models with cross-attention layers and demonstrated few-shot learning over interleaved image, video, and text inputs [5]. BLIP-2 introduced a Querying Transformer, commonly called Q-Former, to bridge frozen image encoders and frozen language models efficiently [6]. These models are important because they show that full end-to-end retraining is not the only route to multimodal competence. Careful adapter or connector design can exploit powerful unimodal components while reducing training cost.</w:t>
+        <w:t>A second group of works moved from retrieval-style representation learning toward generative vision-language models. BLIP unified understanding and generation with bootstrapped captions and filtering [34]. Flamingo connected strong visual encoders to frozen language models with cross-attention layers and demonstrated few-shot learning over interleaved image, video, and text inputs [5]. BLIP-2 introduced a Querying Transformer, commonly called Q-Former, to bridge frozen image encoders and frozen language models efficiently [6]. These models are important because they show that full end-to-end retraining is not the only route to multimodal competence. Careful adapter or connector design can exploit powerful unimodal components while reducing training cost.</w:t>
       </w:r>
     </w:p>
     <w:p>
@@ -285,7 +285,7 @@
           <w:b w:val="0"/>
           <w:sz w:val="20"/>
         </w:rPr>
-        <w:t>Recent systems have expanded the design space. PaLI and PaLM-E illustrate multilingual and embodied multimodal scaling [30] [31]. Kosmos-1 and Kosmos-2 emphasize aligning perception with language and grounding multimodal language models to the world [32] [33]. Qwen-VL emphasizes abilities such as text reading and localization in addition to general visual dialogue [11]. mPLUG-Owl, Shikra, Ferret, VILA, Video-LLaVA, and Visual ChatGPT represent additional directions in modularization, referential dialogue, grounding, pretraining, video alignment, and tool-assisted visual interaction [34] [35] [36] [37] [38] [39]. InternVL studies scaling of vision foundation models and alignment for generic visual-linguistic tasks [40]. CogVLM uses a visual expert approach to integrate visual capability into pretrained language models while preserving language competence [7]. GPT-4V represents a closed frontier system described through a system card rather than full open model weights or training details [12]. The contrast between open and closed systems is now a major reproducibility issue: closed systems can be evaluated externally, but their training data, architecture, and alignment processes cannot be independently inspected.</w:t>
+        <w:t>Recent systems have expanded the design space. PaLI and PaLM-E illustrate multilingual and embodied multimodal scaling [35] [36]. Kosmos-1 and Kosmos-2 emphasize aligning perception with language and grounding multimodal language models to the world [37] [38]. Qwen-VL emphasizes abilities such as text reading and localization in addition to general visual dialogue [11]. mPLUG-Owl, Shikra, Ferret, VILA, Video-LLaVA, and Visual ChatGPT represent additional directions in modularization, referential dialogue, grounding, pretraining, video alignment, and tool-assisted visual interaction [39] [40] [41] [42] [43] [44]. InternVL studies scaling of vision foundation models and alignment for generic visual-linguistic tasks [45]. CogVLM uses a visual expert approach to integrate visual capability into pretrained language models while preserving language competence [7]. GPT-4V represents a closed frontier system described through a system card rather than full open model weights or training details [12]. The contrast between open and closed systems is now a major reproducibility issue: closed systems can be evaluated externally, but their training data, architecture, and alignment processes cannot be independently inspected.</w:t>
       </w:r>
     </w:p>
     <w:p>
@@ -299,7 +299,35 @@
           <w:b w:val="0"/>
           <w:sz w:val="20"/>
         </w:rPr>
-        <w:t>Evaluation research has also evolved. Early visual question answering benchmarks such as VQA [13], GQA [14], and OK-VQA [15] tested specific combinations of perception, language, compositional reasoning, and external knowledge. TextVQA and ChartQA extended evaluation toward visual text reading and chart reasoning [41] [42]. ScienceQA introduced science-question reasoning with multimodal explanations [16]. Modern MLLM benchmarks such as MME, MMBench, MM-Vet, and MMMU attempt to measure broader capability dimensions [17] [18] [19] [20]. POPE focuses specifically on object hallucination [21], while MathVista evaluates mathematical reasoning in visual contexts [22]. This benchmark expansion reflects a key point: no single test can characterize an MLLM.</w:t>
+        <w:t>Additional recent work broadens the field beyond still-image chat. GPT-4 and Gemini show the role of frontier-scale multimodal or multimodal-adjacent systems [46] [47]. OpenFlamingo and IDEFICS/OBELICS emphasize reproducible or openly described training infrastructure and interleaved image-text corpora [48] [49]. ImageBind explores shared embeddings across multiple modalities [50], while NExT-GPT, LLaMA-VID, and Video-ChatGPT extend the discussion toward any-to-any multimodality and video understanding [51] [52] [53]. Model composition research further asks whether separately trained multimodal experts can be combined rather than retrained from scratch [54].</w:t>
+      </w:r>
+    </w:p>
+    <w:p>
+      <w:pPr>
+        <w:spacing w:line="276" w:lineRule="auto" w:after="60"/>
+        <w:jc w:val="both"/>
+      </w:pPr>
+      <w:r>
+        <w:rPr>
+          <w:rFonts w:ascii="Times New Roman" w:hAnsi="Times New Roman" w:eastAsia="SimSun"/>
+          <w:b w:val="0"/>
+          <w:sz w:val="20"/>
+        </w:rPr>
+        <w:t>Evaluation research has also evolved. Early visual question answering benchmarks such as VQA [13], GQA [14], OK-VQA [15], A-OKVQA, and CLEVR tested specific combinations of perception, language, compositional reasoning, and external knowledge [55] [56]. TextVQA, DocVQA, and ChartQA extended evaluation toward visual text reading, document images, and chart reasoning [57] [58] [59]. ScienceQA introduced science-question reasoning with multimodal explanations [16]. Modern MLLM benchmarks such as MME, MMBench, MM-Vet, MMMU, SEED-Bench, and HallusionBench attempt to measure broader capability dimensions, generative comprehension, and hallucination or visual-illusion behavior [17] [18] [19] [20] [60] [61]. POPE focuses specifically on object hallucination [21], while MathVista evaluates mathematical reasoning in visual contexts [22]. This benchmark expansion reflects a key point: no single test can characterize an MLLM.</w:t>
+      </w:r>
+    </w:p>
+    <w:p>
+      <w:pPr>
+        <w:spacing w:line="276" w:lineRule="auto" w:after="60"/>
+        <w:jc w:val="both"/>
+      </w:pPr>
+      <w:r>
+        <w:rPr>
+          <w:rFonts w:ascii="Times New Roman" w:hAnsi="Times New Roman" w:eastAsia="SimSun"/>
+          <w:b w:val="0"/>
+          <w:sz w:val="20"/>
+        </w:rPr>
+        <w:t>This survey also includes a HITSZ-linked grounded evaluation perspective. CulturALL includes Wenjiang Luo among the authors and lists Baotian Hu with Harbin Institute of Technology, Shenzhen affiliation; it benchmarks multilingual and multicultural competence on grounded tasks [62]. This is relevant because MLLM evaluation is increasingly concerned not only with object recognition and English visual question answering, but also with cultural grounding, multilingual robustness, and task settings where visual or contextual evidence must be interpreted carefully.</w:t>
       </w:r>
     </w:p>
     <w:p>
@@ -812,7 +840,7 @@
           <w:b w:val="0"/>
           <w:sz w:val="20"/>
         </w:rPr>
-        <w:t>BLIP introduced bootstrapping methods for unified vision-language understanding and generation [29]. Its core insight is that noisy web captions can be improved through caption generation and filtering, producing better supervision for downstream learning. This line of work bridges the gap between static representation learning and text generation.</w:t>
+        <w:t>BLIP introduced bootstrapping methods for unified vision-language understanding and generation [34]. Its core insight is that noisy web captions can be improved through caption generation and filtering, producing better supervision for downstream learning. This line of work bridges the gap between static representation learning and text generation.</w:t>
       </w:r>
     </w:p>
     <w:p>
@@ -935,7 +963,7 @@
           <w:b w:val="0"/>
           <w:sz w:val="20"/>
         </w:rPr>
-        <w:t>Qwen-VL extends the open MLLM landscape with attention to localization, text reading, and broader multimodal tasks [11]. InternVL studies scale in vision foundation models and alignment for generic vision-language tasks [40]. CogVLM introduces a visual expert design to add visual capability while preserving language ability [7]. These systems show that MLLM architecture is not converging to one simple pattern. Instead, the field is testing several hypotheses about how to best preserve both visual detail and language competence.</w:t>
+        <w:t>Qwen-VL extends the open MLLM landscape with attention to localization, text reading, and broader multimodal tasks [11]. InternVL studies scale in vision foundation models and alignment for generic vision-language tasks [45]. CogVLM introduces a visual expert design to add visual capability while preserving language ability [7]. These systems show that MLLM architecture is not converging to one simple pattern. Instead, the field is testing several hypotheses about how to best preserve both visual detail and language competence.</w:t>
       </w:r>
     </w:p>
     <w:p>
@@ -1780,7 +1808,7 @@
           <w:b w:val="0"/>
           <w:sz w:val="20"/>
         </w:rPr>
-        <w:t>Generative pretraining teaches models to produce text from visual input. Captioning encourages the model to describe salient objects, attributes, and relations. However, captions are often incomplete. A caption may ignore details that are crucial for a later question. If a model is trained primarily on captions, it may underperform on tasks that require reading text, locating small objects, or answering unusual questions. BLIP-style bootstrapping addresses part of this issue by improving caption quality [29].</w:t>
+        <w:t>Generative pretraining teaches models to produce text from visual input. Captioning encourages the model to describe salient objects, attributes, and relations. However, captions are often incomplete. A caption may ignore details that are crucial for a later question. If a model is trained primarily on captions, it may underperform on tasks that require reading text, locating small objects, or answering unusual questions. BLIP-style bootstrapping addresses part of this issue by improving caption quality [34].</w:t>
       </w:r>
     </w:p>
     <w:p>
@@ -1849,6 +1877,20 @@
           <w:sz w:val="20"/>
         </w:rPr>
         <w:t>The strength of instruction tuning is behavioral alignment. It teaches the model to respond in a way users expect. The weakness is dependency on data quality. If training examples contain ungrounded claims, models can learn to hallucinate. If examples overrepresent certain domains, models may fail in underrepresented visual styles. If synthetic data is generated by a closed model, errors and biases may transfer into the open model.</w:t>
+      </w:r>
+    </w:p>
+    <w:p>
+      <w:pPr>
+        <w:spacing w:line="276" w:lineRule="auto" w:after="60"/>
+        <w:jc w:val="both"/>
+      </w:pPr>
+      <w:r>
+        <w:rPr>
+          <w:rFonts w:ascii="Times New Roman" w:hAnsi="Times New Roman" w:eastAsia="SimSun"/>
+          <w:b w:val="0"/>
+          <w:sz w:val="20"/>
+        </w:rPr>
+        <w:t>Parameter-efficient and feedback-based alignment methods also influence how open MLLMs are adapted. LoRA and QLoRA reduce the cost of fine-tuning large backbones by updating low-rank or quantized adaptation parameters rather than all weights [63] [64]. Human-feedback instruction following, developed first in text-only settings, remains relevant because multimodal assistants must learn when to answer, refuse, or express uncertainty [65]. Reasoning-oriented prompting and multimodal chain-of-thought studies further show why MLLM outputs should be evaluated for reasoning quality, not only final answer strings [66] [67].</w:t>
       </w:r>
     </w:p>
     <w:p>
@@ -2622,7 +2664,7 @@
           <w:b w:val="0"/>
           <w:sz w:val="20"/>
         </w:rPr>
-        <w:t>Qualitatively, the literature supports several defensible comparisons. Contrastive models such as CLIP are strong representation learners but are not full conversational MLLMs [3]. Flamingo and BLIP-2 demonstrate that frozen components and learned connectors can produce strong multimodal generation and few-shot adaptation [5] [6]. LLaVA and InstructBLIP show that instruction tuning is essential for assistant-like behavior [8] [9]. Qwen-VL, InternVL, and CogVLM represent later efforts to expand grounding, scale, and visual expertise [11] [40] [7]. Closed systems such as GPT-4V remain important external references but cannot be fully reproduced from public information [12].</w:t>
+        <w:t>Qualitatively, the literature supports several defensible comparisons. Contrastive models such as CLIP are strong representation learners but are not full conversational MLLMs [3]. Flamingo and BLIP-2 demonstrate that frozen components and learned connectors can produce strong multimodal generation and few-shot adaptation [5] [6]. LLaVA and InstructBLIP show that instruction tuning is essential for assistant-like behavior [8] [9]. Qwen-VL, InternVL, and CogVLM represent later efforts to expand grounding, scale, and visual expertise [11] [45] [7]. Closed systems such as GPT-4V remain important external references but cannot be fully reproduced from public information [12].</w:t>
       </w:r>
     </w:p>
     <w:p>
@@ -3987,7 +4029,7 @@
           <w:b w:val="0"/>
           <w:sz w:val="20"/>
         </w:rPr>
-        <w:t>[23] Lu Jiasen, Batra Dhruv, Parikh Devi, et al. ViLBERT: Pretraining Task-Agnostic Visiolinguistic Representations for Vision-and-Language Tasks[C]. Advances in Neural Information Processing Systems, 2019.</w:t>
+        <w:t>[23] Yin Shukang, Fu Chaoyou, Zhao Sirui, et al. A Survey on Multimodal Large Language Models[J]. arXiv preprint arXiv:2306.13549, 2023.</w:t>
       </w:r>
     </w:p>
     <w:p>
@@ -4001,7 +4043,7 @@
           <w:b w:val="0"/>
           <w:sz w:val="20"/>
         </w:rPr>
-        <w:t>[24] Tan Hao, Bansal Mohit. LXMERT: Learning Cross-Modality Encoder Representations from Transformers[C]. Proceedings of the 2019 Conference on Empirical Methods in Natural Language Processing and the 9th International Joint Conference on Natural Language Processing, 2019.</w:t>
+        <w:t>[24] Wu Jiayang, Gan Wensheng, Chen Zefeng, et al. Multimodal Large Language Models: A Survey[J]. arXiv preprint arXiv:2311.13165, 2023.</w:t>
       </w:r>
     </w:p>
     <w:p>
@@ -4015,7 +4057,7 @@
           <w:b w:val="0"/>
           <w:sz w:val="20"/>
         </w:rPr>
-        <w:t>[25] Chen Yen-Chun, Li Linjie, Yu Licheng, et al. UNITER: UNiversal Image-TExt Representation Learning[C]. European Conference on Computer Vision, 2020.</w:t>
+        <w:t>[25] Caffagni Davide, Cocchi Federico, Barsellotti Luca, et al. The Revolution of Multimodal Large Language Models: A Survey[J]. arXiv preprint arXiv:2402.12451, 2024.</w:t>
       </w:r>
     </w:p>
     <w:p>
@@ -4029,7 +4071,7 @@
           <w:b w:val="0"/>
           <w:sz w:val="20"/>
         </w:rPr>
-        <w:t>[26] Li Xiujun, Yin Xi, Li Chunyuan, et al. Oscar: Object-Semantics Aligned Pre-training for Vision-Language Tasks[C]. European Conference on Computer Vision, 2020.</w:t>
+        <w:t>[26] HITsz-TMG. Awesome Large Multimodal Reasoning Models. 2025.</w:t>
       </w:r>
     </w:p>
     <w:p>
@@ -4043,7 +4085,7 @@
           <w:b w:val="0"/>
           <w:sz w:val="20"/>
         </w:rPr>
-        <w:t>[27] Zhang Pengchuan, Li Xiujun, Hu Xiaowei, et al. VinVL: Revisiting Visual Representations in Vision-Language Models[C]. IEEE/CVF Conference on Computer Vision and Pattern Recognition, 2021.</w:t>
+        <w:t>[27] Anderson Peter, He Xiaodong, Buehler Chris, et al. Bottom-Up and Top-Down Attention for Image Captioning and Visual Question Answering[C]. IEEE Conference on Computer Vision and Pattern Recognition, 2018.</w:t>
       </w:r>
     </w:p>
     <w:p>
@@ -4057,7 +4099,7 @@
           <w:b w:val="0"/>
           <w:sz w:val="20"/>
         </w:rPr>
-        <w:t>[28] Wang Peng, Yang An, Men Rui, et al. OFA: Unifying Architectures, Tasks, and Modalities Through a Simple Sequence-to-Sequence Learning Framework[C]. International Conference on Machine Learning, 2022.</w:t>
+        <w:t>[28] Lu Jiasen, Batra Dhruv, Parikh Devi, et al. ViLBERT: Pretraining Task-Agnostic Visiolinguistic Representations for Vision-and-Language Tasks[C]. Advances in Neural Information Processing Systems, 2019.</w:t>
       </w:r>
     </w:p>
     <w:p>
@@ -4071,7 +4113,7 @@
           <w:b w:val="0"/>
           <w:sz w:val="20"/>
         </w:rPr>
-        <w:t>[29] Li Junnan, Li Dongxu, Xiong Caiming, et al. BLIP: Bootstrapping Language-Image Pre-training for Unified Vision-Language Understanding and Generation[C]. International Conference on Machine Learning, 2022.</w:t>
+        <w:t>[29] Tan Hao, Bansal Mohit. LXMERT: Learning Cross-Modality Encoder Representations from Transformers[C]. Proceedings of the 2019 Conference on Empirical Methods in Natural Language Processing and the 9th International Joint Conference on Natural Language Processing, 2019.</w:t>
       </w:r>
     </w:p>
     <w:p>
@@ -4085,7 +4127,7 @@
           <w:b w:val="0"/>
           <w:sz w:val="20"/>
         </w:rPr>
-        <w:t>[30] Chen Xi, Wang Xiao, Changpinyo Soravit, et al. PaLI: A Jointly-Scaled Multilingual Language-Image Model[J]. arXiv preprint arXiv:2209.06794, 2022.</w:t>
+        <w:t>[30] Chen Yen-Chun, Li Linjie, Yu Licheng, et al. UNITER: UNiversal Image-TExt Representation Learning[C]. European Conference on Computer Vision, 2020.</w:t>
       </w:r>
     </w:p>
     <w:p>
@@ -4099,7 +4141,7 @@
           <w:b w:val="0"/>
           <w:sz w:val="20"/>
         </w:rPr>
-        <w:t>[31] Driess Danny, Xia Fei, Sajjadi Mehdi S. M., et al. PaLM-E: An Embodied Multimodal Language Model[C]. International Conference on Machine Learning, 2023.</w:t>
+        <w:t>[31] Li Xiujun, Yin Xi, Li Chunyuan, et al. Oscar: Object-Semantics Aligned Pre-training for Vision-Language Tasks[C]. European Conference on Computer Vision, 2020.</w:t>
       </w:r>
     </w:p>
     <w:p>
@@ -4113,7 +4155,7 @@
           <w:b w:val="0"/>
           <w:sz w:val="20"/>
         </w:rPr>
-        <w:t>[32] Huang Shaohan, Dong Li, Wang Wenhui, et al. Language Is Not All You Need: Aligning Perception with Language Models[J]. arXiv preprint arXiv:2302.14045, 2023.</w:t>
+        <w:t>[32] Zhang Pengchuan, Li Xiujun, Hu Xiaowei, et al. VinVL: Revisiting Visual Representations in Vision-Language Models[C]. IEEE/CVF Conference on Computer Vision and Pattern Recognition, 2021.</w:t>
       </w:r>
     </w:p>
     <w:p>
@@ -4127,7 +4169,7 @@
           <w:b w:val="0"/>
           <w:sz w:val="20"/>
         </w:rPr>
-        <w:t>[33] Peng Zhiliang, Wang Wenhui, Dong Li, et al. Kosmos-2: Grounding Multimodal Large Language Models to the World[J]. arXiv preprint arXiv:2306.14824, 2023.</w:t>
+        <w:t>[33] Wang Peng, Yang An, Men Rui, et al. OFA: Unifying Architectures, Tasks, and Modalities Through a Simple Sequence-to-Sequence Learning Framework[C]. International Conference on Machine Learning, 2022.</w:t>
       </w:r>
     </w:p>
     <w:p>
@@ -4141,7 +4183,7 @@
           <w:b w:val="0"/>
           <w:sz w:val="20"/>
         </w:rPr>
-        <w:t>[34] Ye Qinghao, Xu Haiyang, Xu Guohai, et al. mPLUG-Owl: Modularization Empowers Large Language Models with Multimodality[J]. arXiv preprint arXiv:2304.14178, 2023.</w:t>
+        <w:t>[34] Li Junnan, Li Dongxu, Xiong Caiming, et al. BLIP: Bootstrapping Language-Image Pre-training for Unified Vision-Language Understanding and Generation[C]. International Conference on Machine Learning, 2022.</w:t>
       </w:r>
     </w:p>
     <w:p>
@@ -4155,7 +4197,7 @@
           <w:b w:val="0"/>
           <w:sz w:val="20"/>
         </w:rPr>
-        <w:t>[35] Chen Keqin, Zhang Zhao, Zeng Weili, et al. Shikra: Unleashing Multimodal LLM's Referential Dialogue Magic[J]. arXiv preprint arXiv:2306.15195, 2023.</w:t>
+        <w:t>[35] Chen Xi, Wang Xiao, Changpinyo Soravit, et al. PaLI: A Jointly-Scaled Multilingual Language-Image Model[J]. arXiv preprint arXiv:2209.06794, 2022.</w:t>
       </w:r>
     </w:p>
     <w:p>
@@ -4169,7 +4211,7 @@
           <w:b w:val="0"/>
           <w:sz w:val="20"/>
         </w:rPr>
-        <w:t>[36] You Haoxuan, Zhang Haotian, Gan Zhe, et al. Ferret: Refer and Ground Anything Anywhere at Any Granularity[C]. International Conference on Learning Representations, 2024.</w:t>
+        <w:t>[36] Driess Danny, Xia Fei, Sajjadi Mehdi S. M., et al. PaLM-E: An Embodied Multimodal Language Model[C]. International Conference on Machine Learning, 2023.</w:t>
       </w:r>
     </w:p>
     <w:p>
@@ -4183,7 +4225,7 @@
           <w:b w:val="0"/>
           <w:sz w:val="20"/>
         </w:rPr>
-        <w:t>[37] Lin Ji, Yin Hongxu, Ping Wei, et al. VILA: On Pre-training for Visual Language Models[J]. arXiv preprint arXiv:2312.07533, 2023.</w:t>
+        <w:t>[37] Huang Shaohan, Dong Li, Wang Wenhui, et al. Language Is Not All You Need: Aligning Perception with Language Models[J]. arXiv preprint arXiv:2302.14045, 2023.</w:t>
       </w:r>
     </w:p>
     <w:p>
@@ -4197,7 +4239,7 @@
           <w:b w:val="0"/>
           <w:sz w:val="20"/>
         </w:rPr>
-        <w:t>[38] Lin Bin, Ye Yang, Zhu Bin, et al. Video-LLaVA: Learning United Visual Representation by Alignment Before Projection[C]. Conference on Empirical Methods in Natural Language Processing, 2024.</w:t>
+        <w:t>[38] Peng Zhiliang, Wang Wenhui, Dong Li, et al. Kosmos-2: Grounding Multimodal Large Language Models to the World[J]. arXiv preprint arXiv:2306.14824, 2023.</w:t>
       </w:r>
     </w:p>
     <w:p>
@@ -4211,7 +4253,7 @@
           <w:b w:val="0"/>
           <w:sz w:val="20"/>
         </w:rPr>
-        <w:t>[39] Wu Chenfei, Yin Shengming, Qi Weizhen, et al. Visual ChatGPT: Talking, Drawing and Editing with Visual Foundation Models[J]. arXiv preprint arXiv:2303.04671, 2023.</w:t>
+        <w:t>[39] Ye Qinghao, Xu Haiyang, Xu Guohai, et al. mPLUG-Owl: Modularization Empowers Large Language Models with Multimodality[J]. arXiv preprint arXiv:2304.14178, 2023.</w:t>
       </w:r>
     </w:p>
     <w:p>
@@ -4225,7 +4267,7 @@
           <w:b w:val="0"/>
           <w:sz w:val="20"/>
         </w:rPr>
-        <w:t>[40] Chen Zhe, Wu Jiannan, Wang Wenhai, et al. InternVL: Scaling up Vision Foundation Models and Aligning for Generic Visual-Linguistic Tasks[C]. IEEE/CVF Conference on Computer Vision and Pattern Recognition, 2024.</w:t>
+        <w:t>[40] Chen Keqin, Zhang Zhao, Zeng Weili, et al. Shikra: Unleashing Multimodal LLM's Referential Dialogue Magic[J]. arXiv preprint arXiv:2306.15195, 2023.</w:t>
       </w:r>
     </w:p>
     <w:p>
@@ -4239,7 +4281,7 @@
           <w:b w:val="0"/>
           <w:sz w:val="20"/>
         </w:rPr>
-        <w:t>[41] Singh Amanpreet, Natarajan Vivek, Shah Meet, et al. Towards VQA Models That Can Read[C]. IEEE/CVF Conference on Computer Vision and Pattern Recognition, 2019.</w:t>
+        <w:t>[41] You Haoxuan, Zhang Haotian, Gan Zhe, et al. Ferret: Refer and Ground Anything Anywhere at Any Granularity[C]. International Conference on Learning Representations, 2024.</w:t>
       </w:r>
     </w:p>
     <w:p>
@@ -4253,7 +4295,357 @@
           <w:b w:val="0"/>
           <w:sz w:val="20"/>
         </w:rPr>
-        <w:t>[42] Masry Ahmed, Long Do Xuan, Tan Jia Qing, et al. ChartQA: A Benchmark for Question Answering about Charts with Visual and Logical Reasoning[C]. Findings of the Association for Computational Linguistics: ACL 2022, 2022.</w:t>
+        <w:t>[42] Lin Ji, Yin Hongxu, Ping Wei, et al. VILA: On Pre-training for Visual Language Models[J]. arXiv preprint arXiv:2312.07533, 2023.</w:t>
+      </w:r>
+    </w:p>
+    <w:p>
+      <w:pPr>
+        <w:spacing w:line="276" w:lineRule="auto" w:after="60"/>
+        <w:jc w:val="both"/>
+      </w:pPr>
+      <w:r>
+        <w:rPr>
+          <w:rFonts w:ascii="Times New Roman" w:hAnsi="Times New Roman" w:eastAsia="SimSun"/>
+          <w:b w:val="0"/>
+          <w:sz w:val="20"/>
+        </w:rPr>
+        <w:t>[43] Lin Bin, Ye Yang, Zhu Bin, et al. Video-LLaVA: Learning United Visual Representation by Alignment Before Projection[C]. Conference on Empirical Methods in Natural Language Processing, 2024.</w:t>
+      </w:r>
+    </w:p>
+    <w:p>
+      <w:pPr>
+        <w:spacing w:line="276" w:lineRule="auto" w:after="60"/>
+        <w:jc w:val="both"/>
+      </w:pPr>
+      <w:r>
+        <w:rPr>
+          <w:rFonts w:ascii="Times New Roman" w:hAnsi="Times New Roman" w:eastAsia="SimSun"/>
+          <w:b w:val="0"/>
+          <w:sz w:val="20"/>
+        </w:rPr>
+        <w:t>[44] Wu Chenfei, Yin Shengming, Qi Weizhen, et al. Visual ChatGPT: Talking, Drawing and Editing with Visual Foundation Models[J]. arXiv preprint arXiv:2303.04671, 2023.</w:t>
+      </w:r>
+    </w:p>
+    <w:p>
+      <w:pPr>
+        <w:spacing w:line="276" w:lineRule="auto" w:after="60"/>
+        <w:jc w:val="both"/>
+      </w:pPr>
+      <w:r>
+        <w:rPr>
+          <w:rFonts w:ascii="Times New Roman" w:hAnsi="Times New Roman" w:eastAsia="SimSun"/>
+          <w:b w:val="0"/>
+          <w:sz w:val="20"/>
+        </w:rPr>
+        <w:t>[45] Chen Zhe, Wu Jiannan, Wang Wenhai, et al. InternVL: Scaling up Vision Foundation Models and Aligning for Generic Visual-Linguistic Tasks[C]. IEEE/CVF Conference on Computer Vision and Pattern Recognition, 2024.</w:t>
+      </w:r>
+    </w:p>
+    <w:p>
+      <w:pPr>
+        <w:spacing w:line="276" w:lineRule="auto" w:after="60"/>
+        <w:jc w:val="both"/>
+      </w:pPr>
+      <w:r>
+        <w:rPr>
+          <w:rFonts w:ascii="Times New Roman" w:hAnsi="Times New Roman" w:eastAsia="SimSun"/>
+          <w:b w:val="0"/>
+          <w:sz w:val="20"/>
+        </w:rPr>
+        <w:t>[46] Achiam Josh, Adler Steven, Agarwal Sandhini, et al. GPT-4 Technical Report[J]. arXiv preprint arXiv:2303.08774, 2023.</w:t>
+      </w:r>
+    </w:p>
+    <w:p>
+      <w:pPr>
+        <w:spacing w:line="276" w:lineRule="auto" w:after="60"/>
+        <w:jc w:val="both"/>
+      </w:pPr>
+      <w:r>
+        <w:rPr>
+          <w:rFonts w:ascii="Times New Roman" w:hAnsi="Times New Roman" w:eastAsia="SimSun"/>
+          <w:b w:val="0"/>
+          <w:sz w:val="20"/>
+        </w:rPr>
+        <w:t>[47] Anil Rohan, Borgeaud Sebastian, Wu Yonghui, et al. Gemini: A Family of Highly Capable Multimodal Models[J]. arXiv preprint arXiv:2312.11805, 2023.</w:t>
+      </w:r>
+    </w:p>
+    <w:p>
+      <w:pPr>
+        <w:spacing w:line="276" w:lineRule="auto" w:after="60"/>
+        <w:jc w:val="both"/>
+      </w:pPr>
+      <w:r>
+        <w:rPr>
+          <w:rFonts w:ascii="Times New Roman" w:hAnsi="Times New Roman" w:eastAsia="SimSun"/>
+          <w:b w:val="0"/>
+          <w:sz w:val="20"/>
+        </w:rPr>
+        <w:t>[48] Awadalla Anas, Gao Irena, Gardner Josh, et al. OpenFlamingo: An Open-Source Framework for Training Large Autoregressive Vision-Language Models[J]. arXiv preprint arXiv:2308.01390, 2023.</w:t>
+      </w:r>
+    </w:p>
+    <w:p>
+      <w:pPr>
+        <w:spacing w:line="276" w:lineRule="auto" w:after="60"/>
+        <w:jc w:val="both"/>
+      </w:pPr>
+      <w:r>
+        <w:rPr>
+          <w:rFonts w:ascii="Times New Roman" w:hAnsi="Times New Roman" w:eastAsia="SimSun"/>
+          <w:b w:val="0"/>
+          <w:sz w:val="20"/>
+        </w:rPr>
+        <w:t>[49] Laurencon Hugo, Saulnier Lucile, Tronchon Loic, et al. Obelics: An Open Web-Scale Filtered Dataset of Interleaved Image-Text Documents[J]. arXiv preprint arXiv:2306.16527, 2023.</w:t>
+      </w:r>
+    </w:p>
+    <w:p>
+      <w:pPr>
+        <w:spacing w:line="276" w:lineRule="auto" w:after="60"/>
+        <w:jc w:val="both"/>
+      </w:pPr>
+      <w:r>
+        <w:rPr>
+          <w:rFonts w:ascii="Times New Roman" w:hAnsi="Times New Roman" w:eastAsia="SimSun"/>
+          <w:b w:val="0"/>
+          <w:sz w:val="20"/>
+        </w:rPr>
+        <w:t>[50] Girdhar Rohit, El-Nouby Alaaeldin, Liu Zhuang, et al. ImageBind: One Embedding Space To Bind Them All[C]. IEEE/CVF Conference on Computer Vision and Pattern Recognition, 2023.</w:t>
+      </w:r>
+    </w:p>
+    <w:p>
+      <w:pPr>
+        <w:spacing w:line="276" w:lineRule="auto" w:after="60"/>
+        <w:jc w:val="both"/>
+      </w:pPr>
+      <w:r>
+        <w:rPr>
+          <w:rFonts w:ascii="Times New Roman" w:hAnsi="Times New Roman" w:eastAsia="SimSun"/>
+          <w:b w:val="0"/>
+          <w:sz w:val="20"/>
+        </w:rPr>
+        <w:t>[51] Wu Shengqiong, Fei Hao, Qu Leigang, et al. NExT-GPT: Any-to-Any Multimodal LLM[J]. arXiv preprint arXiv:2309.05519, 2023.</w:t>
+      </w:r>
+    </w:p>
+    <w:p>
+      <w:pPr>
+        <w:spacing w:line="276" w:lineRule="auto" w:after="60"/>
+        <w:jc w:val="both"/>
+      </w:pPr>
+      <w:r>
+        <w:rPr>
+          <w:rFonts w:ascii="Times New Roman" w:hAnsi="Times New Roman" w:eastAsia="SimSun"/>
+          <w:b w:val="0"/>
+          <w:sz w:val="20"/>
+        </w:rPr>
+        <w:t>[52] Li Yanwei, Wang Chengyao, Jia Jiaya. LLaMA-VID: An Image is Worth 2 Tokens in Large Language Models[J]. arXiv preprint arXiv:2311.17043, 2023.</w:t>
+      </w:r>
+    </w:p>
+    <w:p>
+      <w:pPr>
+        <w:spacing w:line="276" w:lineRule="auto" w:after="60"/>
+        <w:jc w:val="both"/>
+      </w:pPr>
+      <w:r>
+        <w:rPr>
+          <w:rFonts w:ascii="Times New Roman" w:hAnsi="Times New Roman" w:eastAsia="SimSun"/>
+          <w:b w:val="0"/>
+          <w:sz w:val="20"/>
+        </w:rPr>
+        <w:t>[53] Maaz Muhammad, Rasheed Hanoona, Khan Salman, et al. Video-ChatGPT: Towards Detailed Video Understanding via Large Vision and Language Models[J]. arXiv preprint arXiv:2306.05424, 2023.</w:t>
+      </w:r>
+    </w:p>
+    <w:p>
+      <w:pPr>
+        <w:spacing w:line="276" w:lineRule="auto" w:after="60"/>
+        <w:jc w:val="both"/>
+      </w:pPr>
+      <w:r>
+        <w:rPr>
+          <w:rFonts w:ascii="Times New Roman" w:hAnsi="Times New Roman" w:eastAsia="SimSun"/>
+          <w:b w:val="0"/>
+          <w:sz w:val="20"/>
+        </w:rPr>
+        <w:t>[54] Chen Chi, Du Yiyang, Fang Zheng, et al. Model Composition for Multimodal Large Language Models[C]. Proceedings of the 62nd Annual Meeting of the Association for Computational Linguistics, 2024.</w:t>
+      </w:r>
+    </w:p>
+    <w:p>
+      <w:pPr>
+        <w:spacing w:line="276" w:lineRule="auto" w:after="60"/>
+        <w:jc w:val="both"/>
+      </w:pPr>
+      <w:r>
+        <w:rPr>
+          <w:rFonts w:ascii="Times New Roman" w:hAnsi="Times New Roman" w:eastAsia="SimSun"/>
+          <w:b w:val="0"/>
+          <w:sz w:val="20"/>
+        </w:rPr>
+        <w:t>[55] Schwenk Dustin, Khandelwal Apoorv, Clark Christopher, et al. A-OKVQA: A Benchmark for Visual Question Answering Using World Knowledge[C]. European Conference on Computer Vision, 2022.</w:t>
+      </w:r>
+    </w:p>
+    <w:p>
+      <w:pPr>
+        <w:spacing w:line="276" w:lineRule="auto" w:after="60"/>
+        <w:jc w:val="both"/>
+      </w:pPr>
+      <w:r>
+        <w:rPr>
+          <w:rFonts w:ascii="Times New Roman" w:hAnsi="Times New Roman" w:eastAsia="SimSun"/>
+          <w:b w:val="0"/>
+          <w:sz w:val="20"/>
+        </w:rPr>
+        <w:t>[56] Johnson Justin, Hariharan Bharath, van der Maaten Laurens, et al. CLEVR: A Diagnostic Dataset for Compositional Language and Elementary Visual Reasoning[C]. IEEE Conference on Computer Vision and Pattern Recognition, 2017.</w:t>
+      </w:r>
+    </w:p>
+    <w:p>
+      <w:pPr>
+        <w:spacing w:line="276" w:lineRule="auto" w:after="60"/>
+        <w:jc w:val="both"/>
+      </w:pPr>
+      <w:r>
+        <w:rPr>
+          <w:rFonts w:ascii="Times New Roman" w:hAnsi="Times New Roman" w:eastAsia="SimSun"/>
+          <w:b w:val="0"/>
+          <w:sz w:val="20"/>
+        </w:rPr>
+        <w:t>[57] Singh Amanpreet, Natarajan Vivek, Shah Meet, et al. Towards VQA Models That Can Read[C]. IEEE/CVF Conference on Computer Vision and Pattern Recognition, 2019.</w:t>
+      </w:r>
+    </w:p>
+    <w:p>
+      <w:pPr>
+        <w:spacing w:line="276" w:lineRule="auto" w:after="60"/>
+        <w:jc w:val="both"/>
+      </w:pPr>
+      <w:r>
+        <w:rPr>
+          <w:rFonts w:ascii="Times New Roman" w:hAnsi="Times New Roman" w:eastAsia="SimSun"/>
+          <w:b w:val="0"/>
+          <w:sz w:val="20"/>
+        </w:rPr>
+        <w:t>[58] Mathew Minesh, Karatzas Dimosthenis, Jawahar C. V. DocVQA: A Dataset for VQA on Document Images[C]. IEEE Winter Conference on Applications of Computer Vision, 2021.</w:t>
+      </w:r>
+    </w:p>
+    <w:p>
+      <w:pPr>
+        <w:spacing w:line="276" w:lineRule="auto" w:after="60"/>
+        <w:jc w:val="both"/>
+      </w:pPr>
+      <w:r>
+        <w:rPr>
+          <w:rFonts w:ascii="Times New Roman" w:hAnsi="Times New Roman" w:eastAsia="SimSun"/>
+          <w:b w:val="0"/>
+          <w:sz w:val="20"/>
+        </w:rPr>
+        <w:t>[59] Masry Ahmed, Long Do Xuan, Tan Jia Qing, et al. ChartQA: A Benchmark for Question Answering about Charts with Visual and Logical Reasoning[C]. Findings of the Association for Computational Linguistics: ACL 2022, 2022.</w:t>
+      </w:r>
+    </w:p>
+    <w:p>
+      <w:pPr>
+        <w:spacing w:line="276" w:lineRule="auto" w:after="60"/>
+        <w:jc w:val="both"/>
+      </w:pPr>
+      <w:r>
+        <w:rPr>
+          <w:rFonts w:ascii="Times New Roman" w:hAnsi="Times New Roman" w:eastAsia="SimSun"/>
+          <w:b w:val="0"/>
+          <w:sz w:val="20"/>
+        </w:rPr>
+        <w:t>[60] Li Bohao, Wang Rui, Wang Guangzhi, et al. SEED-Bench: Benchmarking Multimodal LLMs with Generative Comprehension[J]. arXiv preprint arXiv:2307.16125, 2023.</w:t>
+      </w:r>
+    </w:p>
+    <w:p>
+      <w:pPr>
+        <w:spacing w:line="276" w:lineRule="auto" w:after="60"/>
+        <w:jc w:val="both"/>
+      </w:pPr>
+      <w:r>
+        <w:rPr>
+          <w:rFonts w:ascii="Times New Roman" w:hAnsi="Times New Roman" w:eastAsia="SimSun"/>
+          <w:b w:val="0"/>
+          <w:sz w:val="20"/>
+        </w:rPr>
+        <w:t>[61] Guan Tianrui, Liu Fuxiao, Wu Xiyang, et al. HallusionBench: An Advanced Diagnostic Suite for Entangled Language Hallucination and Visual Illusion in Large Vision-Language Models[J]. arXiv preprint arXiv:2310.14566, 2023.</w:t>
+      </w:r>
+    </w:p>
+    <w:p>
+      <w:pPr>
+        <w:spacing w:line="276" w:lineRule="auto" w:after="60"/>
+        <w:jc w:val="both"/>
+      </w:pPr>
+      <w:r>
+        <w:rPr>
+          <w:rFonts w:ascii="Times New Roman" w:hAnsi="Times New Roman" w:eastAsia="SimSun"/>
+          <w:b w:val="0"/>
+          <w:sz w:val="20"/>
+        </w:rPr>
+        <w:t>[62] Lin Peiqin, Lyu Chenyang, Luo Wenjiang, et al. CulturALL: Benchmarking Multilingual and Multicultural Competence of LLMs on Grounded Tasks[J]. arXiv preprint arXiv:2604.19262, 2026.</w:t>
+      </w:r>
+    </w:p>
+    <w:p>
+      <w:pPr>
+        <w:spacing w:line="276" w:lineRule="auto" w:after="60"/>
+        <w:jc w:val="both"/>
+      </w:pPr>
+      <w:r>
+        <w:rPr>
+          <w:rFonts w:ascii="Times New Roman" w:hAnsi="Times New Roman" w:eastAsia="SimSun"/>
+          <w:b w:val="0"/>
+          <w:sz w:val="20"/>
+        </w:rPr>
+        <w:t>[63] Hu Edward J., Shen Yelong, Wallis Phillip, et al. LoRA: Low-Rank Adaptation of Large Language Models[C]. International Conference on Learning Representations, 2022.</w:t>
+      </w:r>
+    </w:p>
+    <w:p>
+      <w:pPr>
+        <w:spacing w:line="276" w:lineRule="auto" w:after="60"/>
+        <w:jc w:val="both"/>
+      </w:pPr>
+      <w:r>
+        <w:rPr>
+          <w:rFonts w:ascii="Times New Roman" w:hAnsi="Times New Roman" w:eastAsia="SimSun"/>
+          <w:b w:val="0"/>
+          <w:sz w:val="20"/>
+        </w:rPr>
+        <w:t>[64] Dettmers Tim, Pagnoni Artidoro, Holtzman Ari, et al. QLoRA: Efficient Finetuning of Quantized LLMs[C]. Advances in Neural Information Processing Systems, 2024.</w:t>
+      </w:r>
+    </w:p>
+    <w:p>
+      <w:pPr>
+        <w:spacing w:line="276" w:lineRule="auto" w:after="60"/>
+        <w:jc w:val="both"/>
+      </w:pPr>
+      <w:r>
+        <w:rPr>
+          <w:rFonts w:ascii="Times New Roman" w:hAnsi="Times New Roman" w:eastAsia="SimSun"/>
+          <w:b w:val="0"/>
+          <w:sz w:val="20"/>
+        </w:rPr>
+        <w:t>[65] Ouyang Long, Wu Jeffrey, Jiang Xu, et al. Training Language Models to Follow Instructions with Human Feedback[C]. Advances in Neural Information Processing Systems, 2022.</w:t>
+      </w:r>
+    </w:p>
+    <w:p>
+      <w:pPr>
+        <w:spacing w:line="276" w:lineRule="auto" w:after="60"/>
+        <w:jc w:val="both"/>
+      </w:pPr>
+      <w:r>
+        <w:rPr>
+          <w:rFonts w:ascii="Times New Roman" w:hAnsi="Times New Roman" w:eastAsia="SimSun"/>
+          <w:b w:val="0"/>
+          <w:sz w:val="20"/>
+        </w:rPr>
+        <w:t>[66] Wei Jason, Wang Xuezhi, Schuurmans Dale, et al. Chain-of-Thought Prompting Elicits Reasoning in Large Language Models[C]. Advances in Neural Information Processing Systems, 2022.</w:t>
+      </w:r>
+    </w:p>
+    <w:p>
+      <w:pPr>
+        <w:spacing w:line="276" w:lineRule="auto" w:after="60"/>
+        <w:jc w:val="both"/>
+      </w:pPr>
+      <w:r>
+        <w:rPr>
+          <w:rFonts w:ascii="Times New Roman" w:hAnsi="Times New Roman" w:eastAsia="SimSun"/>
+          <w:b w:val="0"/>
+          <w:sz w:val="20"/>
+        </w:rPr>
+        <w:t>[67] Zhang Zhuosheng, Zhang Aston, Li Mu, et al. Multimodal Chain-of-Thought Reasoning in Language Models[J]. arXiv preprint arXiv:2302.00923, 2023.</w:t>
       </w:r>
     </w:p>
     <w:sectPr>

</xml_diff>

<commit_message>
Apply professional MLLM survey revision
</commit_message>
<xml_diff>
--- a/paper/paper_chinaxiv.docx
+++ b/paper/paper_chinaxiv.docx
@@ -207,6 +207,33 @@
     </w:p>
     <w:p>
       <w:pPr>
+        <w:spacing w:before="160" w:after="80"/>
+      </w:pPr>
+      <w:r>
+        <w:rPr>
+          <w:rFonts w:ascii="Times New Roman" w:hAnsi="Times New Roman" w:eastAsia="SimSun"/>
+          <w:b/>
+          <w:sz w:val="20"/>
+        </w:rPr>
+        <w:t>Author's Analysis</w:t>
+      </w:r>
+    </w:p>
+    <w:p>
+      <w:pPr>
+        <w:spacing w:line="276" w:lineRule="auto" w:after="60"/>
+        <w:jc w:val="both"/>
+      </w:pPr>
+      <w:r>
+        <w:rPr>
+          <w:rFonts w:ascii="Times New Roman" w:hAnsi="Times New Roman" w:eastAsia="SimSun"/>
+          <w:b w:val="0"/>
+          <w:sz w:val="20"/>
+        </w:rPr>
+        <w:t>This survey argues that the main research challenge in MLLMs is not simply adding images to language models. The deeper problem is how to preserve visual evidence while benefiting from the abstraction and reasoning capacity of language models. Existing evidence indicates that many impressive demonstrations still depend on fragile interactions between visual encoders, connectors, prompts, and language priors. For this reason, the paper treats architecture, grounding, evaluation, and reproducibility as one connected problem rather than as separate topics.</w:t>
+      </w:r>
+    </w:p>
+    <w:p>
+      <w:pPr>
         <w:spacing w:before="240" w:after="120"/>
       </w:pPr>
       <w:r>
@@ -332,6 +359,33 @@
     </w:p>
     <w:p>
       <w:pPr>
+        <w:spacing w:before="160" w:after="80"/>
+      </w:pPr>
+      <w:r>
+        <w:rPr>
+          <w:rFonts w:ascii="Times New Roman" w:hAnsi="Times New Roman" w:eastAsia="SimSun"/>
+          <w:b/>
+          <w:sz w:val="20"/>
+        </w:rPr>
+        <w:t>Author's Analysis</w:t>
+      </w:r>
+    </w:p>
+    <w:p>
+      <w:pPr>
+        <w:spacing w:line="276" w:lineRule="auto" w:after="60"/>
+        <w:jc w:val="both"/>
+      </w:pPr>
+      <w:r>
+        <w:rPr>
+          <w:rFonts w:ascii="Times New Roman" w:hAnsi="Times New Roman" w:eastAsia="SimSun"/>
+          <w:b w:val="0"/>
+          <w:sz w:val="20"/>
+        </w:rPr>
+        <w:t>The related literature suggests a transition from task-specific vision-language systems to general multimodal interfaces. However, the transition is incomplete. Many open systems inherit strong image encoders and language models, but their connectors and training data often determine whether the final system is genuinely grounded. The literature also shows a reproducibility divide: open models support inspection and ablation, while frontier closed systems influence expectations but cannot be scientifically reproduced from public information alone.</w:t>
+      </w:r>
+    </w:p>
+    <w:p>
+      <w:pPr>
         <w:spacing w:before="240" w:after="120"/>
       </w:pPr>
       <w:r>
@@ -471,6 +525,85 @@
     </w:p>
     <w:p>
       <w:pPr>
+        <w:spacing w:before="160" w:after="80"/>
+      </w:pPr>
+      <w:r>
+        <w:rPr>
+          <w:rFonts w:ascii="Times New Roman" w:hAnsi="Times New Roman" w:eastAsia="SimSun"/>
+          <w:b/>
+          <w:sz w:val="20"/>
+        </w:rPr>
+        <w:t>Author's Analysis</w:t>
+      </w:r>
+    </w:p>
+    <w:p>
+      <w:pPr>
+        <w:spacing w:line="276" w:lineRule="auto" w:after="60"/>
+        <w:jc w:val="both"/>
+      </w:pPr>
+      <w:r>
+        <w:rPr>
+          <w:rFonts w:ascii="Times New Roman" w:hAnsi="Times New Roman" w:eastAsia="SimSun"/>
+          <w:b w:val="0"/>
+          <w:sz w:val="20"/>
+        </w:rPr>
+        <w:t>The most important theoretical issue is the visual-token bottleneck. A model cannot reason over evidence that has been discarded before the language model receives it. This survey therefore views connectors not as minor engineering components but as epistemic filters: they decide what the language model is allowed to know about the image. Future theory should explain not only how to align modalities, but also how to measure information loss, uncertainty, and evidence faithfulness during visual-to-language transfer.</w:t>
+      </w:r>
+    </w:p>
+    <w:p>
+      <w:pPr>
+        <w:jc w:val="center"/>
+      </w:pPr>
+      <w:r>
+        <w:drawing>
+          <wp:inline xmlns:a="http://schemas.openxmlformats.org/drawingml/2006/main" xmlns:pic="http://schemas.openxmlformats.org/drawingml/2006/picture">
+            <wp:extent cx="4248000" cy="2055484"/>
+            <wp:docPr id="1" name="Picture 1"/>
+            <wp:cNvGraphicFramePr>
+              <a:graphicFrameLocks noChangeAspect="1"/>
+            </wp:cNvGraphicFramePr>
+            <a:graphic>
+              <a:graphicData uri="http://schemas.openxmlformats.org/drawingml/2006/picture">
+                <pic:pic>
+                  <pic:nvPicPr>
+                    <pic:cNvPr id="0" name="architecture_diagram.png"/>
+                    <pic:cNvPicPr/>
+                  </pic:nvPicPr>
+                  <pic:blipFill>
+                    <a:blip r:embed="rId10"/>
+                    <a:stretch>
+                      <a:fillRect/>
+                    </a:stretch>
+                  </pic:blipFill>
+                  <pic:spPr>
+                    <a:xfrm>
+                      <a:off x="0" y="0"/>
+                      <a:ext cx="4248000" cy="2055484"/>
+                    </a:xfrm>
+                    <a:prstGeom prst="rect"/>
+                  </pic:spPr>
+                </pic:pic>
+              </a:graphicData>
+            </a:graphic>
+          </wp:inline>
+        </w:drawing>
+      </w:r>
+    </w:p>
+    <w:p>
+      <w:pPr>
+        <w:jc w:val="center"/>
+      </w:pPr>
+      <w:r>
+        <w:rPr>
+          <w:rFonts w:ascii="Times New Roman" w:hAnsi="Times New Roman" w:eastAsia="SimSun"/>
+          <w:b/>
+          <w:sz w:val="16"/>
+        </w:rPr>
+        <w:t>Figure 1. General MLLM architecture and information-flow bottleneck.</w:t>
+      </w:r>
+    </w:p>
+    <w:p>
+      <w:pPr>
         <w:spacing w:before="240" w:after="120"/>
       </w:pPr>
       <w:r>
@@ -764,6 +897,33 @@
     </w:p>
     <w:p>
       <w:pPr>
+        <w:spacing w:before="160" w:after="80"/>
+      </w:pPr>
+      <w:r>
+        <w:rPr>
+          <w:rFonts w:ascii="Times New Roman" w:hAnsi="Times New Roman" w:eastAsia="SimSun"/>
+          <w:b/>
+          <w:sz w:val="20"/>
+        </w:rPr>
+        <w:t>Author's Analysis</w:t>
+      </w:r>
+    </w:p>
+    <w:p>
+      <w:pPr>
+        <w:spacing w:line="276" w:lineRule="auto" w:after="60"/>
+        <w:jc w:val="both"/>
+      </w:pPr>
+      <w:r>
+        <w:rPr>
+          <w:rFonts w:ascii="Times New Roman" w:hAnsi="Times New Roman" w:eastAsia="SimSun"/>
+          <w:b w:val="0"/>
+          <w:sz w:val="20"/>
+        </w:rPr>
+        <w:t>The methodology is intentionally conservative. It does not attempt to produce a leaderboard because no models were executed under controlled conditions. This is a strength rather than a weakness for a survey paper: it prevents unsupported empirical claims and focuses the contribution on organization, comparison, and reproducibility. The main limitation of the method is that qualitative comparison depends on the quality and representativeness of selected literature, so the bibliography must remain transparent and updateable.</w:t>
+      </w:r>
+    </w:p>
+    <w:p>
+      <w:pPr>
         <w:spacing w:before="240" w:after="120"/>
       </w:pPr>
       <w:r>
@@ -1202,6 +1362,33 @@
     </w:p>
     <w:p>
       <w:pPr>
+        <w:spacing w:before="160" w:after="80"/>
+      </w:pPr>
+      <w:r>
+        <w:rPr>
+          <w:rFonts w:ascii="Times New Roman" w:hAnsi="Times New Roman" w:eastAsia="SimSun"/>
+          <w:b/>
+          <w:sz w:val="20"/>
+        </w:rPr>
+        <w:t>Author's Analysis</w:t>
+      </w:r>
+    </w:p>
+    <w:p>
+      <w:pPr>
+        <w:spacing w:line="276" w:lineRule="auto" w:after="60"/>
+        <w:jc w:val="both"/>
+      </w:pPr>
+      <w:r>
+        <w:rPr>
+          <w:rFonts w:ascii="Times New Roman" w:hAnsi="Times New Roman" w:eastAsia="SimSun"/>
+          <w:b w:val="0"/>
+          <w:sz w:val="20"/>
+        </w:rPr>
+        <w:t>Architecture design in MLLMs is a sequence of trade-offs. A simple projection connector is cheap but can lose visual detail. A query transformer improves selectivity but may hide what evidence was discarded. Cross-attention is expressive but expensive. Visual-expert modules preserve specialized perception but add system complexity. This survey argues that future architectures should be judged by evidence preservation, controllability, and auditability, not only by benchmark rank.</w:t>
+      </w:r>
+    </w:p>
+    <w:p>
+      <w:pPr>
         <w:jc w:val="center"/>
       </w:pPr>
       <w:r>
@@ -1210,7 +1397,1735 @@
           <w:b/>
           <w:sz w:val="16"/>
         </w:rPr>
-        <w:t>Table 1. Representative MLLM architecture taxonomy.</w:t>
+        <w:t>Table 1. Comprehensive comparison of representative MLLMs.</w:t>
+      </w:r>
+    </w:p>
+    <w:tbl>
+      <w:tblPr>
+        <w:tblStyle w:val="TableGrid"/>
+        <w:tblW w:type="auto" w:w="0"/>
+        <w:tblLook w:firstColumn="1" w:firstRow="1" w:lastColumn="0" w:lastRow="0" w:noHBand="0" w:noVBand="1" w:val="04A0"/>
+      </w:tblPr>
+      <w:tblGrid>
+        <w:gridCol w:w="861"/>
+        <w:gridCol w:w="861"/>
+        <w:gridCol w:w="861"/>
+        <w:gridCol w:w="861"/>
+        <w:gridCol w:w="861"/>
+        <w:gridCol w:w="861"/>
+        <w:gridCol w:w="861"/>
+        <w:gridCol w:w="861"/>
+      </w:tblGrid>
+      <w:tr>
+        <w:tc>
+          <w:tcPr>
+            <w:tcW w:type="dxa" w:w="861"/>
+            <w:shd w:fill="D9EAF7"/>
+          </w:tcPr>
+          <w:p>
+            <w:r/>
+            <w:r>
+              <w:rPr>
+                <w:rFonts w:ascii="Times New Roman" w:hAnsi="Times New Roman" w:eastAsia="SimSun"/>
+                <w:b/>
+                <w:sz w:val="12"/>
+              </w:rPr>
+              <w:t>Model</w:t>
+            </w:r>
+          </w:p>
+        </w:tc>
+        <w:tc>
+          <w:tcPr>
+            <w:tcW w:type="dxa" w:w="861"/>
+            <w:shd w:fill="D9EAF7"/>
+          </w:tcPr>
+          <w:p>
+            <w:r/>
+            <w:r>
+              <w:rPr>
+                <w:rFonts w:ascii="Times New Roman" w:hAnsi="Times New Roman" w:eastAsia="SimSun"/>
+                <w:b/>
+                <w:sz w:val="12"/>
+              </w:rPr>
+              <w:t>Year</w:t>
+            </w:r>
+          </w:p>
+        </w:tc>
+        <w:tc>
+          <w:tcPr>
+            <w:tcW w:type="dxa" w:w="861"/>
+            <w:shd w:fill="D9EAF7"/>
+          </w:tcPr>
+          <w:p>
+            <w:r/>
+            <w:r>
+              <w:rPr>
+                <w:rFonts w:ascii="Times New Roman" w:hAnsi="Times New Roman" w:eastAsia="SimSun"/>
+                <w:b/>
+                <w:sz w:val="12"/>
+              </w:rPr>
+              <w:t>Vision Encoder</w:t>
+            </w:r>
+          </w:p>
+        </w:tc>
+        <w:tc>
+          <w:tcPr>
+            <w:tcW w:type="dxa" w:w="861"/>
+            <w:shd w:fill="D9EAF7"/>
+          </w:tcPr>
+          <w:p>
+            <w:r/>
+            <w:r>
+              <w:rPr>
+                <w:rFonts w:ascii="Times New Roman" w:hAnsi="Times New Roman" w:eastAsia="SimSun"/>
+                <w:b/>
+                <w:sz w:val="12"/>
+              </w:rPr>
+              <w:t>LLM Backbone</w:t>
+            </w:r>
+          </w:p>
+        </w:tc>
+        <w:tc>
+          <w:tcPr>
+            <w:tcW w:type="dxa" w:w="861"/>
+            <w:shd w:fill="D9EAF7"/>
+          </w:tcPr>
+          <w:p>
+            <w:r/>
+            <w:r>
+              <w:rPr>
+                <w:rFonts w:ascii="Times New Roman" w:hAnsi="Times New Roman" w:eastAsia="SimSun"/>
+                <w:b/>
+                <w:sz w:val="12"/>
+              </w:rPr>
+              <w:t>Connector</w:t>
+            </w:r>
+          </w:p>
+        </w:tc>
+        <w:tc>
+          <w:tcPr>
+            <w:tcW w:type="dxa" w:w="861"/>
+            <w:shd w:fill="D9EAF7"/>
+          </w:tcPr>
+          <w:p>
+            <w:r/>
+            <w:r>
+              <w:rPr>
+                <w:rFonts w:ascii="Times New Roman" w:hAnsi="Times New Roman" w:eastAsia="SimSun"/>
+                <w:b/>
+                <w:sz w:val="12"/>
+              </w:rPr>
+              <w:t>Open Source</w:t>
+            </w:r>
+          </w:p>
+        </w:tc>
+        <w:tc>
+          <w:tcPr>
+            <w:tcW w:type="dxa" w:w="861"/>
+            <w:shd w:fill="D9EAF7"/>
+          </w:tcPr>
+          <w:p>
+            <w:r/>
+            <w:r>
+              <w:rPr>
+                <w:rFonts w:ascii="Times New Roman" w:hAnsi="Times New Roman" w:eastAsia="SimSun"/>
+                <w:b/>
+                <w:sz w:val="12"/>
+              </w:rPr>
+              <w:t>Major Strength</w:t>
+            </w:r>
+          </w:p>
+        </w:tc>
+        <w:tc>
+          <w:tcPr>
+            <w:tcW w:type="dxa" w:w="861"/>
+            <w:shd w:fill="D9EAF7"/>
+          </w:tcPr>
+          <w:p>
+            <w:r/>
+            <w:r>
+              <w:rPr>
+                <w:rFonts w:ascii="Times New Roman" w:hAnsi="Times New Roman" w:eastAsia="SimSun"/>
+                <w:b/>
+                <w:sz w:val="12"/>
+              </w:rPr>
+              <w:t>Major Weakness</w:t>
+            </w:r>
+          </w:p>
+        </w:tc>
+      </w:tr>
+      <w:tr>
+        <w:tc>
+          <w:tcPr>
+            <w:tcW w:type="dxa" w:w="861"/>
+          </w:tcPr>
+          <w:p>
+            <w:r/>
+            <w:r>
+              <w:rPr>
+                <w:rFonts w:ascii="Times New Roman" w:hAnsi="Times New Roman" w:eastAsia="SimSun"/>
+                <w:b w:val="0"/>
+                <w:sz w:val="12"/>
+              </w:rPr>
+              <w:t>CLIP</w:t>
+            </w:r>
+          </w:p>
+        </w:tc>
+        <w:tc>
+          <w:tcPr>
+            <w:tcW w:type="dxa" w:w="861"/>
+          </w:tcPr>
+          <w:p>
+            <w:r/>
+            <w:r>
+              <w:rPr>
+                <w:rFonts w:ascii="Times New Roman" w:hAnsi="Times New Roman" w:eastAsia="SimSun"/>
+                <w:b w:val="0"/>
+                <w:sz w:val="12"/>
+              </w:rPr>
+              <w:t>2021</w:t>
+            </w:r>
+          </w:p>
+        </w:tc>
+        <w:tc>
+          <w:tcPr>
+            <w:tcW w:type="dxa" w:w="861"/>
+          </w:tcPr>
+          <w:p>
+            <w:r/>
+            <w:r>
+              <w:rPr>
+                <w:rFonts w:ascii="Times New Roman" w:hAnsi="Times New Roman" w:eastAsia="SimSun"/>
+                <w:b w:val="0"/>
+                <w:sz w:val="12"/>
+              </w:rPr>
+              <w:t>ResNet or Vision Transformer</w:t>
+            </w:r>
+          </w:p>
+        </w:tc>
+        <w:tc>
+          <w:tcPr>
+            <w:tcW w:type="dxa" w:w="861"/>
+          </w:tcPr>
+          <w:p>
+            <w:r/>
+            <w:r>
+              <w:rPr>
+                <w:rFonts w:ascii="Times New Roman" w:hAnsi="Times New Roman" w:eastAsia="SimSun"/>
+                <w:b w:val="0"/>
+                <w:sz w:val="12"/>
+              </w:rPr>
+              <w:t>Text encoder</w:t>
+            </w:r>
+          </w:p>
+        </w:tc>
+        <w:tc>
+          <w:tcPr>
+            <w:tcW w:type="dxa" w:w="861"/>
+          </w:tcPr>
+          <w:p>
+            <w:r/>
+            <w:r>
+              <w:rPr>
+                <w:rFonts w:ascii="Times New Roman" w:hAnsi="Times New Roman" w:eastAsia="SimSun"/>
+                <w:b w:val="0"/>
+                <w:sz w:val="12"/>
+              </w:rPr>
+              <w:t>Contrastive shared embedding</w:t>
+            </w:r>
+          </w:p>
+        </w:tc>
+        <w:tc>
+          <w:tcPr>
+            <w:tcW w:type="dxa" w:w="861"/>
+          </w:tcPr>
+          <w:p>
+            <w:r/>
+            <w:r>
+              <w:rPr>
+                <w:rFonts w:ascii="Times New Roman" w:hAnsi="Times New Roman" w:eastAsia="SimSun"/>
+                <w:b w:val="0"/>
+                <w:sz w:val="12"/>
+              </w:rPr>
+              <w:t>Yes</w:t>
+            </w:r>
+          </w:p>
+        </w:tc>
+        <w:tc>
+          <w:tcPr>
+            <w:tcW w:type="dxa" w:w="861"/>
+          </w:tcPr>
+          <w:p>
+            <w:r/>
+            <w:r>
+              <w:rPr>
+                <w:rFonts w:ascii="Times New Roman" w:hAnsi="Times New Roman" w:eastAsia="SimSun"/>
+                <w:b w:val="0"/>
+                <w:sz w:val="12"/>
+              </w:rPr>
+              <w:t>Strong open-vocabulary image-text alignment</w:t>
+            </w:r>
+          </w:p>
+        </w:tc>
+        <w:tc>
+          <w:tcPr>
+            <w:tcW w:type="dxa" w:w="861"/>
+          </w:tcPr>
+          <w:p>
+            <w:r/>
+            <w:r>
+              <w:rPr>
+                <w:rFonts w:ascii="Times New Roman" w:hAnsi="Times New Roman" w:eastAsia="SimSun"/>
+                <w:b w:val="0"/>
+                <w:sz w:val="12"/>
+              </w:rPr>
+              <w:t>Not a generative conversational MLLM</w:t>
+            </w:r>
+          </w:p>
+        </w:tc>
+      </w:tr>
+      <w:tr>
+        <w:tc>
+          <w:tcPr>
+            <w:tcW w:type="dxa" w:w="861"/>
+          </w:tcPr>
+          <w:p>
+            <w:r/>
+            <w:r>
+              <w:rPr>
+                <w:rFonts w:ascii="Times New Roman" w:hAnsi="Times New Roman" w:eastAsia="SimSun"/>
+                <w:b w:val="0"/>
+                <w:sz w:val="12"/>
+              </w:rPr>
+              <w:t>Flamingo</w:t>
+            </w:r>
+          </w:p>
+        </w:tc>
+        <w:tc>
+          <w:tcPr>
+            <w:tcW w:type="dxa" w:w="861"/>
+          </w:tcPr>
+          <w:p>
+            <w:r/>
+            <w:r>
+              <w:rPr>
+                <w:rFonts w:ascii="Times New Roman" w:hAnsi="Times New Roman" w:eastAsia="SimSun"/>
+                <w:b w:val="0"/>
+                <w:sz w:val="12"/>
+              </w:rPr>
+              <w:t>2022</w:t>
+            </w:r>
+          </w:p>
+        </w:tc>
+        <w:tc>
+          <w:tcPr>
+            <w:tcW w:type="dxa" w:w="861"/>
+          </w:tcPr>
+          <w:p>
+            <w:r/>
+            <w:r>
+              <w:rPr>
+                <w:rFonts w:ascii="Times New Roman" w:hAnsi="Times New Roman" w:eastAsia="SimSun"/>
+                <w:b w:val="0"/>
+                <w:sz w:val="12"/>
+              </w:rPr>
+              <w:t>Perceiver-style visual resampler</w:t>
+            </w:r>
+          </w:p>
+        </w:tc>
+        <w:tc>
+          <w:tcPr>
+            <w:tcW w:type="dxa" w:w="861"/>
+          </w:tcPr>
+          <w:p>
+            <w:r/>
+            <w:r>
+              <w:rPr>
+                <w:rFonts w:ascii="Times New Roman" w:hAnsi="Times New Roman" w:eastAsia="SimSun"/>
+                <w:b w:val="0"/>
+                <w:sz w:val="12"/>
+              </w:rPr>
+              <w:t>Chinchilla-family language model</w:t>
+            </w:r>
+          </w:p>
+        </w:tc>
+        <w:tc>
+          <w:tcPr>
+            <w:tcW w:type="dxa" w:w="861"/>
+          </w:tcPr>
+          <w:p>
+            <w:r/>
+            <w:r>
+              <w:rPr>
+                <w:rFonts w:ascii="Times New Roman" w:hAnsi="Times New Roman" w:eastAsia="SimSun"/>
+                <w:b w:val="0"/>
+                <w:sz w:val="12"/>
+              </w:rPr>
+              <w:t>Gated cross-attention</w:t>
+            </w:r>
+          </w:p>
+        </w:tc>
+        <w:tc>
+          <w:tcPr>
+            <w:tcW w:type="dxa" w:w="861"/>
+          </w:tcPr>
+          <w:p>
+            <w:r/>
+            <w:r>
+              <w:rPr>
+                <w:rFonts w:ascii="Times New Roman" w:hAnsi="Times New Roman" w:eastAsia="SimSun"/>
+                <w:b w:val="0"/>
+                <w:sz w:val="12"/>
+              </w:rPr>
+              <w:t>No</w:t>
+            </w:r>
+          </w:p>
+        </w:tc>
+        <w:tc>
+          <w:tcPr>
+            <w:tcW w:type="dxa" w:w="861"/>
+          </w:tcPr>
+          <w:p>
+            <w:r/>
+            <w:r>
+              <w:rPr>
+                <w:rFonts w:ascii="Times New Roman" w:hAnsi="Times New Roman" w:eastAsia="SimSun"/>
+                <w:b w:val="0"/>
+                <w:sz w:val="12"/>
+              </w:rPr>
+              <w:t>Strong few-shot interleaved image/video-text learning</w:t>
+            </w:r>
+          </w:p>
+        </w:tc>
+        <w:tc>
+          <w:tcPr>
+            <w:tcW w:type="dxa" w:w="861"/>
+          </w:tcPr>
+          <w:p>
+            <w:r/>
+            <w:r>
+              <w:rPr>
+                <w:rFonts w:ascii="Times New Roman" w:hAnsi="Times New Roman" w:eastAsia="SimSun"/>
+                <w:b w:val="0"/>
+                <w:sz w:val="12"/>
+              </w:rPr>
+              <w:t>Closed weights and limited reproducibility</w:t>
+            </w:r>
+          </w:p>
+        </w:tc>
+      </w:tr>
+      <w:tr>
+        <w:tc>
+          <w:tcPr>
+            <w:tcW w:type="dxa" w:w="861"/>
+          </w:tcPr>
+          <w:p>
+            <w:r/>
+            <w:r>
+              <w:rPr>
+                <w:rFonts w:ascii="Times New Roman" w:hAnsi="Times New Roman" w:eastAsia="SimSun"/>
+                <w:b w:val="0"/>
+                <w:sz w:val="12"/>
+              </w:rPr>
+              <w:t>BLIP-2</w:t>
+            </w:r>
+          </w:p>
+        </w:tc>
+        <w:tc>
+          <w:tcPr>
+            <w:tcW w:type="dxa" w:w="861"/>
+          </w:tcPr>
+          <w:p>
+            <w:r/>
+            <w:r>
+              <w:rPr>
+                <w:rFonts w:ascii="Times New Roman" w:hAnsi="Times New Roman" w:eastAsia="SimSun"/>
+                <w:b w:val="0"/>
+                <w:sz w:val="12"/>
+              </w:rPr>
+              <w:t>2023</w:t>
+            </w:r>
+          </w:p>
+        </w:tc>
+        <w:tc>
+          <w:tcPr>
+            <w:tcW w:type="dxa" w:w="861"/>
+          </w:tcPr>
+          <w:p>
+            <w:r/>
+            <w:r>
+              <w:rPr>
+                <w:rFonts w:ascii="Times New Roman" w:hAnsi="Times New Roman" w:eastAsia="SimSun"/>
+                <w:b w:val="0"/>
+                <w:sz w:val="12"/>
+              </w:rPr>
+              <w:t>Frozen image encoder</w:t>
+            </w:r>
+          </w:p>
+        </w:tc>
+        <w:tc>
+          <w:tcPr>
+            <w:tcW w:type="dxa" w:w="861"/>
+          </w:tcPr>
+          <w:p>
+            <w:r/>
+            <w:r>
+              <w:rPr>
+                <w:rFonts w:ascii="Times New Roman" w:hAnsi="Times New Roman" w:eastAsia="SimSun"/>
+                <w:b w:val="0"/>
+                <w:sz w:val="12"/>
+              </w:rPr>
+              <w:t>Frozen LLM</w:t>
+            </w:r>
+          </w:p>
+        </w:tc>
+        <w:tc>
+          <w:tcPr>
+            <w:tcW w:type="dxa" w:w="861"/>
+          </w:tcPr>
+          <w:p>
+            <w:r/>
+            <w:r>
+              <w:rPr>
+                <w:rFonts w:ascii="Times New Roman" w:hAnsi="Times New Roman" w:eastAsia="SimSun"/>
+                <w:b w:val="0"/>
+                <w:sz w:val="12"/>
+              </w:rPr>
+              <w:t>Q-Former</w:t>
+            </w:r>
+          </w:p>
+        </w:tc>
+        <w:tc>
+          <w:tcPr>
+            <w:tcW w:type="dxa" w:w="861"/>
+          </w:tcPr>
+          <w:p>
+            <w:r/>
+            <w:r>
+              <w:rPr>
+                <w:rFonts w:ascii="Times New Roman" w:hAnsi="Times New Roman" w:eastAsia="SimSun"/>
+                <w:b w:val="0"/>
+                <w:sz w:val="12"/>
+              </w:rPr>
+              <w:t>Yes</w:t>
+            </w:r>
+          </w:p>
+        </w:tc>
+        <w:tc>
+          <w:tcPr>
+            <w:tcW w:type="dxa" w:w="861"/>
+          </w:tcPr>
+          <w:p>
+            <w:r/>
+            <w:r>
+              <w:rPr>
+                <w:rFonts w:ascii="Times New Roman" w:hAnsi="Times New Roman" w:eastAsia="SimSun"/>
+                <w:b w:val="0"/>
+                <w:sz w:val="12"/>
+              </w:rPr>
+              <w:t>Efficient bridge between vision encoders and LLMs</w:t>
+            </w:r>
+          </w:p>
+        </w:tc>
+        <w:tc>
+          <w:tcPr>
+            <w:tcW w:type="dxa" w:w="861"/>
+          </w:tcPr>
+          <w:p>
+            <w:r/>
+            <w:r>
+              <w:rPr>
+                <w:rFonts w:ascii="Times New Roman" w:hAnsi="Times New Roman" w:eastAsia="SimSun"/>
+                <w:b w:val="0"/>
+                <w:sz w:val="12"/>
+              </w:rPr>
+              <w:t>Connector may compress away fine visual detail</w:t>
+            </w:r>
+          </w:p>
+        </w:tc>
+      </w:tr>
+      <w:tr>
+        <w:tc>
+          <w:tcPr>
+            <w:tcW w:type="dxa" w:w="861"/>
+          </w:tcPr>
+          <w:p>
+            <w:r/>
+            <w:r>
+              <w:rPr>
+                <w:rFonts w:ascii="Times New Roman" w:hAnsi="Times New Roman" w:eastAsia="SimSun"/>
+                <w:b w:val="0"/>
+                <w:sz w:val="12"/>
+              </w:rPr>
+              <w:t>InstructBLIP</w:t>
+            </w:r>
+          </w:p>
+        </w:tc>
+        <w:tc>
+          <w:tcPr>
+            <w:tcW w:type="dxa" w:w="861"/>
+          </w:tcPr>
+          <w:p>
+            <w:r/>
+            <w:r>
+              <w:rPr>
+                <w:rFonts w:ascii="Times New Roman" w:hAnsi="Times New Roman" w:eastAsia="SimSun"/>
+                <w:b w:val="0"/>
+                <w:sz w:val="12"/>
+              </w:rPr>
+              <w:t>2023</w:t>
+            </w:r>
+          </w:p>
+        </w:tc>
+        <w:tc>
+          <w:tcPr>
+            <w:tcW w:type="dxa" w:w="861"/>
+          </w:tcPr>
+          <w:p>
+            <w:r/>
+            <w:r>
+              <w:rPr>
+                <w:rFonts w:ascii="Times New Roman" w:hAnsi="Times New Roman" w:eastAsia="SimSun"/>
+                <w:b w:val="0"/>
+                <w:sz w:val="12"/>
+              </w:rPr>
+              <w:t>Frozen image encoder</w:t>
+            </w:r>
+          </w:p>
+        </w:tc>
+        <w:tc>
+          <w:tcPr>
+            <w:tcW w:type="dxa" w:w="861"/>
+          </w:tcPr>
+          <w:p>
+            <w:r/>
+            <w:r>
+              <w:rPr>
+                <w:rFonts w:ascii="Times New Roman" w:hAnsi="Times New Roman" w:eastAsia="SimSun"/>
+                <w:b w:val="0"/>
+                <w:sz w:val="12"/>
+              </w:rPr>
+              <w:t>Vicuna or FlanT5-style LLM</w:t>
+            </w:r>
+          </w:p>
+        </w:tc>
+        <w:tc>
+          <w:tcPr>
+            <w:tcW w:type="dxa" w:w="861"/>
+          </w:tcPr>
+          <w:p>
+            <w:r/>
+            <w:r>
+              <w:rPr>
+                <w:rFonts w:ascii="Times New Roman" w:hAnsi="Times New Roman" w:eastAsia="SimSun"/>
+                <w:b w:val="0"/>
+                <w:sz w:val="12"/>
+              </w:rPr>
+              <w:t>Q-Former with instruction tuning</w:t>
+            </w:r>
+          </w:p>
+        </w:tc>
+        <w:tc>
+          <w:tcPr>
+            <w:tcW w:type="dxa" w:w="861"/>
+          </w:tcPr>
+          <w:p>
+            <w:r/>
+            <w:r>
+              <w:rPr>
+                <w:rFonts w:ascii="Times New Roman" w:hAnsi="Times New Roman" w:eastAsia="SimSun"/>
+                <w:b w:val="0"/>
+                <w:sz w:val="12"/>
+              </w:rPr>
+              <w:t>Yes</w:t>
+            </w:r>
+          </w:p>
+        </w:tc>
+        <w:tc>
+          <w:tcPr>
+            <w:tcW w:type="dxa" w:w="861"/>
+          </w:tcPr>
+          <w:p>
+            <w:r/>
+            <w:r>
+              <w:rPr>
+                <w:rFonts w:ascii="Times New Roman" w:hAnsi="Times New Roman" w:eastAsia="SimSun"/>
+                <w:b w:val="0"/>
+                <w:sz w:val="12"/>
+              </w:rPr>
+              <w:t>Better instruction following than BLIP-2</w:t>
+            </w:r>
+          </w:p>
+        </w:tc>
+        <w:tc>
+          <w:tcPr>
+            <w:tcW w:type="dxa" w:w="861"/>
+          </w:tcPr>
+          <w:p>
+            <w:r/>
+            <w:r>
+              <w:rPr>
+                <w:rFonts w:ascii="Times New Roman" w:hAnsi="Times New Roman" w:eastAsia="SimSun"/>
+                <w:b w:val="0"/>
+                <w:sz w:val="12"/>
+              </w:rPr>
+              <w:t>Still sensitive to instruction-data quality</w:t>
+            </w:r>
+          </w:p>
+        </w:tc>
+      </w:tr>
+      <w:tr>
+        <w:tc>
+          <w:tcPr>
+            <w:tcW w:type="dxa" w:w="861"/>
+          </w:tcPr>
+          <w:p>
+            <w:r/>
+            <w:r>
+              <w:rPr>
+                <w:rFonts w:ascii="Times New Roman" w:hAnsi="Times New Roman" w:eastAsia="SimSun"/>
+                <w:b w:val="0"/>
+                <w:sz w:val="12"/>
+              </w:rPr>
+              <w:t>LLaVA</w:t>
+            </w:r>
+          </w:p>
+        </w:tc>
+        <w:tc>
+          <w:tcPr>
+            <w:tcW w:type="dxa" w:w="861"/>
+          </w:tcPr>
+          <w:p>
+            <w:r/>
+            <w:r>
+              <w:rPr>
+                <w:rFonts w:ascii="Times New Roman" w:hAnsi="Times New Roman" w:eastAsia="SimSun"/>
+                <w:b w:val="0"/>
+                <w:sz w:val="12"/>
+              </w:rPr>
+              <w:t>2023</w:t>
+            </w:r>
+          </w:p>
+        </w:tc>
+        <w:tc>
+          <w:tcPr>
+            <w:tcW w:type="dxa" w:w="861"/>
+          </w:tcPr>
+          <w:p>
+            <w:r/>
+            <w:r>
+              <w:rPr>
+                <w:rFonts w:ascii="Times New Roman" w:hAnsi="Times New Roman" w:eastAsia="SimSun"/>
+                <w:b w:val="0"/>
+                <w:sz w:val="12"/>
+              </w:rPr>
+              <w:t>CLIP ViT</w:t>
+            </w:r>
+          </w:p>
+        </w:tc>
+        <w:tc>
+          <w:tcPr>
+            <w:tcW w:type="dxa" w:w="861"/>
+          </w:tcPr>
+          <w:p>
+            <w:r/>
+            <w:r>
+              <w:rPr>
+                <w:rFonts w:ascii="Times New Roman" w:hAnsi="Times New Roman" w:eastAsia="SimSun"/>
+                <w:b w:val="0"/>
+                <w:sz w:val="12"/>
+              </w:rPr>
+              <w:t>Vicuna-style LLM</w:t>
+            </w:r>
+          </w:p>
+        </w:tc>
+        <w:tc>
+          <w:tcPr>
+            <w:tcW w:type="dxa" w:w="861"/>
+          </w:tcPr>
+          <w:p>
+            <w:r/>
+            <w:r>
+              <w:rPr>
+                <w:rFonts w:ascii="Times New Roman" w:hAnsi="Times New Roman" w:eastAsia="SimSun"/>
+                <w:b w:val="0"/>
+                <w:sz w:val="12"/>
+              </w:rPr>
+              <w:t>Linear projection</w:t>
+            </w:r>
+          </w:p>
+        </w:tc>
+        <w:tc>
+          <w:tcPr>
+            <w:tcW w:type="dxa" w:w="861"/>
+          </w:tcPr>
+          <w:p>
+            <w:r/>
+            <w:r>
+              <w:rPr>
+                <w:rFonts w:ascii="Times New Roman" w:hAnsi="Times New Roman" w:eastAsia="SimSun"/>
+                <w:b w:val="0"/>
+                <w:sz w:val="12"/>
+              </w:rPr>
+              <w:t>Yes</w:t>
+            </w:r>
+          </w:p>
+        </w:tc>
+        <w:tc>
+          <w:tcPr>
+            <w:tcW w:type="dxa" w:w="861"/>
+          </w:tcPr>
+          <w:p>
+            <w:r/>
+            <w:r>
+              <w:rPr>
+                <w:rFonts w:ascii="Times New Roman" w:hAnsi="Times New Roman" w:eastAsia="SimSun"/>
+                <w:b w:val="0"/>
+                <w:sz w:val="12"/>
+              </w:rPr>
+              <w:t>Simple and influential open visual instruction tuning baseline</w:t>
+            </w:r>
+          </w:p>
+        </w:tc>
+        <w:tc>
+          <w:tcPr>
+            <w:tcW w:type="dxa" w:w="861"/>
+          </w:tcPr>
+          <w:p>
+            <w:r/>
+            <w:r>
+              <w:rPr>
+                <w:rFonts w:ascii="Times New Roman" w:hAnsi="Times New Roman" w:eastAsia="SimSun"/>
+                <w:b w:val="0"/>
+                <w:sz w:val="12"/>
+              </w:rPr>
+              <w:t>Can hallucinate when visual grounding is weak</w:t>
+            </w:r>
+          </w:p>
+        </w:tc>
+      </w:tr>
+      <w:tr>
+        <w:tc>
+          <w:tcPr>
+            <w:tcW w:type="dxa" w:w="861"/>
+          </w:tcPr>
+          <w:p>
+            <w:r/>
+            <w:r>
+              <w:rPr>
+                <w:rFonts w:ascii="Times New Roman" w:hAnsi="Times New Roman" w:eastAsia="SimSun"/>
+                <w:b w:val="0"/>
+                <w:sz w:val="12"/>
+              </w:rPr>
+              <w:t>MiniGPT-4</w:t>
+            </w:r>
+          </w:p>
+        </w:tc>
+        <w:tc>
+          <w:tcPr>
+            <w:tcW w:type="dxa" w:w="861"/>
+          </w:tcPr>
+          <w:p>
+            <w:r/>
+            <w:r>
+              <w:rPr>
+                <w:rFonts w:ascii="Times New Roman" w:hAnsi="Times New Roman" w:eastAsia="SimSun"/>
+                <w:b w:val="0"/>
+                <w:sz w:val="12"/>
+              </w:rPr>
+              <w:t>2024</w:t>
+            </w:r>
+          </w:p>
+        </w:tc>
+        <w:tc>
+          <w:tcPr>
+            <w:tcW w:type="dxa" w:w="861"/>
+          </w:tcPr>
+          <w:p>
+            <w:r/>
+            <w:r>
+              <w:rPr>
+                <w:rFonts w:ascii="Times New Roman" w:hAnsi="Times New Roman" w:eastAsia="SimSun"/>
+                <w:b w:val="0"/>
+                <w:sz w:val="12"/>
+              </w:rPr>
+              <w:t>Vision Transformer with Q-Former</w:t>
+            </w:r>
+          </w:p>
+        </w:tc>
+        <w:tc>
+          <w:tcPr>
+            <w:tcW w:type="dxa" w:w="861"/>
+          </w:tcPr>
+          <w:p>
+            <w:r/>
+            <w:r>
+              <w:rPr>
+                <w:rFonts w:ascii="Times New Roman" w:hAnsi="Times New Roman" w:eastAsia="SimSun"/>
+                <w:b w:val="0"/>
+                <w:sz w:val="12"/>
+              </w:rPr>
+              <w:t>Vicuna-style LLM</w:t>
+            </w:r>
+          </w:p>
+        </w:tc>
+        <w:tc>
+          <w:tcPr>
+            <w:tcW w:type="dxa" w:w="861"/>
+          </w:tcPr>
+          <w:p>
+            <w:r/>
+            <w:r>
+              <w:rPr>
+                <w:rFonts w:ascii="Times New Roman" w:hAnsi="Times New Roman" w:eastAsia="SimSun"/>
+                <w:b w:val="0"/>
+                <w:sz w:val="12"/>
+              </w:rPr>
+              <w:t>Linear projection after Q-Former</w:t>
+            </w:r>
+          </w:p>
+        </w:tc>
+        <w:tc>
+          <w:tcPr>
+            <w:tcW w:type="dxa" w:w="861"/>
+          </w:tcPr>
+          <w:p>
+            <w:r/>
+            <w:r>
+              <w:rPr>
+                <w:rFonts w:ascii="Times New Roman" w:hAnsi="Times New Roman" w:eastAsia="SimSun"/>
+                <w:b w:val="0"/>
+                <w:sz w:val="12"/>
+              </w:rPr>
+              <w:t>Yes</w:t>
+            </w:r>
+          </w:p>
+        </w:tc>
+        <w:tc>
+          <w:tcPr>
+            <w:tcW w:type="dxa" w:w="861"/>
+          </w:tcPr>
+          <w:p>
+            <w:r/>
+            <w:r>
+              <w:rPr>
+                <w:rFonts w:ascii="Times New Roman" w:hAnsi="Times New Roman" w:eastAsia="SimSun"/>
+                <w:b w:val="0"/>
+                <w:sz w:val="12"/>
+              </w:rPr>
+              <w:t>Compact alignment recipe for image dialogue</w:t>
+            </w:r>
+          </w:p>
+        </w:tc>
+        <w:tc>
+          <w:tcPr>
+            <w:tcW w:type="dxa" w:w="861"/>
+          </w:tcPr>
+          <w:p>
+            <w:r/>
+            <w:r>
+              <w:rPr>
+                <w:rFonts w:ascii="Times New Roman" w:hAnsi="Times New Roman" w:eastAsia="SimSun"/>
+                <w:b w:val="0"/>
+                <w:sz w:val="12"/>
+              </w:rPr>
+              <w:t>Limited fine-grained grounding and OCR reliability</w:t>
+            </w:r>
+          </w:p>
+        </w:tc>
+      </w:tr>
+      <w:tr>
+        <w:tc>
+          <w:tcPr>
+            <w:tcW w:type="dxa" w:w="861"/>
+          </w:tcPr>
+          <w:p>
+            <w:r/>
+            <w:r>
+              <w:rPr>
+                <w:rFonts w:ascii="Times New Roman" w:hAnsi="Times New Roman" w:eastAsia="SimSun"/>
+                <w:b w:val="0"/>
+                <w:sz w:val="12"/>
+              </w:rPr>
+              <w:t>Qwen-VL</w:t>
+            </w:r>
+          </w:p>
+        </w:tc>
+        <w:tc>
+          <w:tcPr>
+            <w:tcW w:type="dxa" w:w="861"/>
+          </w:tcPr>
+          <w:p>
+            <w:r/>
+            <w:r>
+              <w:rPr>
+                <w:rFonts w:ascii="Times New Roman" w:hAnsi="Times New Roman" w:eastAsia="SimSun"/>
+                <w:b w:val="0"/>
+                <w:sz w:val="12"/>
+              </w:rPr>
+              <w:t>2023</w:t>
+            </w:r>
+          </w:p>
+        </w:tc>
+        <w:tc>
+          <w:tcPr>
+            <w:tcW w:type="dxa" w:w="861"/>
+          </w:tcPr>
+          <w:p>
+            <w:r/>
+            <w:r>
+              <w:rPr>
+                <w:rFonts w:ascii="Times New Roman" w:hAnsi="Times New Roman" w:eastAsia="SimSun"/>
+                <w:b w:val="0"/>
+                <w:sz w:val="12"/>
+              </w:rPr>
+              <w:t>Vision-language encoder</w:t>
+            </w:r>
+          </w:p>
+        </w:tc>
+        <w:tc>
+          <w:tcPr>
+            <w:tcW w:type="dxa" w:w="861"/>
+          </w:tcPr>
+          <w:p>
+            <w:r/>
+            <w:r>
+              <w:rPr>
+                <w:rFonts w:ascii="Times New Roman" w:hAnsi="Times New Roman" w:eastAsia="SimSun"/>
+                <w:b w:val="0"/>
+                <w:sz w:val="12"/>
+              </w:rPr>
+              <w:t>Qwen language model</w:t>
+            </w:r>
+          </w:p>
+        </w:tc>
+        <w:tc>
+          <w:tcPr>
+            <w:tcW w:type="dxa" w:w="861"/>
+          </w:tcPr>
+          <w:p>
+            <w:r/>
+            <w:r>
+              <w:rPr>
+                <w:rFonts w:ascii="Times New Roman" w:hAnsi="Times New Roman" w:eastAsia="SimSun"/>
+                <w:b w:val="0"/>
+                <w:sz w:val="12"/>
+              </w:rPr>
+              <w:t>Multimodal adapter</w:t>
+            </w:r>
+          </w:p>
+        </w:tc>
+        <w:tc>
+          <w:tcPr>
+            <w:tcW w:type="dxa" w:w="861"/>
+          </w:tcPr>
+          <w:p>
+            <w:r/>
+            <w:r>
+              <w:rPr>
+                <w:rFonts w:ascii="Times New Roman" w:hAnsi="Times New Roman" w:eastAsia="SimSun"/>
+                <w:b w:val="0"/>
+                <w:sz w:val="12"/>
+              </w:rPr>
+              <w:t>Partly</w:t>
+            </w:r>
+          </w:p>
+        </w:tc>
+        <w:tc>
+          <w:tcPr>
+            <w:tcW w:type="dxa" w:w="861"/>
+          </w:tcPr>
+          <w:p>
+            <w:r/>
+            <w:r>
+              <w:rPr>
+                <w:rFonts w:ascii="Times New Roman" w:hAnsi="Times New Roman" w:eastAsia="SimSun"/>
+                <w:b w:val="0"/>
+                <w:sz w:val="12"/>
+              </w:rPr>
+              <w:t>Good OCR localization and general visual dialogue</w:t>
+            </w:r>
+          </w:p>
+        </w:tc>
+        <w:tc>
+          <w:tcPr>
+            <w:tcW w:type="dxa" w:w="861"/>
+          </w:tcPr>
+          <w:p>
+            <w:r/>
+            <w:r>
+              <w:rPr>
+                <w:rFonts w:ascii="Times New Roman" w:hAnsi="Times New Roman" w:eastAsia="SimSun"/>
+                <w:b w:val="0"/>
+                <w:sz w:val="12"/>
+              </w:rPr>
+              <w:t>Training details and data scale are difficult to fully reproduce</w:t>
+            </w:r>
+          </w:p>
+        </w:tc>
+      </w:tr>
+      <w:tr>
+        <w:tc>
+          <w:tcPr>
+            <w:tcW w:type="dxa" w:w="861"/>
+          </w:tcPr>
+          <w:p>
+            <w:r/>
+            <w:r>
+              <w:rPr>
+                <w:rFonts w:ascii="Times New Roman" w:hAnsi="Times New Roman" w:eastAsia="SimSun"/>
+                <w:b w:val="0"/>
+                <w:sz w:val="12"/>
+              </w:rPr>
+              <w:t>InternVL</w:t>
+            </w:r>
+          </w:p>
+        </w:tc>
+        <w:tc>
+          <w:tcPr>
+            <w:tcW w:type="dxa" w:w="861"/>
+          </w:tcPr>
+          <w:p>
+            <w:r/>
+            <w:r>
+              <w:rPr>
+                <w:rFonts w:ascii="Times New Roman" w:hAnsi="Times New Roman" w:eastAsia="SimSun"/>
+                <w:b w:val="0"/>
+                <w:sz w:val="12"/>
+              </w:rPr>
+              <w:t>2024</w:t>
+            </w:r>
+          </w:p>
+        </w:tc>
+        <w:tc>
+          <w:tcPr>
+            <w:tcW w:type="dxa" w:w="861"/>
+          </w:tcPr>
+          <w:p>
+            <w:r/>
+            <w:r>
+              <w:rPr>
+                <w:rFonts w:ascii="Times New Roman" w:hAnsi="Times New Roman" w:eastAsia="SimSun"/>
+                <w:b w:val="0"/>
+                <w:sz w:val="12"/>
+              </w:rPr>
+              <w:t>Scaled vision foundation model</w:t>
+            </w:r>
+          </w:p>
+        </w:tc>
+        <w:tc>
+          <w:tcPr>
+            <w:tcW w:type="dxa" w:w="861"/>
+          </w:tcPr>
+          <w:p>
+            <w:r/>
+            <w:r>
+              <w:rPr>
+                <w:rFonts w:ascii="Times New Roman" w:hAnsi="Times New Roman" w:eastAsia="SimSun"/>
+                <w:b w:val="0"/>
+                <w:sz w:val="12"/>
+              </w:rPr>
+              <w:t>LLM backbone</w:t>
+            </w:r>
+          </w:p>
+        </w:tc>
+        <w:tc>
+          <w:tcPr>
+            <w:tcW w:type="dxa" w:w="861"/>
+          </w:tcPr>
+          <w:p>
+            <w:r/>
+            <w:r>
+              <w:rPr>
+                <w:rFonts w:ascii="Times New Roman" w:hAnsi="Times New Roman" w:eastAsia="SimSun"/>
+                <w:b w:val="0"/>
+                <w:sz w:val="12"/>
+              </w:rPr>
+              <w:t>Vision-language alignment module</w:t>
+            </w:r>
+          </w:p>
+        </w:tc>
+        <w:tc>
+          <w:tcPr>
+            <w:tcW w:type="dxa" w:w="861"/>
+          </w:tcPr>
+          <w:p>
+            <w:r/>
+            <w:r>
+              <w:rPr>
+                <w:rFonts w:ascii="Times New Roman" w:hAnsi="Times New Roman" w:eastAsia="SimSun"/>
+                <w:b w:val="0"/>
+                <w:sz w:val="12"/>
+              </w:rPr>
+              <w:t>Yes</w:t>
+            </w:r>
+          </w:p>
+        </w:tc>
+        <w:tc>
+          <w:tcPr>
+            <w:tcW w:type="dxa" w:w="861"/>
+          </w:tcPr>
+          <w:p>
+            <w:r/>
+            <w:r>
+              <w:rPr>
+                <w:rFonts w:ascii="Times New Roman" w:hAnsi="Times New Roman" w:eastAsia="SimSun"/>
+                <w:b w:val="0"/>
+                <w:sz w:val="12"/>
+              </w:rPr>
+              <w:t>Strong generic visual-linguistic capability</w:t>
+            </w:r>
+          </w:p>
+        </w:tc>
+        <w:tc>
+          <w:tcPr>
+            <w:tcW w:type="dxa" w:w="861"/>
+          </w:tcPr>
+          <w:p>
+            <w:r/>
+            <w:r>
+              <w:rPr>
+                <w:rFonts w:ascii="Times New Roman" w:hAnsi="Times New Roman" w:eastAsia="SimSun"/>
+                <w:b w:val="0"/>
+                <w:sz w:val="12"/>
+              </w:rPr>
+              <w:t>Large-scale training makes reproduction costly</w:t>
+            </w:r>
+          </w:p>
+        </w:tc>
+      </w:tr>
+      <w:tr>
+        <w:tc>
+          <w:tcPr>
+            <w:tcW w:type="dxa" w:w="861"/>
+          </w:tcPr>
+          <w:p>
+            <w:r/>
+            <w:r>
+              <w:rPr>
+                <w:rFonts w:ascii="Times New Roman" w:hAnsi="Times New Roman" w:eastAsia="SimSun"/>
+                <w:b w:val="0"/>
+                <w:sz w:val="12"/>
+              </w:rPr>
+              <w:t>CogVLM</w:t>
+            </w:r>
+          </w:p>
+        </w:tc>
+        <w:tc>
+          <w:tcPr>
+            <w:tcW w:type="dxa" w:w="861"/>
+          </w:tcPr>
+          <w:p>
+            <w:r/>
+            <w:r>
+              <w:rPr>
+                <w:rFonts w:ascii="Times New Roman" w:hAnsi="Times New Roman" w:eastAsia="SimSun"/>
+                <w:b w:val="0"/>
+                <w:sz w:val="12"/>
+              </w:rPr>
+              <w:t>2024</w:t>
+            </w:r>
+          </w:p>
+        </w:tc>
+        <w:tc>
+          <w:tcPr>
+            <w:tcW w:type="dxa" w:w="861"/>
+          </w:tcPr>
+          <w:p>
+            <w:r/>
+            <w:r>
+              <w:rPr>
+                <w:rFonts w:ascii="Times New Roman" w:hAnsi="Times New Roman" w:eastAsia="SimSun"/>
+                <w:b w:val="0"/>
+                <w:sz w:val="12"/>
+              </w:rPr>
+              <w:t>Visual expert module</w:t>
+            </w:r>
+          </w:p>
+        </w:tc>
+        <w:tc>
+          <w:tcPr>
+            <w:tcW w:type="dxa" w:w="861"/>
+          </w:tcPr>
+          <w:p>
+            <w:r/>
+            <w:r>
+              <w:rPr>
+                <w:rFonts w:ascii="Times New Roman" w:hAnsi="Times New Roman" w:eastAsia="SimSun"/>
+                <w:b w:val="0"/>
+                <w:sz w:val="12"/>
+              </w:rPr>
+              <w:t>Pretrained language model</w:t>
+            </w:r>
+          </w:p>
+        </w:tc>
+        <w:tc>
+          <w:tcPr>
+            <w:tcW w:type="dxa" w:w="861"/>
+          </w:tcPr>
+          <w:p>
+            <w:r/>
+            <w:r>
+              <w:rPr>
+                <w:rFonts w:ascii="Times New Roman" w:hAnsi="Times New Roman" w:eastAsia="SimSun"/>
+                <w:b w:val="0"/>
+                <w:sz w:val="12"/>
+              </w:rPr>
+              <w:t>Visual expert integration</w:t>
+            </w:r>
+          </w:p>
+        </w:tc>
+        <w:tc>
+          <w:tcPr>
+            <w:tcW w:type="dxa" w:w="861"/>
+          </w:tcPr>
+          <w:p>
+            <w:r/>
+            <w:r>
+              <w:rPr>
+                <w:rFonts w:ascii="Times New Roman" w:hAnsi="Times New Roman" w:eastAsia="SimSun"/>
+                <w:b w:val="0"/>
+                <w:sz w:val="12"/>
+              </w:rPr>
+              <w:t>Yes</w:t>
+            </w:r>
+          </w:p>
+        </w:tc>
+        <w:tc>
+          <w:tcPr>
+            <w:tcW w:type="dxa" w:w="861"/>
+          </w:tcPr>
+          <w:p>
+            <w:r/>
+            <w:r>
+              <w:rPr>
+                <w:rFonts w:ascii="Times New Roman" w:hAnsi="Times New Roman" w:eastAsia="SimSun"/>
+                <w:b w:val="0"/>
+                <w:sz w:val="12"/>
+              </w:rPr>
+              <w:t>Preserves language ability while adding visual expertise</w:t>
+            </w:r>
+          </w:p>
+        </w:tc>
+        <w:tc>
+          <w:tcPr>
+            <w:tcW w:type="dxa" w:w="861"/>
+          </w:tcPr>
+          <w:p>
+            <w:r/>
+            <w:r>
+              <w:rPr>
+                <w:rFonts w:ascii="Times New Roman" w:hAnsi="Times New Roman" w:eastAsia="SimSun"/>
+                <w:b w:val="0"/>
+                <w:sz w:val="12"/>
+              </w:rPr>
+              <w:t>Architecture is more complex than projection-based models</w:t>
+            </w:r>
+          </w:p>
+        </w:tc>
+      </w:tr>
+      <w:tr>
+        <w:tc>
+          <w:tcPr>
+            <w:tcW w:type="dxa" w:w="861"/>
+          </w:tcPr>
+          <w:p>
+            <w:r/>
+            <w:r>
+              <w:rPr>
+                <w:rFonts w:ascii="Times New Roman" w:hAnsi="Times New Roman" w:eastAsia="SimSun"/>
+                <w:b w:val="0"/>
+                <w:sz w:val="12"/>
+              </w:rPr>
+              <w:t>GPT-4V</w:t>
+            </w:r>
+          </w:p>
+        </w:tc>
+        <w:tc>
+          <w:tcPr>
+            <w:tcW w:type="dxa" w:w="861"/>
+          </w:tcPr>
+          <w:p>
+            <w:r/>
+            <w:r>
+              <w:rPr>
+                <w:rFonts w:ascii="Times New Roman" w:hAnsi="Times New Roman" w:eastAsia="SimSun"/>
+                <w:b w:val="0"/>
+                <w:sz w:val="12"/>
+              </w:rPr>
+              <w:t>2023</w:t>
+            </w:r>
+          </w:p>
+        </w:tc>
+        <w:tc>
+          <w:tcPr>
+            <w:tcW w:type="dxa" w:w="861"/>
+          </w:tcPr>
+          <w:p>
+            <w:r/>
+            <w:r>
+              <w:rPr>
+                <w:rFonts w:ascii="Times New Roman" w:hAnsi="Times New Roman" w:eastAsia="SimSun"/>
+                <w:b w:val="0"/>
+                <w:sz w:val="12"/>
+              </w:rPr>
+              <w:t>Not publicly disclosed</w:t>
+            </w:r>
+          </w:p>
+        </w:tc>
+        <w:tc>
+          <w:tcPr>
+            <w:tcW w:type="dxa" w:w="861"/>
+          </w:tcPr>
+          <w:p>
+            <w:r/>
+            <w:r>
+              <w:rPr>
+                <w:rFonts w:ascii="Times New Roman" w:hAnsi="Times New Roman" w:eastAsia="SimSun"/>
+                <w:b w:val="0"/>
+                <w:sz w:val="12"/>
+              </w:rPr>
+              <w:t>Not publicly disclosed</w:t>
+            </w:r>
+          </w:p>
+        </w:tc>
+        <w:tc>
+          <w:tcPr>
+            <w:tcW w:type="dxa" w:w="861"/>
+          </w:tcPr>
+          <w:p>
+            <w:r/>
+            <w:r>
+              <w:rPr>
+                <w:rFonts w:ascii="Times New Roman" w:hAnsi="Times New Roman" w:eastAsia="SimSun"/>
+                <w:b w:val="0"/>
+                <w:sz w:val="12"/>
+              </w:rPr>
+              <w:t>Not publicly disclosed</w:t>
+            </w:r>
+          </w:p>
+        </w:tc>
+        <w:tc>
+          <w:tcPr>
+            <w:tcW w:type="dxa" w:w="861"/>
+          </w:tcPr>
+          <w:p>
+            <w:r/>
+            <w:r>
+              <w:rPr>
+                <w:rFonts w:ascii="Times New Roman" w:hAnsi="Times New Roman" w:eastAsia="SimSun"/>
+                <w:b w:val="0"/>
+                <w:sz w:val="12"/>
+              </w:rPr>
+              <w:t>No</w:t>
+            </w:r>
+          </w:p>
+        </w:tc>
+        <w:tc>
+          <w:tcPr>
+            <w:tcW w:type="dxa" w:w="861"/>
+          </w:tcPr>
+          <w:p>
+            <w:r/>
+            <w:r>
+              <w:rPr>
+                <w:rFonts w:ascii="Times New Roman" w:hAnsi="Times New Roman" w:eastAsia="SimSun"/>
+                <w:b w:val="0"/>
+                <w:sz w:val="12"/>
+              </w:rPr>
+              <w:t>High-capability frontier multimodal assistant</w:t>
+            </w:r>
+          </w:p>
+        </w:tc>
+        <w:tc>
+          <w:tcPr>
+            <w:tcW w:type="dxa" w:w="861"/>
+          </w:tcPr>
+          <w:p>
+            <w:r/>
+            <w:r>
+              <w:rPr>
+                <w:rFonts w:ascii="Times New Roman" w:hAnsi="Times New Roman" w:eastAsia="SimSun"/>
+                <w:b w:val="0"/>
+                <w:sz w:val="12"/>
+              </w:rPr>
+              <w:t>Closed architecture data and training process</w:t>
+            </w:r>
+          </w:p>
+        </w:tc>
+      </w:tr>
+      <w:tr>
+        <w:tc>
+          <w:tcPr>
+            <w:tcW w:type="dxa" w:w="861"/>
+          </w:tcPr>
+          <w:p>
+            <w:r/>
+            <w:r>
+              <w:rPr>
+                <w:rFonts w:ascii="Times New Roman" w:hAnsi="Times New Roman" w:eastAsia="SimSun"/>
+                <w:b w:val="0"/>
+                <w:sz w:val="12"/>
+              </w:rPr>
+              <w:t>Gemini</w:t>
+            </w:r>
+          </w:p>
+        </w:tc>
+        <w:tc>
+          <w:tcPr>
+            <w:tcW w:type="dxa" w:w="861"/>
+          </w:tcPr>
+          <w:p>
+            <w:r/>
+            <w:r>
+              <w:rPr>
+                <w:rFonts w:ascii="Times New Roman" w:hAnsi="Times New Roman" w:eastAsia="SimSun"/>
+                <w:b w:val="0"/>
+                <w:sz w:val="12"/>
+              </w:rPr>
+              <w:t>2023</w:t>
+            </w:r>
+          </w:p>
+        </w:tc>
+        <w:tc>
+          <w:tcPr>
+            <w:tcW w:type="dxa" w:w="861"/>
+          </w:tcPr>
+          <w:p>
+            <w:r/>
+            <w:r>
+              <w:rPr>
+                <w:rFonts w:ascii="Times New Roman" w:hAnsi="Times New Roman" w:eastAsia="SimSun"/>
+                <w:b w:val="0"/>
+                <w:sz w:val="12"/>
+              </w:rPr>
+              <w:t>Not fully public</w:t>
+            </w:r>
+          </w:p>
+        </w:tc>
+        <w:tc>
+          <w:tcPr>
+            <w:tcW w:type="dxa" w:w="861"/>
+          </w:tcPr>
+          <w:p>
+            <w:r/>
+            <w:r>
+              <w:rPr>
+                <w:rFonts w:ascii="Times New Roman" w:hAnsi="Times New Roman" w:eastAsia="SimSun"/>
+                <w:b w:val="0"/>
+                <w:sz w:val="12"/>
+              </w:rPr>
+              <w:t>Not fully public</w:t>
+            </w:r>
+          </w:p>
+        </w:tc>
+        <w:tc>
+          <w:tcPr>
+            <w:tcW w:type="dxa" w:w="861"/>
+          </w:tcPr>
+          <w:p>
+            <w:r/>
+            <w:r>
+              <w:rPr>
+                <w:rFonts w:ascii="Times New Roman" w:hAnsi="Times New Roman" w:eastAsia="SimSun"/>
+                <w:b w:val="0"/>
+                <w:sz w:val="12"/>
+              </w:rPr>
+              <w:t>Native multimodal system design</w:t>
+            </w:r>
+          </w:p>
+        </w:tc>
+        <w:tc>
+          <w:tcPr>
+            <w:tcW w:type="dxa" w:w="861"/>
+          </w:tcPr>
+          <w:p>
+            <w:r/>
+            <w:r>
+              <w:rPr>
+                <w:rFonts w:ascii="Times New Roman" w:hAnsi="Times New Roman" w:eastAsia="SimSun"/>
+                <w:b w:val="0"/>
+                <w:sz w:val="12"/>
+              </w:rPr>
+              <w:t>No</w:t>
+            </w:r>
+          </w:p>
+        </w:tc>
+        <w:tc>
+          <w:tcPr>
+            <w:tcW w:type="dxa" w:w="861"/>
+          </w:tcPr>
+          <w:p>
+            <w:r/>
+            <w:r>
+              <w:rPr>
+                <w:rFonts w:ascii="Times New Roman" w:hAnsi="Times New Roman" w:eastAsia="SimSun"/>
+                <w:b w:val="0"/>
+                <w:sz w:val="12"/>
+              </w:rPr>
+              <w:t>Strong frontier multimodal model family</w:t>
+            </w:r>
+          </w:p>
+        </w:tc>
+        <w:tc>
+          <w:tcPr>
+            <w:tcW w:type="dxa" w:w="861"/>
+          </w:tcPr>
+          <w:p>
+            <w:r/>
+            <w:r>
+              <w:rPr>
+                <w:rFonts w:ascii="Times New Roman" w:hAnsi="Times New Roman" w:eastAsia="SimSun"/>
+                <w:b w:val="0"/>
+                <w:sz w:val="12"/>
+              </w:rPr>
+              <w:t>Closed training details limit independent analysis</w:t>
+            </w:r>
+          </w:p>
+        </w:tc>
+      </w:tr>
+      <w:tr>
+        <w:tc>
+          <w:tcPr>
+            <w:tcW w:type="dxa" w:w="861"/>
+          </w:tcPr>
+          <w:p>
+            <w:r/>
+            <w:r>
+              <w:rPr>
+                <w:rFonts w:ascii="Times New Roman" w:hAnsi="Times New Roman" w:eastAsia="SimSun"/>
+                <w:b w:val="0"/>
+                <w:sz w:val="12"/>
+              </w:rPr>
+              <w:t>Ferret</w:t>
+            </w:r>
+          </w:p>
+        </w:tc>
+        <w:tc>
+          <w:tcPr>
+            <w:tcW w:type="dxa" w:w="861"/>
+          </w:tcPr>
+          <w:p>
+            <w:r/>
+            <w:r>
+              <w:rPr>
+                <w:rFonts w:ascii="Times New Roman" w:hAnsi="Times New Roman" w:eastAsia="SimSun"/>
+                <w:b w:val="0"/>
+                <w:sz w:val="12"/>
+              </w:rPr>
+              <w:t>2024</w:t>
+            </w:r>
+          </w:p>
+        </w:tc>
+        <w:tc>
+          <w:tcPr>
+            <w:tcW w:type="dxa" w:w="861"/>
+          </w:tcPr>
+          <w:p>
+            <w:r/>
+            <w:r>
+              <w:rPr>
+                <w:rFonts w:ascii="Times New Roman" w:hAnsi="Times New Roman" w:eastAsia="SimSun"/>
+                <w:b w:val="0"/>
+                <w:sz w:val="12"/>
+              </w:rPr>
+              <w:t>Vision encoder with region grounding</w:t>
+            </w:r>
+          </w:p>
+        </w:tc>
+        <w:tc>
+          <w:tcPr>
+            <w:tcW w:type="dxa" w:w="861"/>
+          </w:tcPr>
+          <w:p>
+            <w:r/>
+            <w:r>
+              <w:rPr>
+                <w:rFonts w:ascii="Times New Roman" w:hAnsi="Times New Roman" w:eastAsia="SimSun"/>
+                <w:b w:val="0"/>
+                <w:sz w:val="12"/>
+              </w:rPr>
+              <w:t>LLM backbone</w:t>
+            </w:r>
+          </w:p>
+        </w:tc>
+        <w:tc>
+          <w:tcPr>
+            <w:tcW w:type="dxa" w:w="861"/>
+          </w:tcPr>
+          <w:p>
+            <w:r/>
+            <w:r>
+              <w:rPr>
+                <w:rFonts w:ascii="Times New Roman" w:hAnsi="Times New Roman" w:eastAsia="SimSun"/>
+                <w:b w:val="0"/>
+                <w:sz w:val="12"/>
+              </w:rPr>
+              <w:t>Grounding-aware connector</w:t>
+            </w:r>
+          </w:p>
+        </w:tc>
+        <w:tc>
+          <w:tcPr>
+            <w:tcW w:type="dxa" w:w="861"/>
+          </w:tcPr>
+          <w:p>
+            <w:r/>
+            <w:r>
+              <w:rPr>
+                <w:rFonts w:ascii="Times New Roman" w:hAnsi="Times New Roman" w:eastAsia="SimSun"/>
+                <w:b w:val="0"/>
+                <w:sz w:val="12"/>
+              </w:rPr>
+              <w:t>Yes</w:t>
+            </w:r>
+          </w:p>
+        </w:tc>
+        <w:tc>
+          <w:tcPr>
+            <w:tcW w:type="dxa" w:w="861"/>
+          </w:tcPr>
+          <w:p>
+            <w:r/>
+            <w:r>
+              <w:rPr>
+                <w:rFonts w:ascii="Times New Roman" w:hAnsi="Times New Roman" w:eastAsia="SimSun"/>
+                <w:b w:val="0"/>
+                <w:sz w:val="12"/>
+              </w:rPr>
+              <w:t>Supports referring and grounding at flexible granularity</w:t>
+            </w:r>
+          </w:p>
+        </w:tc>
+        <w:tc>
+          <w:tcPr>
+            <w:tcW w:type="dxa" w:w="861"/>
+          </w:tcPr>
+          <w:p>
+            <w:r/>
+            <w:r>
+              <w:rPr>
+                <w:rFonts w:ascii="Times New Roman" w:hAnsi="Times New Roman" w:eastAsia="SimSun"/>
+                <w:b w:val="0"/>
+                <w:sz w:val="12"/>
+              </w:rPr>
+              <w:t>Requires reliable region-level annotation and grounding</w:t>
+            </w:r>
+          </w:p>
+        </w:tc>
+      </w:tr>
+    </w:tbl>
+    <w:p>
+      <w:pPr>
+        <w:jc w:val="center"/>
+      </w:pPr>
+      <w:r>
+        <w:rPr>
+          <w:rFonts w:ascii="Times New Roman" w:hAnsi="Times New Roman"/>
+          <w:b/>
+          <w:sz w:val="16"/>
+        </w:rPr>
+        <w:t>Table 2. Representative MLLM architecture taxonomy.</w:t>
       </w:r>
     </w:p>
     <w:tbl>
@@ -1700,7 +3615,7 @@
         <w:drawing>
           <wp:inline xmlns:a="http://schemas.openxmlformats.org/drawingml/2006/main" xmlns:pic="http://schemas.openxmlformats.org/drawingml/2006/picture">
             <wp:extent cx="4248000" cy="2055484"/>
-            <wp:docPr id="1" name="Picture 1"/>
+            <wp:docPr id="2" name="Picture 2"/>
             <wp:cNvGraphicFramePr>
               <a:graphicFrameLocks noChangeAspect="1"/>
             </wp:cNvGraphicFramePr>
@@ -1708,11 +3623,11 @@
               <a:graphicData uri="http://schemas.openxmlformats.org/drawingml/2006/picture">
                 <pic:pic>
                   <pic:nvPicPr>
-                    <pic:cNvPr id="0" name="model_timeline.png"/>
+                    <pic:cNvPr id="0" name="connector_tradeoff_diagram.png"/>
                     <pic:cNvPicPr/>
                   </pic:nvPicPr>
                   <pic:blipFill>
-                    <a:blip r:embed="rId10"/>
+                    <a:blip r:embed="rId11"/>
                     <a:stretch>
                       <a:fillRect/>
                     </a:stretch>
@@ -1741,7 +3656,59 @@
           <w:b/>
           <w:sz w:val="16"/>
         </w:rPr>
-        <w:t>Figure 1. Timeline distribution of representative MLLM-related models.</w:t>
+        <w:t>Figure 2. Connector trade-offs in MLLM design.</w:t>
+      </w:r>
+    </w:p>
+    <w:p>
+      <w:pPr>
+        <w:jc w:val="center"/>
+      </w:pPr>
+      <w:r>
+        <w:drawing>
+          <wp:inline xmlns:a="http://schemas.openxmlformats.org/drawingml/2006/main" xmlns:pic="http://schemas.openxmlformats.org/drawingml/2006/picture">
+            <wp:extent cx="4248000" cy="2055484"/>
+            <wp:docPr id="3" name="Picture 3"/>
+            <wp:cNvGraphicFramePr>
+              <a:graphicFrameLocks noChangeAspect="1"/>
+            </wp:cNvGraphicFramePr>
+            <a:graphic>
+              <a:graphicData uri="http://schemas.openxmlformats.org/drawingml/2006/picture">
+                <pic:pic>
+                  <pic:nvPicPr>
+                    <pic:cNvPr id="0" name="model_timeline.png"/>
+                    <pic:cNvPicPr/>
+                  </pic:nvPicPr>
+                  <pic:blipFill>
+                    <a:blip r:embed="rId12"/>
+                    <a:stretch>
+                      <a:fillRect/>
+                    </a:stretch>
+                  </pic:blipFill>
+                  <pic:spPr>
+                    <a:xfrm>
+                      <a:off x="0" y="0"/>
+                      <a:ext cx="4248000" cy="2055484"/>
+                    </a:xfrm>
+                    <a:prstGeom prst="rect"/>
+                  </pic:spPr>
+                </pic:pic>
+              </a:graphicData>
+            </a:graphic>
+          </wp:inline>
+        </w:drawing>
+      </w:r>
+    </w:p>
+    <w:p>
+      <w:pPr>
+        <w:jc w:val="center"/>
+      </w:pPr>
+      <w:r>
+        <w:rPr>
+          <w:rFonts w:ascii="Times New Roman" w:hAnsi="Times New Roman" w:eastAsia="SimSun"/>
+          <w:b/>
+          <w:sz w:val="16"/>
+        </w:rPr>
+        <w:t>Figure 3. Timeline distribution of representative MLLM-related models.</w:t>
       </w:r>
     </w:p>
     <w:p>
@@ -1903,6 +3870,33 @@
           <w:b/>
           <w:sz w:val="20"/>
         </w:rPr>
+        <w:t>Author's Analysis</w:t>
+      </w:r>
+    </w:p>
+    <w:p>
+      <w:pPr>
+        <w:spacing w:line="276" w:lineRule="auto" w:after="60"/>
+        <w:jc w:val="both"/>
+      </w:pPr>
+      <w:r>
+        <w:rPr>
+          <w:rFonts w:ascii="Times New Roman" w:hAnsi="Times New Roman" w:eastAsia="SimSun"/>
+          <w:b w:val="0"/>
+          <w:sz w:val="20"/>
+        </w:rPr>
+        <w:t>Training paradigms reveal a tension between scale and supervision quality. More image-text data can improve coverage, but weak captions rarely teach exact grounding, OCR, or uncertainty. Instruction tuning improves usability but can teach a model to sound confident even when the visual evidence is weak. This survey argues that the next stage of MLLM training should combine scalable pretraining with explicit evidence supervision, uncertainty calibration, and negative examples where the correct response is to refuse or state that the image is insufficient.</w:t>
+      </w:r>
+    </w:p>
+    <w:p>
+      <w:pPr>
+        <w:spacing w:before="160" w:after="80"/>
+      </w:pPr>
+      <w:r>
+        <w:rPr>
+          <w:rFonts w:ascii="Times New Roman" w:hAnsi="Times New Roman" w:eastAsia="SimSun"/>
+          <w:b/>
+          <w:sz w:val="20"/>
+        </w:rPr>
         <w:t>6.5 Safety and Refusal Alignment</w:t>
       </w:r>
     </w:p>
@@ -2092,7 +4086,7 @@
           <w:b/>
           <w:sz w:val="16"/>
         </w:rPr>
-        <w:t>Table 2. Representative MLLM benchmark taxonomy.</w:t>
+        <w:t>Table 3. Representative MLLM benchmark taxonomy.</w:t>
       </w:r>
     </w:p>
     <w:tbl>
@@ -2582,7 +4576,7 @@
         <w:drawing>
           <wp:inline xmlns:a="http://schemas.openxmlformats.org/drawingml/2006/main" xmlns:pic="http://schemas.openxmlformats.org/drawingml/2006/picture">
             <wp:extent cx="4248000" cy="2055484"/>
-            <wp:docPr id="2" name="Picture 2"/>
+            <wp:docPr id="4" name="Picture 4"/>
             <wp:cNvGraphicFramePr>
               <a:graphicFrameLocks noChangeAspect="1"/>
             </wp:cNvGraphicFramePr>
@@ -2590,11 +4584,11 @@
               <a:graphicData uri="http://schemas.openxmlformats.org/drawingml/2006/picture">
                 <pic:pic>
                   <pic:nvPicPr>
-                    <pic:cNvPr id="0" name="benchmark_timeline.png"/>
+                    <pic:cNvPr id="0" name="benchmark_taxonomy_diagram.png"/>
                     <pic:cNvPicPr/>
                   </pic:nvPicPr>
                   <pic:blipFill>
-                    <a:blip r:embed="rId11"/>
+                    <a:blip r:embed="rId13"/>
                     <a:stretch>
                       <a:fillRect/>
                     </a:stretch>
@@ -2623,7 +4617,59 @@
           <w:b/>
           <w:sz w:val="16"/>
         </w:rPr>
-        <w:t>Figure 2. Timeline distribution of representative MLLM benchmarks.</w:t>
+        <w:t>Figure 4. Benchmark taxonomy for MLLM evaluation.</w:t>
+      </w:r>
+    </w:p>
+    <w:p>
+      <w:pPr>
+        <w:jc w:val="center"/>
+      </w:pPr>
+      <w:r>
+        <w:drawing>
+          <wp:inline xmlns:a="http://schemas.openxmlformats.org/drawingml/2006/main" xmlns:pic="http://schemas.openxmlformats.org/drawingml/2006/picture">
+            <wp:extent cx="4248000" cy="2055484"/>
+            <wp:docPr id="5" name="Picture 5"/>
+            <wp:cNvGraphicFramePr>
+              <a:graphicFrameLocks noChangeAspect="1"/>
+            </wp:cNvGraphicFramePr>
+            <a:graphic>
+              <a:graphicData uri="http://schemas.openxmlformats.org/drawingml/2006/picture">
+                <pic:pic>
+                  <pic:nvPicPr>
+                    <pic:cNvPr id="0" name="benchmark_timeline.png"/>
+                    <pic:cNvPicPr/>
+                  </pic:nvPicPr>
+                  <pic:blipFill>
+                    <a:blip r:embed="rId14"/>
+                    <a:stretch>
+                      <a:fillRect/>
+                    </a:stretch>
+                  </pic:blipFill>
+                  <pic:spPr>
+                    <a:xfrm>
+                      <a:off x="0" y="0"/>
+                      <a:ext cx="4248000" cy="2055484"/>
+                    </a:xfrm>
+                    <a:prstGeom prst="rect"/>
+                  </pic:spPr>
+                </pic:pic>
+              </a:graphicData>
+            </a:graphic>
+          </wp:inline>
+        </w:drawing>
+      </w:r>
+    </w:p>
+    <w:p>
+      <w:pPr>
+        <w:jc w:val="center"/>
+      </w:pPr>
+      <w:r>
+        <w:rPr>
+          <w:rFonts w:ascii="Times New Roman" w:hAnsi="Times New Roman" w:eastAsia="SimSun"/>
+          <w:b/>
+          <w:sz w:val="16"/>
+        </w:rPr>
+        <w:t>Figure 5. Timeline distribution of representative MLLM benchmarks.</w:t>
       </w:r>
     </w:p>
     <w:p>
@@ -2834,6 +4880,33 @@
     </w:p>
     <w:p>
       <w:pPr>
+        <w:spacing w:before="160" w:after="80"/>
+      </w:pPr>
+      <w:r>
+        <w:rPr>
+          <w:rFonts w:ascii="Times New Roman" w:hAnsi="Times New Roman" w:eastAsia="SimSun"/>
+          <w:b/>
+          <w:sz w:val="20"/>
+        </w:rPr>
+        <w:t>Author's Analysis</w:t>
+      </w:r>
+    </w:p>
+    <w:p>
+      <w:pPr>
+        <w:spacing w:line="276" w:lineRule="auto" w:after="60"/>
+        <w:jc w:val="both"/>
+      </w:pPr>
+      <w:r>
+        <w:rPr>
+          <w:rFonts w:ascii="Times New Roman" w:hAnsi="Times New Roman" w:eastAsia="SimSun"/>
+          <w:b w:val="0"/>
+          <w:sz w:val="20"/>
+        </w:rPr>
+        <w:t>The benchmark literature suggests that MLLM evaluation is still more diagnostic than definitive. A model can perform well on a broad benchmark while still failing on OCR, grounding, or rare cultural contexts. Multiple-choice formats are convenient but may reward language priors; open-ended formats are realistic but harder to score reliably. This survey argues that future evaluation should report error categories, prompt settings, answer extraction rules, and uncertainty behavior alongside aggregate scores.</w:t>
+      </w:r>
+    </w:p>
+    <w:p>
+      <w:pPr>
         <w:spacing w:before="240" w:after="120"/>
       </w:pPr>
       <w:r>
@@ -2842,7 +4915,233 @@
           <w:b/>
           <w:sz w:val="24"/>
         </w:rPr>
-        <w:t>8. Reproducibility Framework</w:t>
+        <w:t>8. Practical Case Studies</w:t>
+      </w:r>
+    </w:p>
+    <w:p>
+      <w:pPr>
+        <w:spacing w:before="160" w:after="80"/>
+      </w:pPr>
+      <w:r>
+        <w:rPr>
+          <w:rFonts w:ascii="Times New Roman" w:hAnsi="Times New Roman" w:eastAsia="SimSun"/>
+          <w:b/>
+          <w:sz w:val="20"/>
+        </w:rPr>
+        <w:t>8.1 Hallucination Case Study</w:t>
+      </w:r>
+    </w:p>
+    <w:p>
+      <w:pPr>
+        <w:spacing w:line="276" w:lineRule="auto" w:after="60"/>
+        <w:jc w:val="both"/>
+      </w:pPr>
+      <w:r>
+        <w:rPr>
+          <w:rFonts w:ascii="Times New Roman" w:hAnsi="Times New Roman" w:eastAsia="SimSun"/>
+          <w:b w:val="0"/>
+          <w:sz w:val="20"/>
+        </w:rPr>
+        <w:t>Consider an illustrative image of a kitchen counter containing a bowl, a cup, and a cutting board, but no knife. If a user asks, "What sharp tools are visible?", a poorly grounded MLLM may answer, "A knife is visible on the counter," because knives are statistically common in kitchen scenes. This example is not an experimental result and is not claimed as a benchmark outcome. It illustrates a known failure mode: the language model's scene prior can override missing visual evidence.</w:t>
+      </w:r>
+    </w:p>
+    <w:p>
+      <w:pPr>
+        <w:jc w:val="center"/>
+      </w:pPr>
+      <w:r>
+        <w:drawing>
+          <wp:inline xmlns:a="http://schemas.openxmlformats.org/drawingml/2006/main" xmlns:pic="http://schemas.openxmlformats.org/drawingml/2006/picture">
+            <wp:extent cx="4248000" cy="2055484"/>
+            <wp:docPr id="6" name="Picture 6"/>
+            <wp:cNvGraphicFramePr>
+              <a:graphicFrameLocks noChangeAspect="1"/>
+            </wp:cNvGraphicFramePr>
+            <a:graphic>
+              <a:graphicData uri="http://schemas.openxmlformats.org/drawingml/2006/picture">
+                <pic:pic>
+                  <pic:nvPicPr>
+                    <pic:cNvPr id="0" name="hallucination_illustration.png"/>
+                    <pic:cNvPicPr/>
+                  </pic:nvPicPr>
+                  <pic:blipFill>
+                    <a:blip r:embed="rId15"/>
+                    <a:stretch>
+                      <a:fillRect/>
+                    </a:stretch>
+                  </pic:blipFill>
+                  <pic:spPr>
+                    <a:xfrm>
+                      <a:off x="0" y="0"/>
+                      <a:ext cx="4248000" cy="2055484"/>
+                    </a:xfrm>
+                    <a:prstGeom prst="rect"/>
+                  </pic:spPr>
+                </pic:pic>
+              </a:graphicData>
+            </a:graphic>
+          </wp:inline>
+        </w:drawing>
+      </w:r>
+    </w:p>
+    <w:p>
+      <w:pPr>
+        <w:jc w:val="center"/>
+      </w:pPr>
+      <w:r>
+        <w:rPr>
+          <w:rFonts w:ascii="Times New Roman" w:hAnsi="Times New Roman" w:eastAsia="SimSun"/>
+          <w:b/>
+          <w:sz w:val="16"/>
+        </w:rPr>
+        <w:t>Figure 6. Illustrative hallucination mechanism.</w:t>
+      </w:r>
+    </w:p>
+    <w:p>
+      <w:pPr>
+        <w:spacing w:line="276" w:lineRule="auto" w:after="60"/>
+        <w:jc w:val="both"/>
+      </w:pPr>
+      <w:r>
+        <w:rPr>
+          <w:rFonts w:ascii="Times New Roman" w:hAnsi="Times New Roman" w:eastAsia="SimSun"/>
+          <w:b w:val="0"/>
+          <w:sz w:val="20"/>
+        </w:rPr>
+        <w:t>The scientifically preferable answer would be: "I do not see a sharp tool in the image; the visible items appear to include a bowl, cup, and cutting board." This response is better because it separates visible evidence from plausible but unsupported inference. The case also shows why hallucination evaluation should include absent-object questions, uncertainty prompts, and checks for overconfident descriptions. A useful MLLM should be rewarded not only for naming visible content, but also for refusing to invent content.</w:t>
+      </w:r>
+    </w:p>
+    <w:p>
+      <w:pPr>
+        <w:spacing w:before="160" w:after="80"/>
+      </w:pPr>
+      <w:r>
+        <w:rPr>
+          <w:rFonts w:ascii="Times New Roman" w:hAnsi="Times New Roman" w:eastAsia="SimSun"/>
+          <w:b/>
+          <w:sz w:val="20"/>
+        </w:rPr>
+        <w:t>8.2 OCR and Document Understanding Case Study</w:t>
+      </w:r>
+    </w:p>
+    <w:p>
+      <w:pPr>
+        <w:spacing w:line="276" w:lineRule="auto" w:after="60"/>
+        <w:jc w:val="both"/>
+      </w:pPr>
+      <w:r>
+        <w:rPr>
+          <w:rFonts w:ascii="Times New Roman" w:hAnsi="Times New Roman" w:eastAsia="SimSun"/>
+          <w:b w:val="0"/>
+          <w:sz w:val="20"/>
+        </w:rPr>
+        <w:t>Consider an illustrative document image containing a student ID number, a course title, and a submission deadline. If the text is small or blurred, an MLLM may produce a fluent but incorrect transcription. For example, it may confuse similar characters such as "0" and "O", or infer a plausible date from context rather than reading the actual document. This is again a conceptual example, not a reported experiment.</w:t>
+      </w:r>
+    </w:p>
+    <w:p>
+      <w:pPr>
+        <w:jc w:val="center"/>
+      </w:pPr>
+      <w:r>
+        <w:drawing>
+          <wp:inline xmlns:a="http://schemas.openxmlformats.org/drawingml/2006/main" xmlns:pic="http://schemas.openxmlformats.org/drawingml/2006/picture">
+            <wp:extent cx="4248000" cy="2055484"/>
+            <wp:docPr id="7" name="Picture 7"/>
+            <wp:cNvGraphicFramePr>
+              <a:graphicFrameLocks noChangeAspect="1"/>
+            </wp:cNvGraphicFramePr>
+            <a:graphic>
+              <a:graphicData uri="http://schemas.openxmlformats.org/drawingml/2006/picture">
+                <pic:pic>
+                  <pic:nvPicPr>
+                    <pic:cNvPr id="0" name="grounding_workflow_diagram.png"/>
+                    <pic:cNvPicPr/>
+                  </pic:nvPicPr>
+                  <pic:blipFill>
+                    <a:blip r:embed="rId16"/>
+                    <a:stretch>
+                      <a:fillRect/>
+                    </a:stretch>
+                  </pic:blipFill>
+                  <pic:spPr>
+                    <a:xfrm>
+                      <a:off x="0" y="0"/>
+                      <a:ext cx="4248000" cy="2055484"/>
+                    </a:xfrm>
+                    <a:prstGeom prst="rect"/>
+                  </pic:spPr>
+                </pic:pic>
+              </a:graphicData>
+            </a:graphic>
+          </wp:inline>
+        </w:drawing>
+      </w:r>
+    </w:p>
+    <w:p>
+      <w:pPr>
+        <w:jc w:val="center"/>
+      </w:pPr>
+      <w:r>
+        <w:rPr>
+          <w:rFonts w:ascii="Times New Roman" w:hAnsi="Times New Roman" w:eastAsia="SimSun"/>
+          <w:b/>
+          <w:sz w:val="16"/>
+        </w:rPr>
+        <w:t>Figure 7. Evidence-grounded response workflow.</w:t>
+      </w:r>
+    </w:p>
+    <w:p>
+      <w:pPr>
+        <w:spacing w:line="276" w:lineRule="auto" w:after="60"/>
+        <w:jc w:val="both"/>
+      </w:pPr>
+      <w:r>
+        <w:rPr>
+          <w:rFonts w:ascii="Times New Roman" w:hAnsi="Times New Roman" w:eastAsia="SimSun"/>
+          <w:b w:val="0"/>
+          <w:sz w:val="20"/>
+        </w:rPr>
+        <w:t>The correct system behavior should include uncertainty: "The course title appears to be visible, but the ID number is too small to read confidently." In document understanding, exactness matters more than fluency. A wrong ID number, amount, date, or email address can make the model practically unusable even if the surrounding explanation is coherent. This case motivates specialized OCR modules, high-resolution visual processing, document-specific benchmarks, and answer formats that expose confidence or cite visual evidence.</w:t>
+      </w:r>
+    </w:p>
+    <w:p>
+      <w:pPr>
+        <w:spacing w:before="160" w:after="80"/>
+      </w:pPr>
+      <w:r>
+        <w:rPr>
+          <w:rFonts w:ascii="Times New Roman" w:hAnsi="Times New Roman" w:eastAsia="SimSun"/>
+          <w:b/>
+          <w:sz w:val="20"/>
+        </w:rPr>
+        <w:t>Author's Analysis</w:t>
+      </w:r>
+    </w:p>
+    <w:p>
+      <w:pPr>
+        <w:spacing w:line="276" w:lineRule="auto" w:after="60"/>
+        <w:jc w:val="both"/>
+      </w:pPr>
+      <w:r>
+        <w:rPr>
+          <w:rFonts w:ascii="Times New Roman" w:hAnsi="Times New Roman" w:eastAsia="SimSun"/>
+          <w:b w:val="0"/>
+          <w:sz w:val="20"/>
+        </w:rPr>
+        <w:t>These case studies show why MLLM reliability cannot be reduced to general conversational quality. Hallucination and OCR errors are different: hallucination reflects unsupported semantic completion, while OCR failure reflects loss of fine-grained visual evidence. Both can produce fluent answers, and both can be hidden by natural language style. This survey argues that practical MLLM systems should expose evidence, uncertainty, and task-specific failure modes rather than presenting all answers as equally reliable.</w:t>
+      </w:r>
+    </w:p>
+    <w:p>
+      <w:pPr>
+        <w:spacing w:before="240" w:after="120"/>
+      </w:pPr>
+      <w:r>
+        <w:rPr>
+          <w:rFonts w:ascii="Times New Roman" w:hAnsi="Times New Roman" w:eastAsia="SimSun"/>
+          <w:b/>
+          <w:sz w:val="24"/>
+        </w:rPr>
+        <w:t>9. Reproducibility Framework</w:t>
       </w:r>
     </w:p>
     <w:p>
@@ -2997,6 +5296,33 @@
     </w:p>
     <w:p>
       <w:pPr>
+        <w:spacing w:before="160" w:after="80"/>
+      </w:pPr>
+      <w:r>
+        <w:rPr>
+          <w:rFonts w:ascii="Times New Roman" w:hAnsi="Times New Roman" w:eastAsia="SimSun"/>
+          <w:b/>
+          <w:sz w:val="20"/>
+        </w:rPr>
+        <w:t>Author's Analysis</w:t>
+      </w:r>
+    </w:p>
+    <w:p>
+      <w:pPr>
+        <w:spacing w:line="276" w:lineRule="auto" w:after="60"/>
+        <w:jc w:val="both"/>
+      </w:pPr>
+      <w:r>
+        <w:rPr>
+          <w:rFonts w:ascii="Times New Roman" w:hAnsi="Times New Roman" w:eastAsia="SimSun"/>
+          <w:b w:val="0"/>
+          <w:sz w:val="20"/>
+        </w:rPr>
+        <w:t>For a survey paper, reproducibility means traceability. A reader should be able to determine why each reference is cited, how each table was generated, and how final formatting was produced. The current repository supports this goal through scripts for citation validation, table generation, figure generation, ChinaXiv formatting, layout comparison, and presentation generation. The main remaining reproducibility limitation is that the paper does not provide executable model experiments, because it does not claim any.</w:t>
+      </w:r>
+    </w:p>
+    <w:p>
+      <w:pPr>
         <w:spacing w:before="240" w:after="120"/>
       </w:pPr>
       <w:r>
@@ -3005,7 +5331,7 @@
           <w:b/>
           <w:sz w:val="24"/>
         </w:rPr>
-        <w:t>9. Ethical, Safety, and Deployment Considerations</w:t>
+        <w:t>10. Ethical, Safety, and Deployment Considerations</w:t>
       </w:r>
     </w:p>
     <w:p>
@@ -3256,6 +5582,33 @@
     </w:p>
     <w:p>
       <w:pPr>
+        <w:spacing w:before="160" w:after="80"/>
+      </w:pPr>
+      <w:r>
+        <w:rPr>
+          <w:rFonts w:ascii="Times New Roman" w:hAnsi="Times New Roman" w:eastAsia="SimSun"/>
+          <w:b/>
+          <w:sz w:val="20"/>
+        </w:rPr>
+        <w:t>Author's Analysis</w:t>
+      </w:r>
+    </w:p>
+    <w:p>
+      <w:pPr>
+        <w:spacing w:line="276" w:lineRule="auto" w:after="60"/>
+        <w:jc w:val="both"/>
+      </w:pPr>
+      <w:r>
+        <w:rPr>
+          <w:rFonts w:ascii="Times New Roman" w:hAnsi="Times New Roman" w:eastAsia="SimSun"/>
+          <w:b w:val="0"/>
+          <w:sz w:val="20"/>
+        </w:rPr>
+        <w:t>The ethical risk of MLLMs is amplified by the authority of visual evidence. Users may believe that a model "saw" something even when the answer was produced by prior knowledge or pattern completion. This survey argues that safe deployment requires calibrated uncertainty, visual evidence presentation, privacy-aware logging, and clear boundaries between assistance and professional judgment. In high-stakes settings, an MLLM should support human review rather than replace it.</w:t>
+      </w:r>
+    </w:p>
+    <w:p>
+      <w:pPr>
         <w:spacing w:before="240" w:after="120"/>
       </w:pPr>
       <w:r>
@@ -3264,7 +5617,7 @@
           <w:b/>
           <w:sz w:val="24"/>
         </w:rPr>
-        <w:t>10. Discussion</w:t>
+        <w:t>11. Discussion</w:t>
       </w:r>
     </w:p>
     <w:p>
@@ -3339,6 +5692,61 @@
     </w:p>
     <w:p>
       <w:pPr>
+        <w:spacing w:line="276" w:lineRule="auto" w:after="60"/>
+        <w:jc w:val="both"/>
+      </w:pPr>
+      <w:r>
+        <w:rPr>
+          <w:rFonts w:ascii="Times New Roman" w:hAnsi="Times New Roman" w:eastAsia="SimSun"/>
+          <w:b w:val="0"/>
+          <w:sz w:val="20"/>
+        </w:rPr>
+        <w:t>Emerging trends suggest that MLLMs are moving toward agentic multimodal systems, long-context video understanding, multimodal retrieval-augmented generation, embodied robotics, and domain-specific document intelligence. These trends will make evaluation harder because the system output may depend on tools, memory, retrieval sources, and multi-step planning rather than a single image-question pair. Industrial impact is likely to be strongest in document processing, education, design assistance, accessibility, medical triage support, robotics interfaces, and enterprise workflow automation. However, industrial adoption will depend less on isolated benchmark leadership and more on reliability, cost, data governance, explainability, and integration with existing systems.</w:t>
+      </w:r>
+    </w:p>
+    <w:p>
+      <w:pPr>
+        <w:spacing w:line="276" w:lineRule="auto" w:after="60"/>
+        <w:jc w:val="both"/>
+      </w:pPr>
+      <w:r>
+        <w:rPr>
+          <w:rFonts w:ascii="Times New Roman" w:hAnsi="Times New Roman" w:eastAsia="SimSun"/>
+          <w:b w:val="0"/>
+          <w:sz w:val="20"/>
+        </w:rPr>
+        <w:t>The unresolved research questions are concrete. How many visual tokens are necessary for a given task? When should a model request a higher-resolution crop? How can an MLLM cite visual evidence? How can benchmarks detect data contamination? How should uncertainty be represented in multimodal answers? How can small open models compete with closed frontier systems in specific domains? These questions indicate that MLLMs remain an open research area rather than a solved product category.</w:t>
+      </w:r>
+    </w:p>
+    <w:p>
+      <w:pPr>
+        <w:spacing w:before="160" w:after="80"/>
+      </w:pPr>
+      <w:r>
+        <w:rPr>
+          <w:rFonts w:ascii="Times New Roman" w:hAnsi="Times New Roman" w:eastAsia="SimSun"/>
+          <w:b/>
+          <w:sz w:val="20"/>
+        </w:rPr>
+        <w:t>Author's Analysis</w:t>
+      </w:r>
+    </w:p>
+    <w:p>
+      <w:pPr>
+        <w:spacing w:line="276" w:lineRule="auto" w:after="60"/>
+        <w:jc w:val="both"/>
+      </w:pPr>
+      <w:r>
+        <w:rPr>
+          <w:rFonts w:ascii="Times New Roman" w:hAnsi="Times New Roman" w:eastAsia="SimSun"/>
+          <w:b w:val="0"/>
+          <w:sz w:val="20"/>
+        </w:rPr>
+        <w:t>This survey argues that the next phase of MLLM research should shift from "Can the model answer?" to "Can the model justify, localize, calibrate, and reproduce its answer?" A model that is slightly less fluent but more faithful may be more valuable than a model that is highly fluent but ungrounded. The central open problem is not only multimodal capability, but trustworthy multimodal capability.</w:t>
+      </w:r>
+    </w:p>
+    <w:p>
+      <w:pPr>
         <w:spacing w:before="240" w:after="120"/>
       </w:pPr>
       <w:r>
@@ -3347,7 +5755,7 @@
           <w:b/>
           <w:sz w:val="24"/>
         </w:rPr>
-        <w:t>11. Limitations</w:t>
+        <w:t>12. Limitations</w:t>
       </w:r>
     </w:p>
     <w:p>
@@ -3375,7 +5783,34 @@
           <w:b w:val="0"/>
           <w:sz w:val="20"/>
         </w:rPr>
-        <w:t>There are also reproducibility limitations. The local package contains scripts for citation validation and table generation, but it does not include benchmark datasets, model checkpoints, or training logs. This is appropriate for a survey but insufficient for an original experimental paper. The public GitHub repository URL exists, but the repository must be populated before the paper claims that all materials are publicly available.</w:t>
+        <w:t>There are also reproducibility limitations. The public repository contains scripts for citation validation, table generation, figure generation, ChinaXiv formatting, layout comparison, and presentation generation, but it does not include benchmark datasets, model checkpoints, or training logs. This is appropriate for a survey but insufficient for an original experimental paper.</w:t>
+      </w:r>
+    </w:p>
+    <w:p>
+      <w:pPr>
+        <w:spacing w:before="160" w:after="80"/>
+      </w:pPr>
+      <w:r>
+        <w:rPr>
+          <w:rFonts w:ascii="Times New Roman" w:hAnsi="Times New Roman" w:eastAsia="SimSun"/>
+          <w:b/>
+          <w:sz w:val="20"/>
+        </w:rPr>
+        <w:t>Author's Analysis</w:t>
+      </w:r>
+    </w:p>
+    <w:p>
+      <w:pPr>
+        <w:spacing w:line="276" w:lineRule="auto" w:after="60"/>
+        <w:jc w:val="both"/>
+      </w:pPr>
+      <w:r>
+        <w:rPr>
+          <w:rFonts w:ascii="Times New Roman" w:hAnsi="Times New Roman" w:eastAsia="SimSun"/>
+          <w:b w:val="0"/>
+          <w:sz w:val="20"/>
+        </w:rPr>
+        <w:t>The limitations are deliberate boundaries. By not reporting new benchmark scores, the paper avoids unsupported empirical claims. By focusing mainly on image-language systems, it keeps the survey coherent for a master's course report. The trade-off is that the paper cannot fully cover audio, 3D, robotics, or long-video systems. Future extensions should treat those areas as separate sub-surveys rather than adding them superficially.</w:t>
       </w:r>
     </w:p>
     <w:p>
@@ -3388,7 +5823,7 @@
           <w:b/>
           <w:sz w:val="24"/>
         </w:rPr>
-        <w:t>12. Conclusion</w:t>
+        <w:t>13. Conclusion</w:t>
       </w:r>
     </w:p>
     <w:p>
@@ -3435,6 +5870,33 @@
     </w:p>
     <w:p>
       <w:pPr>
+        <w:spacing w:before="160" w:after="80"/>
+      </w:pPr>
+      <w:r>
+        <w:rPr>
+          <w:rFonts w:ascii="Times New Roman" w:hAnsi="Times New Roman" w:eastAsia="SimSun"/>
+          <w:b/>
+          <w:sz w:val="20"/>
+        </w:rPr>
+        <w:t>Author's Analysis</w:t>
+      </w:r>
+    </w:p>
+    <w:p>
+      <w:pPr>
+        <w:spacing w:line="276" w:lineRule="auto" w:after="60"/>
+        <w:jc w:val="both"/>
+      </w:pPr>
+      <w:r>
+        <w:rPr>
+          <w:rFonts w:ascii="Times New Roman" w:hAnsi="Times New Roman" w:eastAsia="SimSun"/>
+          <w:b w:val="0"/>
+          <w:sz w:val="20"/>
+        </w:rPr>
+        <w:t>The main conclusion is that MLLMs should be evaluated as evidence-processing systems. Their value depends on whether they can connect visual input, language reasoning, uncertainty, and user intent without inventing unsupported content. This is why the paper emphasizes grounding, hallucination, reproducibility, and critical comparison rather than a simple chronology of models.</w:t>
+      </w:r>
+    </w:p>
+    <w:p>
+      <w:pPr>
         <w:spacing w:before="240" w:after="120"/>
       </w:pPr>
       <w:r>
@@ -3443,7 +5905,7 @@
           <w:b/>
           <w:sz w:val="24"/>
         </w:rPr>
-        <w:t>13. Future Work</w:t>
+        <w:t>14. Future Work</w:t>
       </w:r>
     </w:p>
     <w:p>
@@ -3457,7 +5919,62 @@
           <w:b w:val="0"/>
           <w:sz w:val="20"/>
         </w:rPr>
-        <w:t>Future work should extend this survey in five directions. First, the bibliography should be updated with newly peer-reviewed MLLM papers and benchmark studies. Second, the taxonomy should be expanded to cover video-language, audio-language, document intelligence, robotics, and multimodal agents. Third, a controlled benchmark study could be added using open models, fixed prompts, exact decoding parameters, released scoring scripts, and raw output logs. Fourth, hallucination analysis should be broadened from object presence to OCR errors, spatial relation errors, causal overclaiming, and uncertainty calibration. Fifth, the public GitHub repository should be populated with the full local package so that the Code Availability section becomes externally verifiable.</w:t>
+        <w:t>Future work should extend this survey in several concrete directions. First, adaptive visual token selection should be studied more deeply. Instead of compressing every image into a fixed number of tokens, an MLLM should allocate more visual capacity to regions containing text, small objects, diagrams, or uncertain evidence. Second, multimodal retrieval-augmented generation should connect model answers to external documents, image regions, OCR outputs, and domain databases so that responses can cite evidence rather than rely only on internal parameters.</w:t>
+      </w:r>
+    </w:p>
+    <w:p>
+      <w:pPr>
+        <w:spacing w:line="276" w:lineRule="auto" w:after="60"/>
+        <w:jc w:val="both"/>
+      </w:pPr>
+      <w:r>
+        <w:rPr>
+          <w:rFonts w:ascii="Times New Roman" w:hAnsi="Times New Roman" w:eastAsia="SimSun"/>
+          <w:b w:val="0"/>
+          <w:sz w:val="20"/>
+        </w:rPr>
+        <w:t>Third, agentic multimodal AI should be evaluated as a system problem. Future MLLMs may call OCR tools, crop images, search documents, use calculators, inspect videos, or control robots. This requires benchmarks that evaluate planning, tool choice, intermediate evidence, and final answer faithfulness. Fourth, uncertainty-aware MLLMs should express calibrated confidence and distinguish visible evidence from plausible inference. Fifth, long-context multimodal reasoning should address long videos, multi-page documents, slide decks, and scientific reports where information is distributed across many visual and textual elements.</w:t>
+      </w:r>
+    </w:p>
+    <w:p>
+      <w:pPr>
+        <w:spacing w:line="276" w:lineRule="auto" w:after="60"/>
+        <w:jc w:val="both"/>
+      </w:pPr>
+      <w:r>
+        <w:rPr>
+          <w:rFonts w:ascii="Times New Roman" w:hAnsi="Times New Roman" w:eastAsia="SimSun"/>
+          <w:b w:val="0"/>
+          <w:sz w:val="20"/>
+        </w:rPr>
+        <w:t>Sixth, efficient MLLMs remain essential for universities and small laboratories. Parameter-efficient tuning, quantization, sparse visual token routing, and modular connectors can reduce compute requirements while preserving useful capability. Seventh, robotics and embodied MLLMs should be studied with physical constraints, safety boundaries, and real-world feedback rather than only static image benchmarks. Finally, future versions of this project could add controlled experiments with open models, fixed prompts, raw outputs, and reproducible scoring scripts; until such experiments are actually executed, the paper should continue to avoid benchmark numbers.</w:t>
+      </w:r>
+    </w:p>
+    <w:p>
+      <w:pPr>
+        <w:spacing w:before="160" w:after="80"/>
+      </w:pPr>
+      <w:r>
+        <w:rPr>
+          <w:rFonts w:ascii="Times New Roman" w:hAnsi="Times New Roman" w:eastAsia="SimSun"/>
+          <w:b/>
+          <w:sz w:val="20"/>
+        </w:rPr>
+        <w:t>Author's Analysis</w:t>
+      </w:r>
+    </w:p>
+    <w:p>
+      <w:pPr>
+        <w:spacing w:line="276" w:lineRule="auto" w:after="60"/>
+        <w:jc w:val="both"/>
+      </w:pPr>
+      <w:r>
+        <w:rPr>
+          <w:rFonts w:ascii="Times New Roman" w:hAnsi="Times New Roman" w:eastAsia="SimSun"/>
+          <w:b w:val="0"/>
+          <w:sz w:val="20"/>
+        </w:rPr>
+        <w:t>The future of MLLMs will likely be shaped by reliability rather than raw fluency. Adaptive visual computation, multimodal RAG, agentic tool use, uncertainty calibration, efficient adaptation, and robotics all point to the same requirement: the model must know what evidence it has, what evidence it lacks, and when to seek more information. This survey argues that these directions are more scientifically important than simply scaling the next leaderboard model.</w:t>
       </w:r>
     </w:p>
     <w:p>
@@ -3512,7 +6029,7 @@
           <w:b w:val="0"/>
           <w:sz w:val="20"/>
         </w:rPr>
-        <w:t>At the time this local package was prepared, the GitHub repository existed but was empty. Therefore, this paper should not claim that the public repository already contains the reproducibility materials until the local files are uploaded. The local package contains:</w:t>
+        <w:t>The reproducibility package is publicly available in the GitHub repository. The package contains:</w:t>
       </w:r>
     </w:p>
     <w:p>
@@ -3577,6 +6094,19 @@
           <w:b w:val="0"/>
           <w:sz w:val="20"/>
         </w:rPr>
+        <w:t>`paper/tables/model_comparison.csv`: comprehensive model comparison table</w:t>
+      </w:r>
+    </w:p>
+    <w:p>
+      <w:pPr>
+        <w:pStyle w:val="ListBullet"/>
+      </w:pPr>
+      <w:r>
+        <w:rPr>
+          <w:rFonts w:ascii="Times New Roman" w:hAnsi="Times New Roman" w:eastAsia="SimSun"/>
+          <w:b w:val="0"/>
+          <w:sz w:val="20"/>
+        </w:rPr>
         <w:t>`scripts/generate_tables.py`: table generation script</w:t>
       </w:r>
     </w:p>
@@ -3603,6 +6133,58 @@
           <w:b w:val="0"/>
           <w:sz w:val="20"/>
         </w:rPr>
+        <w:t>`scripts/generate_figures.py`: figure generation script</w:t>
+      </w:r>
+    </w:p>
+    <w:p>
+      <w:pPr>
+        <w:pStyle w:val="ListBullet"/>
+      </w:pPr>
+      <w:r>
+        <w:rPr>
+          <w:rFonts w:ascii="Times New Roman" w:hAnsi="Times New Roman" w:eastAsia="SimSun"/>
+          <w:b w:val="0"/>
+          <w:sz w:val="20"/>
+        </w:rPr>
+        <w:t>`scripts/format_chinaxiv.py`: ChinaXiv-style formatting script</w:t>
+      </w:r>
+    </w:p>
+    <w:p>
+      <w:pPr>
+        <w:pStyle w:val="ListBullet"/>
+      </w:pPr>
+      <w:r>
+        <w:rPr>
+          <w:rFonts w:ascii="Times New Roman" w:hAnsi="Times New Roman" w:eastAsia="SimSun"/>
+          <w:b w:val="0"/>
+          <w:sz w:val="20"/>
+        </w:rPr>
+        <w:t>`scripts/compare_chinaxiv_layout.py`: layout comparison script</w:t>
+      </w:r>
+    </w:p>
+    <w:p>
+      <w:pPr>
+        <w:pStyle w:val="ListBullet"/>
+      </w:pPr>
+      <w:r>
+        <w:rPr>
+          <w:rFonts w:ascii="Times New Roman" w:hAnsi="Times New Roman" w:eastAsia="SimSun"/>
+          <w:b w:val="0"/>
+          <w:sz w:val="20"/>
+        </w:rPr>
+        <w:t>`scripts/create_code_explanation_pptx.py`: presentation generation script</w:t>
+      </w:r>
+    </w:p>
+    <w:p>
+      <w:pPr>
+        <w:pStyle w:val="ListBullet"/>
+      </w:pPr>
+      <w:r>
+        <w:rPr>
+          <w:rFonts w:ascii="Times New Roman" w:hAnsi="Times New Roman" w:eastAsia="SimSun"/>
+          <w:b w:val="0"/>
+          <w:sz w:val="20"/>
+        </w:rPr>
         <w:t>`requirements.txt` and `environment.yml`: software environment files</w:t>
       </w:r>
     </w:p>
@@ -3694,7 +6276,7 @@
           <w:b w:val="0"/>
           <w:sz w:val="20"/>
         </w:rPr>
-        <w:t>The public GitHub repository must be populated before public code availability is claimed.</w:t>
+        <w:t>The public GitHub repository is populated with manuscript files, scripts, tables, figures, and presentation materials.</w:t>
       </w:r>
     </w:p>
     <w:p>

</xml_diff>

<commit_message>
Update final paper title and recommendation details
</commit_message>
<xml_diff>
--- a/paper/paper_chinaxiv.docx
+++ b/paper/paper_chinaxiv.docx
@@ -12,7 +12,7 @@
           <w:b/>
           <w:sz w:val="28"/>
         </w:rPr>
-        <w:t>A Comprehensive Survey of Multimodal Large Language Models: Architectures, Training Paradigms, Benchmark Evaluation, and Future Directions</w:t>
+        <w:t>Survey on Multimodal Intelligence: Architectures, Training Paradigms, and Evaluation of Multimodal Large Language Models</w:t>
       </w:r>
     </w:p>
     <w:p>
@@ -910,7 +910,7 @@
           <w:b/>
           <w:sz w:val="16"/>
         </w:rPr>
-        <w:t>Figure 1. General MLLM architecture and information-flow bottleneck.</w:t>
+        <w:t>Figure 1. General MLLM architecture and information-flow bottleneck showing the visual encoder, connector, and language model components.</w:t>
       </w:r>
     </w:p>
     <w:p>
@@ -5158,7 +5158,7 @@
                 <w:b w:val="0"/>
                 <w:sz w:val="14"/>
               </w:rPr>
-              <w:t>OCR and chart reasoning</w:t>
+              <w:t>OCR and Chart Reasoning</w:t>
             </w:r>
           </w:p>
         </w:tc>
@@ -5174,7 +5174,7 @@
                 <w:b w:val="0"/>
                 <w:sz w:val="14"/>
               </w:rPr>
-              <w:t>TextVQA, ChartQA</w:t>
+              <w:t>TextVQA, ChartQA, DocVQA</w:t>
             </w:r>
           </w:p>
         </w:tc>
@@ -5190,7 +5190,7 @@
                 <w:b w:val="0"/>
                 <w:sz w:val="14"/>
               </w:rPr>
-              <w:t>reading scene text and structured graphics</w:t>
+              <w:t>Reading scene text and structured graphics</w:t>
             </w:r>
           </w:p>
         </w:tc>
@@ -5206,7 +5206,7 @@
                 <w:b w:val="0"/>
                 <w:sz w:val="14"/>
               </w:rPr>
-              <w:t>small text, chart parsing, and answer normalization</w:t>
+              <w:t>Small text, chart parsing, and answer normalization</w:t>
             </w:r>
           </w:p>
         </w:tc>
@@ -5224,7 +5224,7 @@
                 <w:b w:val="0"/>
                 <w:sz w:val="14"/>
               </w:rPr>
-              <w:t>Science and mathematics</w:t>
+              <w:t>Science and Mathematics</w:t>
             </w:r>
           </w:p>
         </w:tc>
@@ -5256,7 +5256,7 @@
                 <w:b w:val="0"/>
                 <w:sz w:val="14"/>
               </w:rPr>
-              <w:t>diagram-grounded and visual mathematical reasoning</w:t>
+              <w:t>Diagram-grounded and visual mathematical reasoning</w:t>
             </w:r>
           </w:p>
         </w:tc>
@@ -5272,7 +5272,7 @@
                 <w:b w:val="0"/>
                 <w:sz w:val="14"/>
               </w:rPr>
-              <w:t>fluent but unsupported reasoning</w:t>
+              <w:t>Fluent but unsupported reasoning</w:t>
             </w:r>
           </w:p>
         </w:tc>
@@ -5356,7 +5356,7 @@
                 <w:b w:val="0"/>
                 <w:sz w:val="14"/>
               </w:rPr>
-              <w:t>Hallucination checks</w:t>
+              <w:t>Hallucination</w:t>
             </w:r>
           </w:p>
         </w:tc>
@@ -5372,7 +5372,7 @@
                 <w:b w:val="0"/>
                 <w:sz w:val="14"/>
               </w:rPr>
-              <w:t>POPE</w:t>
+              <w:t>POPE, HallusionBench</w:t>
             </w:r>
           </w:p>
         </w:tc>
@@ -5388,7 +5388,7 @@
                 <w:b w:val="0"/>
                 <w:sz w:val="14"/>
               </w:rPr>
-              <w:t>detecting unsupported object claims</w:t>
+              <w:t>Detecting unsupported object claims and illusions</w:t>
             </w:r>
           </w:p>
         </w:tc>
@@ -5404,7 +5404,7 @@
                 <w:b w:val="0"/>
                 <w:sz w:val="14"/>
               </w:rPr>
-              <w:t>coverage beyond object presence remains limited</w:t>
+              <w:t>Coverage beyond object presence remains limited</w:t>
             </w:r>
           </w:p>
         </w:tc>
@@ -5422,7 +5422,7 @@
                 <w:b w:val="0"/>
                 <w:sz w:val="14"/>
               </w:rPr>
-              <w:t>Expert-domain reasoning</w:t>
+              <w:t>Expert-Domain Reasoning</w:t>
             </w:r>
           </w:p>
         </w:tc>
@@ -5454,7 +5454,7 @@
                 <w:b w:val="0"/>
                 <w:sz w:val="14"/>
               </w:rPr>
-              <w:t>college-level multidisciplinary multimodal reasoning</w:t>
+              <w:t>College-level multidisciplinary multimodal reasoning</w:t>
             </w:r>
           </w:p>
         </w:tc>
@@ -5470,7 +5470,7 @@
                 <w:b w:val="0"/>
                 <w:sz w:val="14"/>
               </w:rPr>
-              <w:t>contamination and domain coverage</w:t>
+              <w:t>Contamination and domain coverage</w:t>
             </w:r>
           </w:p>
         </w:tc>
@@ -6522,7 +6522,7 @@
           <w:b w:val="0"/>
           <w:sz w:val="20"/>
         </w:rPr>
-        <w:t>The survey deepens understanding of the Advanced Artificial Intelligence course because MLLMs combine multiple course modules in one system. Structural intelligence explains the neural computation behind encoders, connectors, and language backbones. Visual intelligence explains the perception modules that convert images into features. Language intelligence explains Transformers and LLM reasoning. Generative intelligence explains output generation and the risk of hallucination. Graph intelligence provides tools for relational reasoning and scene/document structure. Multimodal intelligence explains cross-modal fusion. Reinforcement intelligence explains human-feedback alignment and refusal behavior. Agent intelligence explains tool use, planning, and multimodal workflows [27].</w:t>
+        <w:t>The survey deepens understanding of the Advanced Artificial Intelligence course because MLLMs combine multiple course modules in one system. The title "Survey on Multimodal Intelligence" reflects this focus on Module 6 of the eight-module framework, while the content demonstrates integration with all other modules. Structural intelligence explains the neural computation behind encoders, connectors, and language backbones. Visual intelligence explains the perception modules that convert images into features. Language intelligence explains Transformers and LLM reasoning. Generative intelligence explains output generation and the risk of hallucination. Graph intelligence provides tools for relational reasoning and scene/document structure. Multimodal intelligence explains cross-modal fusion. Reinforcement intelligence explains human-feedback alignment and refusal behavior. Agent intelligence explains tool use, planning, and multimodal workflows [27].</w:t>
       </w:r>
     </w:p>
     <w:p>
@@ -6824,7 +6824,7 @@
           <w:b w:val="0"/>
           <w:sz w:val="20"/>
         </w:rPr>
-        <w:t>The central lesson is that MLLM progress cannot be understood only through benchmark scores. Architecture, training data, grounding, hallucination behavior, safety, openness, and reproducibility all matter. Benchmarks such as VQA, GQA, OK-VQA, ScienceQA, MME, MMBench, MM-Vet, MMMU, POPE, and MathVista evaluate important capabilities, but each covers only part of the problem. Reliable deployment requires broader evaluation and more transparent reporting.</w:t>
+        <w:t>The central lesson is that MLLM progress cannot be understood only through benchmark scores. Architecture, training data, grounding, hallucination behavior, safety, openness, and reproducibility all matter. Benchmarks such as VQA, GQA, OK-VQA, ScienceQA, MME, MMBench, MM-Vet, MMMU, POPE, and MathVista evaluate important capabilities, but each covers only part of the problem. Reliable deployment requires broader evaluation and more transparent reporting. The title change from a general MLLM survey to a "Survey on Multimodal Intelligence" better aligns with the course's eight-module framework while maintaining the paper's technical focus on architectures, training, and evaluation.</w:t>
       </w:r>
     </w:p>
     <w:p>

</xml_diff>